<commit_message>
Atualização das novas guias com a inclusão de  barras de rolagem vertical
</commit_message>
<xml_diff>
--- a/Documentação/Sistema de Cálculo da Elétrica Residencial.docx
+++ b/Documentação/Sistema de Cálculo da Elétrica Residencial.docx
@@ -1763,18 +1763,19 @@
     </w:p>
     <w:p>
       <w:pPr>
-        <w:spacing w:after="0"/>
-        <w:rPr>
-          <w:b/>
-          <w:sz w:val="32"/>
-          <w:szCs w:val="32"/>
-        </w:rPr>
-      </w:pPr>
-      <w:r>
-        <w:rPr>
-          <w:b/>
-          <w:sz w:val="32"/>
-          <w:szCs w:val="32"/>
+        <w:spacing w:before="240"/>
+        <w:jc w:val="both"/>
+        <w:rPr>
+          <w:b/>
+          <w:sz w:val="36"/>
+          <w:szCs w:val="36"/>
+        </w:rPr>
+      </w:pPr>
+      <w:r>
+        <w:rPr>
+          <w:b/>
+          <w:sz w:val="36"/>
+          <w:szCs w:val="36"/>
         </w:rPr>
         <w:t xml:space="preserve">Parte 3: Perguntas Frequentes (FAQ) </w:t>
       </w:r>
@@ -1872,6 +1873,12 @@
     </w:p>
     <w:p>
       <w:pPr>
+        <w:ind w:left="1068"/>
+        <w:jc w:val="both"/>
+      </w:pPr>
+    </w:p>
+    <w:p>
+      <w:pPr>
         <w:spacing w:before="240"/>
         <w:jc w:val="both"/>
         <w:rPr>
@@ -1886,6 +1893,7 @@
           <w:sz w:val="36"/>
           <w:szCs w:val="36"/>
         </w:rPr>
+        <w:lastRenderedPageBreak/>
         <w:t xml:space="preserve">Parte </w:t>
       </w:r>
       <w:r>
@@ -1896,8 +1904,6 @@
         </w:rPr>
         <w:t>4</w:t>
       </w:r>
-      <w:bookmarkStart w:id="0" w:name="_GoBack"/>
-      <w:bookmarkEnd w:id="0"/>
       <w:r>
         <w:rPr>
           <w:b/>
@@ -1934,47 +1940,21 @@
     </w:p>
     <w:p>
       <w:pPr>
+        <w:pStyle w:val="PargrafodaLista"/>
         <w:spacing w:after="0"/>
-        <w:jc w:val="both"/>
-        <w:rPr>
-          <w:rFonts w:eastAsia="Times New Roman"/>
-          <w:bCs/>
-          <w:sz w:val="32"/>
-          <w:szCs w:val="32"/>
-        </w:rPr>
-      </w:pPr>
-      <w:r>
-        <w:rPr>
-          <w:rFonts w:eastAsia="Times New Roman"/>
-          <w:bCs/>
-        </w:rPr>
-        <w:lastRenderedPageBreak/>
+        <w:ind w:left="360"/>
+        <w:jc w:val="both"/>
+      </w:pPr>
+      <w:r>
         <w:t>O Perímetro é a soma de todos os lados (paredes) do cômodo, medido em metros lineares (m). No contexto da norma NBR 5410, enquanto a Área determina a potência da iluminação, o Perímetro é o dado fundamental para definir a quantidade mínima de tomadas de uso geral (</w:t>
       </w:r>
       <w:proofErr w:type="spellStart"/>
       <w:r>
-        <w:rPr>
-          <w:rFonts w:eastAsia="Times New Roman"/>
-          <w:bCs/>
-        </w:rPr>
         <w:t>TUGs</w:t>
       </w:r>
       <w:proofErr w:type="spellEnd"/>
       <w:r>
-        <w:rPr>
-          <w:rFonts w:eastAsia="Times New Roman"/>
-          <w:bCs/>
-        </w:rPr>
-        <w:t>) por segurança, evitando o uso de benjamins e extensões.</w:t>
-      </w:r>
-      <w:r>
-        <w:rPr>
-          <w:rFonts w:eastAsia="Times New Roman"/>
-          <w:bCs/>
-          <w:sz w:val="32"/>
-          <w:szCs w:val="32"/>
-        </w:rPr>
-        <w:t xml:space="preserve"> </w:t>
+        <w:t xml:space="preserve">) por segurança, evitando o uso de benjamins e extensões. </w:t>
       </w:r>
     </w:p>
     <w:p>
@@ -2076,18 +2056,12 @@
     </w:p>
     <w:p>
       <w:pPr>
+        <w:pStyle w:val="PargrafodaLista"/>
         <w:spacing w:after="0"/>
-        <w:jc w:val="both"/>
-        <w:rPr>
-          <w:rFonts w:eastAsia="Times New Roman"/>
-          <w:bCs/>
-        </w:rPr>
-      </w:pPr>
-      <w:r>
-        <w:rPr>
-          <w:rFonts w:eastAsia="Times New Roman"/>
-          <w:bCs/>
-        </w:rPr>
+        <w:ind w:left="360"/>
+        <w:jc w:val="both"/>
+      </w:pPr>
+      <w:r>
         <w:t>O Brasil divide-se em dois grandes blocos de distribuição:</w:t>
       </w:r>
     </w:p>
@@ -2204,7 +2178,41 @@
     </w:p>
     <w:p>
       <w:pPr>
+        <w:pStyle w:val="PargrafodaLista"/>
         <w:spacing w:after="0"/>
+        <w:ind w:left="360"/>
+        <w:jc w:val="both"/>
+      </w:pPr>
+      <w:r>
+        <w:t>O motor de cálculo atua como um "fiscal da concessionária" muito rigoroso para ligações no poste da rua. Para uma casa, se a carga passa de 25 kW (</w:t>
+      </w:r>
+      <w:proofErr w:type="spellStart"/>
+      <w:r>
+        <w:t>ex</w:t>
+      </w:r>
+      <w:proofErr w:type="spellEnd"/>
+      <w:r>
+        <w:t>: 28.148 VA), a distribuidora corta o bifásico e obriga a colocar o trifásico para não desequilibrar a rua (sugerindo cabos de 25 mm2 e Disjuntor de 80 A).</w:t>
+      </w:r>
+    </w:p>
+    <w:p>
+      <w:pPr>
+        <w:pStyle w:val="PargrafodaLista"/>
+        <w:spacing w:after="0"/>
+        <w:ind w:left="360"/>
+        <w:jc w:val="both"/>
+      </w:pPr>
+      <w:r>
+        <w:t>No entanto, no apartamento a realidade é outra devido a dois conceitos:</w:t>
+      </w:r>
+    </w:p>
+    <w:p>
+      <w:pPr>
+        <w:pStyle w:val="PargrafodaLista"/>
+        <w:numPr>
+          <w:ilvl w:val="0"/>
+          <w:numId w:val="11"/>
+        </w:numPr>
         <w:jc w:val="both"/>
         <w:rPr>
           <w:rFonts w:eastAsia="Times New Roman"/>
@@ -2216,51 +2224,58 @@
           <w:rFonts w:eastAsia="Times New Roman"/>
           <w:bCs/>
         </w:rPr>
-        <w:t>O motor de cálculo atua como um "fiscal da concessionária" muito rigoroso para ligações no</w:t>
-      </w:r>
+        <w:t>A Regra do Prédio: O prédio recebe energia Trifásica pesada. O engenheiro distribui as três fases alternadamente pelos andares (</w:t>
+      </w:r>
+      <w:proofErr w:type="spellStart"/>
       <w:r>
         <w:rPr>
           <w:rFonts w:eastAsia="Times New Roman"/>
           <w:bCs/>
         </w:rPr>
-        <w:t xml:space="preserve"> </w:t>
-      </w:r>
+        <w:t>ex</w:t>
+      </w:r>
+      <w:proofErr w:type="spellEnd"/>
       <w:r>
         <w:rPr>
           <w:rFonts w:eastAsia="Times New Roman"/>
           <w:bCs/>
         </w:rPr>
-        <w:t>poste da rua. Para uma casa, se a carga passa de 25 kW (</w:t>
-      </w:r>
-      <w:proofErr w:type="spellStart"/>
-      <w:r>
+        <w:t>: Apto 11 recebe Fases A e B). Por isso, mesmo que a carga passe dos 25 kW, o projeto interno permite manter a unidade como bifásica, pois o equilíbrio é feito no conjunto do prédio.</w:t>
+      </w:r>
+    </w:p>
+    <w:p>
+      <w:pPr>
+        <w:pStyle w:val="PargrafodaLista"/>
+        <w:numPr>
+          <w:ilvl w:val="0"/>
+          <w:numId w:val="11"/>
+        </w:numPr>
+        <w:jc w:val="both"/>
         <w:rPr>
           <w:rFonts w:eastAsia="Times New Roman"/>
           <w:bCs/>
         </w:rPr>
-        <w:t>ex</w:t>
-      </w:r>
-      <w:proofErr w:type="spellEnd"/>
+      </w:pPr>
       <w:r>
         <w:rPr>
           <w:rFonts w:eastAsia="Times New Roman"/>
           <w:bCs/>
         </w:rPr>
-        <w:t>: 28.148 VA), a distribuidora corta</w:t>
+        <w:t xml:space="preserve">O Fator de Simultaneidade Real e a Seletividade: Um disjuntor Bifásico de 70A a </w:t>
       </w:r>
       <w:r>
         <w:rPr>
           <w:rFonts w:eastAsia="Times New Roman"/>
           <w:bCs/>
         </w:rPr>
-        <w:t xml:space="preserve"> </w:t>
+        <w:t>22</w:t>
       </w:r>
       <w:r>
         <w:rPr>
           <w:rFonts w:eastAsia="Times New Roman"/>
           <w:bCs/>
         </w:rPr>
-        <w:t>o bifásico e obriga a colocar o trifásico para não desequilibrar a rua (sugerindo cabos de 25</w:t>
+        <w:t>0V suporta 15.400 VA. A demanda diária raramente atinge a carga total instalada (ninguém liga todos os chuveiros e ares-condicionados no mesmo segundo). Por isso o disjuntor de 70A e o cabo de 10 mm2 funcionam perfeitamente na prática, pois a corrente de uso costuma flutuar entre 30A e 50A. Além disso, o disjuntor do medidor (70A) é maior que o interno (63A) por Seletividade, garantindo que o</w:t>
       </w:r>
       <w:r>
         <w:rPr>
@@ -2274,12 +2289,179 @@
           <w:rFonts w:eastAsia="Times New Roman"/>
           <w:bCs/>
         </w:rPr>
-        <w:t>mm2 e Disjuntor de 80 A).</w:t>
-      </w:r>
-    </w:p>
-    <w:p>
-      <w:pPr>
+        <w:t>desarme aconteça dentro de casa em caso de pico extremo.</w:t>
+      </w:r>
+    </w:p>
+    <w:p>
+      <w:pPr>
+        <w:pStyle w:val="PargrafodaLista"/>
+        <w:spacing w:before="160" w:after="0"/>
+        <w:ind w:left="360"/>
+        <w:jc w:val="both"/>
+      </w:pPr>
+    </w:p>
+    <w:p>
+      <w:pPr>
+        <w:spacing w:before="240"/>
+        <w:jc w:val="both"/>
+        <w:rPr>
+          <w:b/>
+          <w:sz w:val="36"/>
+          <w:szCs w:val="36"/>
+        </w:rPr>
+      </w:pPr>
+    </w:p>
+    <w:p>
+      <w:pPr>
+        <w:spacing w:before="240"/>
+        <w:jc w:val="both"/>
+        <w:rPr>
+          <w:b/>
+          <w:sz w:val="36"/>
+          <w:szCs w:val="36"/>
+        </w:rPr>
+      </w:pPr>
+    </w:p>
+    <w:p>
+      <w:pPr>
+        <w:spacing w:before="240"/>
+        <w:jc w:val="both"/>
+        <w:rPr>
+          <w:b/>
+          <w:sz w:val="36"/>
+          <w:szCs w:val="36"/>
+        </w:rPr>
+      </w:pPr>
+      <w:r>
+        <w:rPr>
+          <w:b/>
+          <w:sz w:val="36"/>
+          <w:szCs w:val="36"/>
+        </w:rPr>
+        <w:lastRenderedPageBreak/>
+        <w:t xml:space="preserve">Parte </w:t>
+      </w:r>
+      <w:r>
+        <w:rPr>
+          <w:b/>
+          <w:sz w:val="36"/>
+          <w:szCs w:val="36"/>
+        </w:rPr>
+        <w:t>5</w:t>
+      </w:r>
+      <w:r>
+        <w:rPr>
+          <w:b/>
+          <w:sz w:val="36"/>
+          <w:szCs w:val="36"/>
+        </w:rPr>
+        <w:t>: Aba Guia Prático (Soluções de Campo)</w:t>
+      </w:r>
+    </w:p>
+    <w:p>
+      <w:pPr>
+        <w:pStyle w:val="PargrafodaLista"/>
         <w:spacing w:after="0"/>
+        <w:ind w:left="360"/>
+        <w:jc w:val="both"/>
+      </w:pPr>
+      <w:r>
+        <w:t>Esta nova aba foi desenvolvida para ser o "canivete suíço" do eletricista no dia a dia da obra, oferecendo consultas rápidas, alertas de segurança e referências visuais de montagem.</w:t>
+      </w:r>
+    </w:p>
+    <w:p>
+      <w:pPr>
+        <w:pStyle w:val="PargrafodaLista"/>
+        <w:spacing w:after="0"/>
+        <w:ind w:left="360"/>
+        <w:jc w:val="center"/>
+      </w:pPr>
+      <w:r>
+        <w:drawing>
+          <wp:inline distT="0" distB="0" distL="0" distR="0" wp14:anchorId="46032CB9" wp14:editId="475C3827">
+            <wp:extent cx="1457184" cy="2524125"/>
+            <wp:effectExtent l="0" t="0" r="0" b="0"/>
+            <wp:docPr id="3" name="Imagem 3"/>
+            <wp:cNvGraphicFramePr>
+              <a:graphicFrameLocks xmlns:a="http://schemas.openxmlformats.org/drawingml/2006/main" noChangeAspect="1"/>
+            </wp:cNvGraphicFramePr>
+            <a:graphic xmlns:a="http://schemas.openxmlformats.org/drawingml/2006/main">
+              <a:graphicData uri="http://schemas.openxmlformats.org/drawingml/2006/picture">
+                <pic:pic xmlns:pic="http://schemas.openxmlformats.org/drawingml/2006/picture">
+                  <pic:nvPicPr>
+                    <pic:cNvPr id="1" name=""/>
+                    <pic:cNvPicPr/>
+                  </pic:nvPicPr>
+                  <pic:blipFill>
+                    <a:blip r:embed="rId23"/>
+                    <a:stretch>
+                      <a:fillRect/>
+                    </a:stretch>
+                  </pic:blipFill>
+                  <pic:spPr>
+                    <a:xfrm>
+                      <a:off x="0" y="0"/>
+                      <a:ext cx="1469718" cy="2545837"/>
+                    </a:xfrm>
+                    <a:prstGeom prst="rect">
+                      <a:avLst/>
+                    </a:prstGeom>
+                  </pic:spPr>
+                </pic:pic>
+              </a:graphicData>
+            </a:graphic>
+          </wp:inline>
+        </w:drawing>
+      </w:r>
+      <w:r>
+        <w:t xml:space="preserve">    </w:t>
+      </w:r>
+    </w:p>
+    <w:p>
+      <w:pPr>
+        <w:pStyle w:val="PargrafodaLista"/>
+        <w:numPr>
+          <w:ilvl w:val="0"/>
+          <w:numId w:val="18"/>
+        </w:numPr>
+        <w:spacing w:after="0"/>
+        <w:jc w:val="both"/>
+      </w:pPr>
+      <w:r>
+        <w:rPr>
+          <w:b/>
+        </w:rPr>
+        <w:t>Dimensionamento Inteligente (Recomendação Base)</w:t>
+      </w:r>
+      <w:r>
+        <w:t xml:space="preserve"> </w:t>
+      </w:r>
+    </w:p>
+    <w:p>
+      <w:pPr>
+        <w:pStyle w:val="PargrafodaLista"/>
+        <w:spacing w:after="0"/>
+        <w:jc w:val="both"/>
+      </w:pPr>
+      <w:r>
+        <w:t xml:space="preserve">Ao preencher os dados do seu projeto nas abas Cômodos e </w:t>
+      </w:r>
+      <w:proofErr w:type="spellStart"/>
+      <w:r>
+        <w:t>TUEs</w:t>
+      </w:r>
+      <w:proofErr w:type="spellEnd"/>
+      <w:r>
+        <w:t>, a aba Guia Prático calcula automaticamente uma recomendação de segurança contendo:</w:t>
+      </w:r>
+    </w:p>
+    <w:p>
+      <w:pPr>
+        <w:pStyle w:val="PargrafodaLista"/>
+        <w:numPr>
+          <w:ilvl w:val="0"/>
+          <w:numId w:val="11"/>
+        </w:numPr>
         <w:jc w:val="both"/>
         <w:rPr>
           <w:rFonts w:eastAsia="Times New Roman"/>
@@ -2289,9 +2471,17 @@
       <w:r>
         <w:rPr>
           <w:rFonts w:eastAsia="Times New Roman"/>
+          <w:b/>
           <w:bCs/>
         </w:rPr>
-        <w:t>No entanto, no apartamento a realidade é outra devido a dois conceitos:</w:t>
+        <w:t>Disjuntor Geral:</w:t>
+      </w:r>
+      <w:r>
+        <w:rPr>
+          <w:rFonts w:eastAsia="Times New Roman"/>
+          <w:bCs/>
+        </w:rPr>
+        <w:t xml:space="preserve"> A amperagem base para a proteção do circuito.</w:t>
       </w:r>
     </w:p>
     <w:p>
@@ -2299,22 +2489,190 @@
         <w:pStyle w:val="PargrafodaLista"/>
         <w:numPr>
           <w:ilvl w:val="0"/>
-          <w:numId w:val="14"/>
+          <w:numId w:val="11"/>
+        </w:numPr>
+        <w:jc w:val="both"/>
+        <w:rPr>
+          <w:rFonts w:eastAsia="Times New Roman"/>
+          <w:bCs/>
+        </w:rPr>
+      </w:pPr>
+      <w:r>
+        <w:rPr>
+          <w:rFonts w:eastAsia="Times New Roman"/>
+          <w:b/>
+          <w:bCs/>
+        </w:rPr>
+        <w:t>IDR recomendado</w:t>
+      </w:r>
+      <w:r>
+        <w:rPr>
+          <w:rFonts w:eastAsia="Times New Roman"/>
+          <w:b/>
+          <w:bCs/>
+        </w:rPr>
+        <w:t>:</w:t>
+      </w:r>
+      <w:r>
+        <w:rPr>
+          <w:rFonts w:eastAsia="Times New Roman"/>
+          <w:bCs/>
+        </w:rPr>
+        <w:t xml:space="preserve"> A corrente nominal mínima que o Interruptor Diferencial Residual deve ter para suportar a carga da casa sem desarmar.</w:t>
+      </w:r>
+    </w:p>
+    <w:p>
+      <w:pPr>
+        <w:pStyle w:val="PargrafodaLista"/>
+        <w:numPr>
+          <w:ilvl w:val="0"/>
+          <w:numId w:val="11"/>
+        </w:numPr>
+        <w:jc w:val="both"/>
+        <w:rPr>
+          <w:rFonts w:eastAsia="Times New Roman"/>
+          <w:bCs/>
+        </w:rPr>
+      </w:pPr>
+      <w:r>
+        <w:rPr>
+          <w:rFonts w:eastAsia="Times New Roman"/>
+          <w:b/>
+          <w:bCs/>
+        </w:rPr>
+        <w:t>DPS recomendado</w:t>
+      </w:r>
+      <w:r>
+        <w:rPr>
+          <w:rFonts w:eastAsia="Times New Roman"/>
+          <w:b/>
+          <w:bCs/>
+        </w:rPr>
+        <w:t>:</w:t>
+      </w:r>
+      <w:r>
+        <w:rPr>
+          <w:rFonts w:eastAsia="Times New Roman"/>
+          <w:bCs/>
+        </w:rPr>
+        <w:t xml:space="preserve"> A classe e a voltagem ideal do Dispositivo de Proteção contra Surtos (Ex</w:t>
+      </w:r>
+      <w:r>
+        <w:rPr>
+          <w:rFonts w:eastAsia="Times New Roman"/>
+          <w:bCs/>
+        </w:rPr>
+        <w:t>.</w:t>
+      </w:r>
+      <w:r>
+        <w:rPr>
+          <w:rFonts w:eastAsia="Times New Roman"/>
+          <w:bCs/>
+        </w:rPr>
+        <w:t>: 175V para redes 127V, ou 275V para redes 220V).</w:t>
+      </w:r>
+    </w:p>
+    <w:p>
+      <w:pPr>
+        <w:pStyle w:val="PargrafodaLista"/>
+        <w:numPr>
+          <w:ilvl w:val="0"/>
+          <w:numId w:val="11"/>
+        </w:numPr>
+        <w:jc w:val="both"/>
+        <w:rPr>
+          <w:rFonts w:eastAsia="Times New Roman"/>
+          <w:bCs/>
+        </w:rPr>
+      </w:pPr>
+      <w:r>
+        <w:rPr>
+          <w:rFonts w:eastAsia="Times New Roman"/>
+          <w:b/>
+          <w:bCs/>
+        </w:rPr>
+        <w:t>Nota:</w:t>
+      </w:r>
+      <w:r>
+        <w:rPr>
+          <w:rFonts w:eastAsia="Times New Roman"/>
+          <w:bCs/>
+        </w:rPr>
+        <w:t xml:space="preserve"> Esta seção só exibirá os resultados se você tiver adicionado ambientes e equipamentos nas abas anteriores.</w:t>
+      </w:r>
+    </w:p>
+    <w:p>
+      <w:pPr>
+        <w:ind w:left="708"/>
+        <w:jc w:val="center"/>
+        <w:rPr>
+          <w:rFonts w:eastAsia="Times New Roman"/>
+          <w:bCs/>
+        </w:rPr>
+      </w:pPr>
+      <w:r>
+        <w:drawing>
+          <wp:inline distT="0" distB="0" distL="0" distR="0" wp14:anchorId="5D59D218" wp14:editId="59DDD150">
+            <wp:extent cx="1497226" cy="2543175"/>
+            <wp:effectExtent l="0" t="0" r="8255" b="0"/>
+            <wp:docPr id="4" name="Imagem 4"/>
+            <wp:cNvGraphicFramePr>
+              <a:graphicFrameLocks xmlns:a="http://schemas.openxmlformats.org/drawingml/2006/main" noChangeAspect="1"/>
+            </wp:cNvGraphicFramePr>
+            <a:graphic xmlns:a="http://schemas.openxmlformats.org/drawingml/2006/main">
+              <a:graphicData uri="http://schemas.openxmlformats.org/drawingml/2006/picture">
+                <pic:pic xmlns:pic="http://schemas.openxmlformats.org/drawingml/2006/picture">
+                  <pic:nvPicPr>
+                    <pic:cNvPr id="1" name=""/>
+                    <pic:cNvPicPr/>
+                  </pic:nvPicPr>
+                  <pic:blipFill>
+                    <a:blip r:embed="rId24"/>
+                    <a:stretch>
+                      <a:fillRect/>
+                    </a:stretch>
+                  </pic:blipFill>
+                  <pic:spPr>
+                    <a:xfrm>
+                      <a:off x="0" y="0"/>
+                      <a:ext cx="1509890" cy="2564687"/>
+                    </a:xfrm>
+                    <a:prstGeom prst="rect">
+                      <a:avLst/>
+                    </a:prstGeom>
+                  </pic:spPr>
+                </pic:pic>
+              </a:graphicData>
+            </a:graphic>
+          </wp:inline>
+        </w:drawing>
+      </w:r>
+    </w:p>
+    <w:p>
+      <w:pPr>
+        <w:pStyle w:val="PargrafodaLista"/>
+        <w:numPr>
+          <w:ilvl w:val="0"/>
+          <w:numId w:val="18"/>
         </w:numPr>
         <w:spacing w:after="0"/>
-        <w:ind w:left="357" w:hanging="357"/>
-        <w:jc w:val="both"/>
-      </w:pPr>
-      <w:r>
-        <w:t>A Regra do Prédio: O prédio recebe energia Trifásica pesada. O engenheiro distribui as três fases alternadamente pelos andares (</w:t>
-      </w:r>
-      <w:proofErr w:type="spellStart"/>
-      <w:r>
-        <w:t>ex</w:t>
-      </w:r>
-      <w:proofErr w:type="spellEnd"/>
-      <w:r>
-        <w:t>: Apto 11 recebe Fases A e B). Por isso, mesmo que a carga passe dos 25 kW, o projeto interno permite manter a unidade como bifásica, pois o equilíbrio é feito no conjunto do prédio.</w:t>
+        <w:jc w:val="both"/>
+      </w:pPr>
+      <w:r>
+        <w:rPr>
+          <w:b/>
+        </w:rPr>
+        <w:t>Manuais Visuais e Situações do Dia a Dia</w:t>
+      </w:r>
+    </w:p>
+    <w:p>
+      <w:pPr>
+        <w:pStyle w:val="PargrafodaLista"/>
+        <w:spacing w:after="0"/>
+        <w:jc w:val="both"/>
+      </w:pPr>
+      <w:r>
+        <w:t>O guia traz quatro módulos de consulta rápida para resolver dúvidas comuns e elevar o padrão do seu serviço:</w:t>
       </w:r>
     </w:p>
     <w:p>
@@ -2322,26 +2680,277 @@
         <w:pStyle w:val="PargrafodaLista"/>
         <w:numPr>
           <w:ilvl w:val="0"/>
-          <w:numId w:val="14"/>
+          <w:numId w:val="11"/>
         </w:numPr>
-        <w:spacing w:before="160" w:after="0"/>
-        <w:jc w:val="both"/>
-      </w:pPr>
-      <w:r>
-        <w:t xml:space="preserve">O Fator de Simultaneidade Real e a Seletividade: Um disjuntor Bifásico de 70A a </w:t>
-      </w:r>
-      <w:r>
-        <w:t>22</w:t>
-      </w:r>
-      <w:r>
-        <w:t>0V suporta 15.400 VA. A demanda diária raramente atinge a carga total instalada (ninguém liga todos os chuveiros e ares-condicionados no mesmo segundo). Por isso o disjuntor de 70A e o cabo de 10 mm2 funcionam perfeitamente na prática, pois a corrente de uso costuma flutuar entre 30A e 50A. Além disso, o disjuntor do medidor (70A) é maior que o interno (63A) por Seletividade, garantindo que o</w:t>
-      </w:r>
-      <w:r>
-        <w:t xml:space="preserve"> </w:t>
-      </w:r>
-      <w:r>
-        <w:t>desarme aconteça dentro de casa em caso de pico extremo.</w:t>
-      </w:r>
+        <w:jc w:val="both"/>
+      </w:pPr>
+      <w:r>
+        <w:rPr>
+          <w:rFonts w:eastAsia="Times New Roman"/>
+          <w:b/>
+          <w:bCs/>
+        </w:rPr>
+        <w:lastRenderedPageBreak/>
+        <w:t xml:space="preserve">IDR em instalações sem Fio Terra: </w:t>
+      </w:r>
+      <w:r>
+        <w:t>Um alerta didático que quebra o mito de que o IDR precisa de aterramento para funcionar, mostrando como ele protege vidas mesmo em casas antigas.</w:t>
+      </w:r>
+    </w:p>
+    <w:p>
+      <w:pPr>
+        <w:pStyle w:val="PargrafodaLista"/>
+        <w:ind w:left="1068"/>
+        <w:jc w:val="center"/>
+      </w:pPr>
+      <w:r>
+        <w:drawing>
+          <wp:inline distT="0" distB="0" distL="0" distR="0" wp14:anchorId="798B512E" wp14:editId="197AD056">
+            <wp:extent cx="1328920" cy="2238375"/>
+            <wp:effectExtent l="0" t="0" r="5080" b="0"/>
+            <wp:docPr id="5" name="Imagem 5"/>
+            <wp:cNvGraphicFramePr>
+              <a:graphicFrameLocks xmlns:a="http://schemas.openxmlformats.org/drawingml/2006/main" noChangeAspect="1"/>
+            </wp:cNvGraphicFramePr>
+            <a:graphic xmlns:a="http://schemas.openxmlformats.org/drawingml/2006/main">
+              <a:graphicData uri="http://schemas.openxmlformats.org/drawingml/2006/picture">
+                <pic:pic xmlns:pic="http://schemas.openxmlformats.org/drawingml/2006/picture">
+                  <pic:nvPicPr>
+                    <pic:cNvPr id="1" name=""/>
+                    <pic:cNvPicPr/>
+                  </pic:nvPicPr>
+                  <pic:blipFill>
+                    <a:blip r:embed="rId25"/>
+                    <a:stretch>
+                      <a:fillRect/>
+                    </a:stretch>
+                  </pic:blipFill>
+                  <pic:spPr>
+                    <a:xfrm>
+                      <a:off x="0" y="0"/>
+                      <a:ext cx="1360310" cy="2291247"/>
+                    </a:xfrm>
+                    <a:prstGeom prst="rect">
+                      <a:avLst/>
+                    </a:prstGeom>
+                  </pic:spPr>
+                </pic:pic>
+              </a:graphicData>
+            </a:graphic>
+          </wp:inline>
+        </w:drawing>
+      </w:r>
+    </w:p>
+    <w:p>
+      <w:pPr>
+        <w:pStyle w:val="PargrafodaLista"/>
+        <w:numPr>
+          <w:ilvl w:val="0"/>
+          <w:numId w:val="11"/>
+        </w:numPr>
+        <w:jc w:val="both"/>
+      </w:pPr>
+      <w:r>
+        <w:rPr>
+          <w:rFonts w:eastAsia="Times New Roman"/>
+          <w:b/>
+          <w:bCs/>
+        </w:rPr>
+        <w:t xml:space="preserve">DPS sem Aterramento (Alerta Crítico): </w:t>
+      </w:r>
+      <w:r>
+        <w:t>Documentação técnica mostrando o risco de instalar um DPS sem conectar ao barramento de terra, o que inutiliza o componente e gera risco de incêndio.</w:t>
+      </w:r>
+    </w:p>
+    <w:p>
+      <w:pPr>
+        <w:pStyle w:val="PargrafodaLista"/>
+        <w:ind w:left="1068"/>
+        <w:jc w:val="center"/>
+      </w:pPr>
+      <w:r>
+        <w:drawing>
+          <wp:inline distT="0" distB="0" distL="0" distR="0" wp14:anchorId="4128AA8F" wp14:editId="10988791">
+            <wp:extent cx="1333594" cy="2257425"/>
+            <wp:effectExtent l="0" t="0" r="0" b="0"/>
+            <wp:docPr id="6" name="Imagem 6"/>
+            <wp:cNvGraphicFramePr>
+              <a:graphicFrameLocks xmlns:a="http://schemas.openxmlformats.org/drawingml/2006/main" noChangeAspect="1"/>
+            </wp:cNvGraphicFramePr>
+            <a:graphic xmlns:a="http://schemas.openxmlformats.org/drawingml/2006/main">
+              <a:graphicData uri="http://schemas.openxmlformats.org/drawingml/2006/picture">
+                <pic:pic xmlns:pic="http://schemas.openxmlformats.org/drawingml/2006/picture">
+                  <pic:nvPicPr>
+                    <pic:cNvPr id="1" name=""/>
+                    <pic:cNvPicPr/>
+                  </pic:nvPicPr>
+                  <pic:blipFill>
+                    <a:blip r:embed="rId26"/>
+                    <a:stretch>
+                      <a:fillRect/>
+                    </a:stretch>
+                  </pic:blipFill>
+                  <pic:spPr>
+                    <a:xfrm>
+                      <a:off x="0" y="0"/>
+                      <a:ext cx="1344536" cy="2275947"/>
+                    </a:xfrm>
+                    <a:prstGeom prst="rect">
+                      <a:avLst/>
+                    </a:prstGeom>
+                  </pic:spPr>
+                </pic:pic>
+              </a:graphicData>
+            </a:graphic>
+          </wp:inline>
+        </w:drawing>
+      </w:r>
+    </w:p>
+    <w:p>
+      <w:pPr>
+        <w:pStyle w:val="PargrafodaLista"/>
+        <w:numPr>
+          <w:ilvl w:val="0"/>
+          <w:numId w:val="11"/>
+        </w:numPr>
+        <w:jc w:val="both"/>
+      </w:pPr>
+      <w:proofErr w:type="spellStart"/>
+      <w:r>
+        <w:rPr>
+          <w:rFonts w:eastAsia="Times New Roman"/>
+          <w:b/>
+          <w:bCs/>
+        </w:rPr>
+        <w:t>Retrofit</w:t>
+      </w:r>
+      <w:proofErr w:type="spellEnd"/>
+      <w:r>
+        <w:rPr>
+          <w:rFonts w:eastAsia="Times New Roman"/>
+          <w:b/>
+          <w:bCs/>
+        </w:rPr>
+        <w:t xml:space="preserve"> (Modernizando Quadro de Madeira): </w:t>
+      </w:r>
+      <w:r>
+        <w:t>Um passo a passo prático de como substituir quadros antigos de embutir usando caixas de sobrepor e espuma expansiva (PU corta-fogo), sem precisar quebrar a parede do cliente.</w:t>
+      </w:r>
+    </w:p>
+    <w:p>
+      <w:pPr>
+        <w:pStyle w:val="PargrafodaLista"/>
+        <w:ind w:left="1068"/>
+        <w:jc w:val="center"/>
+      </w:pPr>
+      <w:r>
+        <w:drawing>
+          <wp:inline distT="0" distB="0" distL="0" distR="0" wp14:anchorId="4BA81A7D" wp14:editId="0F04069B">
+            <wp:extent cx="1400175" cy="2356962"/>
+            <wp:effectExtent l="0" t="0" r="0" b="5715"/>
+            <wp:docPr id="7" name="Imagem 7"/>
+            <wp:cNvGraphicFramePr>
+              <a:graphicFrameLocks xmlns:a="http://schemas.openxmlformats.org/drawingml/2006/main" noChangeAspect="1"/>
+            </wp:cNvGraphicFramePr>
+            <a:graphic xmlns:a="http://schemas.openxmlformats.org/drawingml/2006/main">
+              <a:graphicData uri="http://schemas.openxmlformats.org/drawingml/2006/picture">
+                <pic:pic xmlns:pic="http://schemas.openxmlformats.org/drawingml/2006/picture">
+                  <pic:nvPicPr>
+                    <pic:cNvPr id="1" name=""/>
+                    <pic:cNvPicPr/>
+                  </pic:nvPicPr>
+                  <pic:blipFill>
+                    <a:blip r:embed="rId27"/>
+                    <a:stretch>
+                      <a:fillRect/>
+                    </a:stretch>
+                  </pic:blipFill>
+                  <pic:spPr>
+                    <a:xfrm>
+                      <a:off x="0" y="0"/>
+                      <a:ext cx="1415504" cy="2382766"/>
+                    </a:xfrm>
+                    <a:prstGeom prst="rect">
+                      <a:avLst/>
+                    </a:prstGeom>
+                  </pic:spPr>
+                </pic:pic>
+              </a:graphicData>
+            </a:graphic>
+          </wp:inline>
+        </w:drawing>
+      </w:r>
+    </w:p>
+    <w:p>
+      <w:pPr>
+        <w:pStyle w:val="PargrafodaLista"/>
+        <w:numPr>
+          <w:ilvl w:val="0"/>
+          <w:numId w:val="11"/>
+        </w:numPr>
+        <w:jc w:val="both"/>
+      </w:pPr>
+      <w:r>
+        <w:rPr>
+          <w:rFonts w:eastAsia="Times New Roman"/>
+          <w:b/>
+          <w:bCs/>
+        </w:rPr>
+        <w:lastRenderedPageBreak/>
+        <w:t xml:space="preserve">Galeria de Quadros (Padrões de Montagem): </w:t>
+      </w:r>
+      <w:r>
+        <w:t>Um banco de imagens integrado ao aplicativo com exemplos de Quadros de Distribuição bem montados, detalhando o uso</w:t>
+      </w:r>
+      <w:r>
+        <w:t xml:space="preserve"> de barramentos tipo pente, terminais ilhós e separação de circuitos para você usar de inspiração.</w:t>
+      </w:r>
+    </w:p>
+    <w:p>
+      <w:pPr>
+        <w:pStyle w:val="PargrafodaLista"/>
+        <w:ind w:left="1068"/>
+        <w:jc w:val="center"/>
+      </w:pPr>
+      <w:r>
+        <w:drawing>
+          <wp:inline distT="0" distB="0" distL="0" distR="0" wp14:anchorId="7863969D" wp14:editId="5A8D18BC">
+            <wp:extent cx="1410557" cy="2390775"/>
+            <wp:effectExtent l="0" t="0" r="0" b="0"/>
+            <wp:docPr id="8" name="Imagem 8"/>
+            <wp:cNvGraphicFramePr>
+              <a:graphicFrameLocks xmlns:a="http://schemas.openxmlformats.org/drawingml/2006/main" noChangeAspect="1"/>
+            </wp:cNvGraphicFramePr>
+            <a:graphic xmlns:a="http://schemas.openxmlformats.org/drawingml/2006/main">
+              <a:graphicData uri="http://schemas.openxmlformats.org/drawingml/2006/picture">
+                <pic:pic xmlns:pic="http://schemas.openxmlformats.org/drawingml/2006/picture">
+                  <pic:nvPicPr>
+                    <pic:cNvPr id="1" name=""/>
+                    <pic:cNvPicPr/>
+                  </pic:nvPicPr>
+                  <pic:blipFill>
+                    <a:blip r:embed="rId28"/>
+                    <a:stretch>
+                      <a:fillRect/>
+                    </a:stretch>
+                  </pic:blipFill>
+                  <pic:spPr>
+                    <a:xfrm>
+                      <a:off x="0" y="0"/>
+                      <a:ext cx="1421076" cy="2408603"/>
+                    </a:xfrm>
+                    <a:prstGeom prst="rect">
+                      <a:avLst/>
+                    </a:prstGeom>
+                  </pic:spPr>
+                </pic:pic>
+              </a:graphicData>
+            </a:graphic>
+          </wp:inline>
+        </w:drawing>
+      </w:r>
+      <w:bookmarkStart w:id="0" w:name="_GoBack"/>
+      <w:bookmarkEnd w:id="0"/>
     </w:p>
     <w:sectPr>
       <w:pgSz w:w="11906" w:h="16838" w:code="9"/>
@@ -2365,7 +2974,7 @@
       <w:lvlText w:val="%1."/>
       <w:lvlJc w:val="left"/>
       <w:pPr>
-        <w:ind w:left="360" w:hanging="360"/>
+        <w:ind w:left="720" w:hanging="360"/>
       </w:pPr>
       <w:rPr>
         <w:rFonts w:hint="default"/>
@@ -2377,7 +2986,7 @@
       <w:lvlText w:val="o"/>
       <w:lvlJc w:val="left"/>
       <w:pPr>
-        <w:ind w:left="1080" w:hanging="360"/>
+        <w:ind w:left="1440" w:hanging="360"/>
       </w:pPr>
       <w:rPr>
         <w:rFonts w:ascii="Courier New" w:hAnsi="Courier New" w:cs="Courier New" w:hint="default"/>
@@ -2389,7 +2998,7 @@
       <w:lvlText w:val=""/>
       <w:lvlJc w:val="left"/>
       <w:pPr>
-        <w:ind w:left="1800" w:hanging="360"/>
+        <w:ind w:left="2160" w:hanging="360"/>
       </w:pPr>
       <w:rPr>
         <w:rFonts w:ascii="Wingdings" w:hAnsi="Wingdings" w:hint="default"/>
@@ -2401,7 +3010,7 @@
       <w:lvlText w:val=""/>
       <w:lvlJc w:val="left"/>
       <w:pPr>
-        <w:ind w:left="2520" w:hanging="360"/>
+        <w:ind w:left="2880" w:hanging="360"/>
       </w:pPr>
       <w:rPr>
         <w:rFonts w:ascii="Symbol" w:hAnsi="Symbol" w:hint="default"/>
@@ -2413,7 +3022,7 @@
       <w:lvlText w:val="o"/>
       <w:lvlJc w:val="left"/>
       <w:pPr>
-        <w:ind w:left="3240" w:hanging="360"/>
+        <w:ind w:left="3600" w:hanging="360"/>
       </w:pPr>
       <w:rPr>
         <w:rFonts w:ascii="Courier New" w:hAnsi="Courier New" w:cs="Courier New" w:hint="default"/>
@@ -2425,7 +3034,7 @@
       <w:lvlText w:val=""/>
       <w:lvlJc w:val="left"/>
       <w:pPr>
-        <w:ind w:left="3960" w:hanging="360"/>
+        <w:ind w:left="4320" w:hanging="360"/>
       </w:pPr>
       <w:rPr>
         <w:rFonts w:ascii="Wingdings" w:hAnsi="Wingdings" w:hint="default"/>
@@ -2437,7 +3046,7 @@
       <w:lvlText w:val=""/>
       <w:lvlJc w:val="left"/>
       <w:pPr>
-        <w:ind w:left="4680" w:hanging="360"/>
+        <w:ind w:left="5040" w:hanging="360"/>
       </w:pPr>
       <w:rPr>
         <w:rFonts w:ascii="Symbol" w:hAnsi="Symbol" w:hint="default"/>
@@ -2449,7 +3058,7 @@
       <w:lvlText w:val="o"/>
       <w:lvlJc w:val="left"/>
       <w:pPr>
-        <w:ind w:left="5400" w:hanging="360"/>
+        <w:ind w:left="5760" w:hanging="360"/>
       </w:pPr>
       <w:rPr>
         <w:rFonts w:ascii="Courier New" w:hAnsi="Courier New" w:cs="Courier New" w:hint="default"/>
@@ -2461,7 +3070,7 @@
       <w:lvlText w:val=""/>
       <w:lvlJc w:val="left"/>
       <w:pPr>
-        <w:ind w:left="6120" w:hanging="360"/>
+        <w:ind w:left="6480" w:hanging="360"/>
       </w:pPr>
       <w:rPr>
         <w:rFonts w:ascii="Wingdings" w:hAnsi="Wingdings" w:hint="default"/>
@@ -2469,6 +3078,268 @@
     </w:lvl>
   </w:abstractNum>
   <w:abstractNum w:abstractNumId="1" w15:restartNumberingAfterBreak="0">
+    <w:nsid w:val="05A94DDE"/>
+    <w:multiLevelType w:val="hybridMultilevel"/>
+    <w:tmpl w:val="69185904"/>
+    <w:lvl w:ilvl="0" w:tplc="0409000F">
+      <w:start w:val="1"/>
+      <w:numFmt w:val="decimal"/>
+      <w:lvlText w:val="%1."/>
+      <w:lvlJc w:val="left"/>
+      <w:pPr>
+        <w:ind w:left="720" w:hanging="360"/>
+      </w:pPr>
+      <w:rPr>
+        <w:rFonts w:hint="default"/>
+      </w:rPr>
+    </w:lvl>
+    <w:lvl w:ilvl="1" w:tplc="04090003">
+      <w:start w:val="1"/>
+      <w:numFmt w:val="bullet"/>
+      <w:lvlText w:val="o"/>
+      <w:lvlJc w:val="left"/>
+      <w:pPr>
+        <w:ind w:left="1440" w:hanging="360"/>
+      </w:pPr>
+      <w:rPr>
+        <w:rFonts w:ascii="Courier New" w:hAnsi="Courier New" w:cs="Courier New" w:hint="default"/>
+      </w:rPr>
+    </w:lvl>
+    <w:lvl w:ilvl="2" w:tplc="04090005" w:tentative="1">
+      <w:start w:val="1"/>
+      <w:numFmt w:val="bullet"/>
+      <w:lvlText w:val=""/>
+      <w:lvlJc w:val="left"/>
+      <w:pPr>
+        <w:ind w:left="2160" w:hanging="360"/>
+      </w:pPr>
+      <w:rPr>
+        <w:rFonts w:ascii="Wingdings" w:hAnsi="Wingdings" w:hint="default"/>
+      </w:rPr>
+    </w:lvl>
+    <w:lvl w:ilvl="3" w:tplc="04090001" w:tentative="1">
+      <w:start w:val="1"/>
+      <w:numFmt w:val="bullet"/>
+      <w:lvlText w:val=""/>
+      <w:lvlJc w:val="left"/>
+      <w:pPr>
+        <w:ind w:left="2880" w:hanging="360"/>
+      </w:pPr>
+      <w:rPr>
+        <w:rFonts w:ascii="Symbol" w:hAnsi="Symbol" w:hint="default"/>
+      </w:rPr>
+    </w:lvl>
+    <w:lvl w:ilvl="4" w:tplc="04090003" w:tentative="1">
+      <w:start w:val="1"/>
+      <w:numFmt w:val="bullet"/>
+      <w:lvlText w:val="o"/>
+      <w:lvlJc w:val="left"/>
+      <w:pPr>
+        <w:ind w:left="3600" w:hanging="360"/>
+      </w:pPr>
+      <w:rPr>
+        <w:rFonts w:ascii="Courier New" w:hAnsi="Courier New" w:cs="Courier New" w:hint="default"/>
+      </w:rPr>
+    </w:lvl>
+    <w:lvl w:ilvl="5" w:tplc="04090005" w:tentative="1">
+      <w:start w:val="1"/>
+      <w:numFmt w:val="bullet"/>
+      <w:lvlText w:val=""/>
+      <w:lvlJc w:val="left"/>
+      <w:pPr>
+        <w:ind w:left="4320" w:hanging="360"/>
+      </w:pPr>
+      <w:rPr>
+        <w:rFonts w:ascii="Wingdings" w:hAnsi="Wingdings" w:hint="default"/>
+      </w:rPr>
+    </w:lvl>
+    <w:lvl w:ilvl="6" w:tplc="04090001" w:tentative="1">
+      <w:start w:val="1"/>
+      <w:numFmt w:val="bullet"/>
+      <w:lvlText w:val=""/>
+      <w:lvlJc w:val="left"/>
+      <w:pPr>
+        <w:ind w:left="5040" w:hanging="360"/>
+      </w:pPr>
+      <w:rPr>
+        <w:rFonts w:ascii="Symbol" w:hAnsi="Symbol" w:hint="default"/>
+      </w:rPr>
+    </w:lvl>
+    <w:lvl w:ilvl="7" w:tplc="04090003" w:tentative="1">
+      <w:start w:val="1"/>
+      <w:numFmt w:val="bullet"/>
+      <w:lvlText w:val="o"/>
+      <w:lvlJc w:val="left"/>
+      <w:pPr>
+        <w:ind w:left="5760" w:hanging="360"/>
+      </w:pPr>
+      <w:rPr>
+        <w:rFonts w:ascii="Courier New" w:hAnsi="Courier New" w:cs="Courier New" w:hint="default"/>
+      </w:rPr>
+    </w:lvl>
+    <w:lvl w:ilvl="8" w:tplc="04090005" w:tentative="1">
+      <w:start w:val="1"/>
+      <w:numFmt w:val="bullet"/>
+      <w:lvlText w:val=""/>
+      <w:lvlJc w:val="left"/>
+      <w:pPr>
+        <w:ind w:left="6480" w:hanging="360"/>
+      </w:pPr>
+      <w:rPr>
+        <w:rFonts w:ascii="Wingdings" w:hAnsi="Wingdings" w:hint="default"/>
+      </w:rPr>
+    </w:lvl>
+  </w:abstractNum>
+  <w:abstractNum w:abstractNumId="2" w15:restartNumberingAfterBreak="0">
+    <w:nsid w:val="0CBF2822"/>
+    <w:multiLevelType w:val="multilevel"/>
+    <w:tmpl w:val="D35E380C"/>
+    <w:lvl w:ilvl="0">
+      <w:start w:val="1"/>
+      <w:numFmt w:val="bullet"/>
+      <w:lvlText w:val=""/>
+      <w:lvlJc w:val="left"/>
+      <w:pPr>
+        <w:tabs>
+          <w:tab w:val="num" w:pos="720"/>
+        </w:tabs>
+        <w:ind w:left="720" w:hanging="360"/>
+      </w:pPr>
+      <w:rPr>
+        <w:rFonts w:ascii="Symbol" w:hAnsi="Symbol" w:hint="default"/>
+        <w:sz w:val="20"/>
+      </w:rPr>
+    </w:lvl>
+    <w:lvl w:ilvl="1" w:tentative="1">
+      <w:start w:val="1"/>
+      <w:numFmt w:val="bullet"/>
+      <w:lvlText w:val="o"/>
+      <w:lvlJc w:val="left"/>
+      <w:pPr>
+        <w:tabs>
+          <w:tab w:val="num" w:pos="1440"/>
+        </w:tabs>
+        <w:ind w:left="1440" w:hanging="360"/>
+      </w:pPr>
+      <w:rPr>
+        <w:rFonts w:ascii="Courier New" w:hAnsi="Courier New" w:hint="default"/>
+        <w:sz w:val="20"/>
+      </w:rPr>
+    </w:lvl>
+    <w:lvl w:ilvl="2" w:tentative="1">
+      <w:start w:val="1"/>
+      <w:numFmt w:val="bullet"/>
+      <w:lvlText w:val=""/>
+      <w:lvlJc w:val="left"/>
+      <w:pPr>
+        <w:tabs>
+          <w:tab w:val="num" w:pos="2160"/>
+        </w:tabs>
+        <w:ind w:left="2160" w:hanging="360"/>
+      </w:pPr>
+      <w:rPr>
+        <w:rFonts w:ascii="Wingdings" w:hAnsi="Wingdings" w:hint="default"/>
+        <w:sz w:val="20"/>
+      </w:rPr>
+    </w:lvl>
+    <w:lvl w:ilvl="3" w:tentative="1">
+      <w:start w:val="1"/>
+      <w:numFmt w:val="bullet"/>
+      <w:lvlText w:val=""/>
+      <w:lvlJc w:val="left"/>
+      <w:pPr>
+        <w:tabs>
+          <w:tab w:val="num" w:pos="2880"/>
+        </w:tabs>
+        <w:ind w:left="2880" w:hanging="360"/>
+      </w:pPr>
+      <w:rPr>
+        <w:rFonts w:ascii="Wingdings" w:hAnsi="Wingdings" w:hint="default"/>
+        <w:sz w:val="20"/>
+      </w:rPr>
+    </w:lvl>
+    <w:lvl w:ilvl="4" w:tentative="1">
+      <w:start w:val="1"/>
+      <w:numFmt w:val="bullet"/>
+      <w:lvlText w:val=""/>
+      <w:lvlJc w:val="left"/>
+      <w:pPr>
+        <w:tabs>
+          <w:tab w:val="num" w:pos="3600"/>
+        </w:tabs>
+        <w:ind w:left="3600" w:hanging="360"/>
+      </w:pPr>
+      <w:rPr>
+        <w:rFonts w:ascii="Wingdings" w:hAnsi="Wingdings" w:hint="default"/>
+        <w:sz w:val="20"/>
+      </w:rPr>
+    </w:lvl>
+    <w:lvl w:ilvl="5" w:tentative="1">
+      <w:start w:val="1"/>
+      <w:numFmt w:val="bullet"/>
+      <w:lvlText w:val=""/>
+      <w:lvlJc w:val="left"/>
+      <w:pPr>
+        <w:tabs>
+          <w:tab w:val="num" w:pos="4320"/>
+        </w:tabs>
+        <w:ind w:left="4320" w:hanging="360"/>
+      </w:pPr>
+      <w:rPr>
+        <w:rFonts w:ascii="Wingdings" w:hAnsi="Wingdings" w:hint="default"/>
+        <w:sz w:val="20"/>
+      </w:rPr>
+    </w:lvl>
+    <w:lvl w:ilvl="6" w:tentative="1">
+      <w:start w:val="1"/>
+      <w:numFmt w:val="bullet"/>
+      <w:lvlText w:val=""/>
+      <w:lvlJc w:val="left"/>
+      <w:pPr>
+        <w:tabs>
+          <w:tab w:val="num" w:pos="5040"/>
+        </w:tabs>
+        <w:ind w:left="5040" w:hanging="360"/>
+      </w:pPr>
+      <w:rPr>
+        <w:rFonts w:ascii="Wingdings" w:hAnsi="Wingdings" w:hint="default"/>
+        <w:sz w:val="20"/>
+      </w:rPr>
+    </w:lvl>
+    <w:lvl w:ilvl="7" w:tentative="1">
+      <w:start w:val="1"/>
+      <w:numFmt w:val="bullet"/>
+      <w:lvlText w:val=""/>
+      <w:lvlJc w:val="left"/>
+      <w:pPr>
+        <w:tabs>
+          <w:tab w:val="num" w:pos="5760"/>
+        </w:tabs>
+        <w:ind w:left="5760" w:hanging="360"/>
+      </w:pPr>
+      <w:rPr>
+        <w:rFonts w:ascii="Wingdings" w:hAnsi="Wingdings" w:hint="default"/>
+        <w:sz w:val="20"/>
+      </w:rPr>
+    </w:lvl>
+    <w:lvl w:ilvl="8" w:tentative="1">
+      <w:start w:val="1"/>
+      <w:numFmt w:val="bullet"/>
+      <w:lvlText w:val=""/>
+      <w:lvlJc w:val="left"/>
+      <w:pPr>
+        <w:tabs>
+          <w:tab w:val="num" w:pos="6480"/>
+        </w:tabs>
+        <w:ind w:left="6480" w:hanging="360"/>
+      </w:pPr>
+      <w:rPr>
+        <w:rFonts w:ascii="Wingdings" w:hAnsi="Wingdings" w:hint="default"/>
+        <w:sz w:val="20"/>
+      </w:rPr>
+    </w:lvl>
+  </w:abstractNum>
+  <w:abstractNum w:abstractNumId="3" w15:restartNumberingAfterBreak="0">
     <w:nsid w:val="12783F28"/>
     <w:multiLevelType w:val="multilevel"/>
     <w:tmpl w:val="41AE1E7A"/>
@@ -2584,7 +3455,7 @@
       </w:pPr>
     </w:lvl>
   </w:abstractNum>
-  <w:abstractNum w:abstractNumId="2" w15:restartNumberingAfterBreak="0">
+  <w:abstractNum w:abstractNumId="4" w15:restartNumberingAfterBreak="0">
     <w:nsid w:val="1A0851F9"/>
     <w:multiLevelType w:val="multilevel"/>
     <w:tmpl w:val="1F28C206"/>
@@ -2733,7 +3604,7 @@
       </w:rPr>
     </w:lvl>
   </w:abstractNum>
-  <w:abstractNum w:abstractNumId="3" w15:restartNumberingAfterBreak="0">
+  <w:abstractNum w:abstractNumId="5" w15:restartNumberingAfterBreak="0">
     <w:nsid w:val="1D255B2A"/>
     <w:multiLevelType w:val="multilevel"/>
     <w:tmpl w:val="2988B1D0"/>
@@ -2850,7 +3721,7 @@
       </w:pPr>
     </w:lvl>
   </w:abstractNum>
-  <w:abstractNum w:abstractNumId="4" w15:restartNumberingAfterBreak="0">
+  <w:abstractNum w:abstractNumId="6" w15:restartNumberingAfterBreak="0">
     <w:nsid w:val="20E10307"/>
     <w:multiLevelType w:val="hybridMultilevel"/>
     <w:tmpl w:val="7310A5C0"/>
@@ -2963,7 +3834,7 @@
       </w:rPr>
     </w:lvl>
   </w:abstractNum>
-  <w:abstractNum w:abstractNumId="5" w15:restartNumberingAfterBreak="0">
+  <w:abstractNum w:abstractNumId="7" w15:restartNumberingAfterBreak="0">
     <w:nsid w:val="27B33088"/>
     <w:multiLevelType w:val="multilevel"/>
     <w:tmpl w:val="3A44992C"/>
@@ -3112,7 +3983,7 @@
       </w:rPr>
     </w:lvl>
   </w:abstractNum>
-  <w:abstractNum w:abstractNumId="6" w15:restartNumberingAfterBreak="0">
+  <w:abstractNum w:abstractNumId="8" w15:restartNumberingAfterBreak="0">
     <w:nsid w:val="2A262AF8"/>
     <w:multiLevelType w:val="hybridMultilevel"/>
     <w:tmpl w:val="8E6C3A82"/>
@@ -3225,7 +4096,7 @@
       </w:rPr>
     </w:lvl>
   </w:abstractNum>
-  <w:abstractNum w:abstractNumId="7" w15:restartNumberingAfterBreak="0">
+  <w:abstractNum w:abstractNumId="9" w15:restartNumberingAfterBreak="0">
     <w:nsid w:val="3B223BFE"/>
     <w:multiLevelType w:val="multilevel"/>
     <w:tmpl w:val="718A3DC6"/>
@@ -3374,7 +4245,7 @@
       </w:rPr>
     </w:lvl>
   </w:abstractNum>
-  <w:abstractNum w:abstractNumId="8" w15:restartNumberingAfterBreak="0">
+  <w:abstractNum w:abstractNumId="10" w15:restartNumberingAfterBreak="0">
     <w:nsid w:val="453541F4"/>
     <w:multiLevelType w:val="hybridMultilevel"/>
     <w:tmpl w:val="FAFE7DF2"/>
@@ -3487,7 +4358,156 @@
       </w:rPr>
     </w:lvl>
   </w:abstractNum>
-  <w:abstractNum w:abstractNumId="9" w15:restartNumberingAfterBreak="0">
+  <w:abstractNum w:abstractNumId="11" w15:restartNumberingAfterBreak="0">
+    <w:nsid w:val="48F35884"/>
+    <w:multiLevelType w:val="multilevel"/>
+    <w:tmpl w:val="034275CC"/>
+    <w:lvl w:ilvl="0">
+      <w:start w:val="1"/>
+      <w:numFmt w:val="bullet"/>
+      <w:lvlText w:val=""/>
+      <w:lvlJc w:val="left"/>
+      <w:pPr>
+        <w:tabs>
+          <w:tab w:val="num" w:pos="720"/>
+        </w:tabs>
+        <w:ind w:left="720" w:hanging="360"/>
+      </w:pPr>
+      <w:rPr>
+        <w:rFonts w:ascii="Symbol" w:hAnsi="Symbol" w:hint="default"/>
+        <w:sz w:val="20"/>
+      </w:rPr>
+    </w:lvl>
+    <w:lvl w:ilvl="1" w:tentative="1">
+      <w:start w:val="1"/>
+      <w:numFmt w:val="bullet"/>
+      <w:lvlText w:val="o"/>
+      <w:lvlJc w:val="left"/>
+      <w:pPr>
+        <w:tabs>
+          <w:tab w:val="num" w:pos="1440"/>
+        </w:tabs>
+        <w:ind w:left="1440" w:hanging="360"/>
+      </w:pPr>
+      <w:rPr>
+        <w:rFonts w:ascii="Courier New" w:hAnsi="Courier New" w:hint="default"/>
+        <w:sz w:val="20"/>
+      </w:rPr>
+    </w:lvl>
+    <w:lvl w:ilvl="2" w:tentative="1">
+      <w:start w:val="1"/>
+      <w:numFmt w:val="bullet"/>
+      <w:lvlText w:val=""/>
+      <w:lvlJc w:val="left"/>
+      <w:pPr>
+        <w:tabs>
+          <w:tab w:val="num" w:pos="2160"/>
+        </w:tabs>
+        <w:ind w:left="2160" w:hanging="360"/>
+      </w:pPr>
+      <w:rPr>
+        <w:rFonts w:ascii="Wingdings" w:hAnsi="Wingdings" w:hint="default"/>
+        <w:sz w:val="20"/>
+      </w:rPr>
+    </w:lvl>
+    <w:lvl w:ilvl="3" w:tentative="1">
+      <w:start w:val="1"/>
+      <w:numFmt w:val="bullet"/>
+      <w:lvlText w:val=""/>
+      <w:lvlJc w:val="left"/>
+      <w:pPr>
+        <w:tabs>
+          <w:tab w:val="num" w:pos="2880"/>
+        </w:tabs>
+        <w:ind w:left="2880" w:hanging="360"/>
+      </w:pPr>
+      <w:rPr>
+        <w:rFonts w:ascii="Wingdings" w:hAnsi="Wingdings" w:hint="default"/>
+        <w:sz w:val="20"/>
+      </w:rPr>
+    </w:lvl>
+    <w:lvl w:ilvl="4" w:tentative="1">
+      <w:start w:val="1"/>
+      <w:numFmt w:val="bullet"/>
+      <w:lvlText w:val=""/>
+      <w:lvlJc w:val="left"/>
+      <w:pPr>
+        <w:tabs>
+          <w:tab w:val="num" w:pos="3600"/>
+        </w:tabs>
+        <w:ind w:left="3600" w:hanging="360"/>
+      </w:pPr>
+      <w:rPr>
+        <w:rFonts w:ascii="Wingdings" w:hAnsi="Wingdings" w:hint="default"/>
+        <w:sz w:val="20"/>
+      </w:rPr>
+    </w:lvl>
+    <w:lvl w:ilvl="5" w:tentative="1">
+      <w:start w:val="1"/>
+      <w:numFmt w:val="bullet"/>
+      <w:lvlText w:val=""/>
+      <w:lvlJc w:val="left"/>
+      <w:pPr>
+        <w:tabs>
+          <w:tab w:val="num" w:pos="4320"/>
+        </w:tabs>
+        <w:ind w:left="4320" w:hanging="360"/>
+      </w:pPr>
+      <w:rPr>
+        <w:rFonts w:ascii="Wingdings" w:hAnsi="Wingdings" w:hint="default"/>
+        <w:sz w:val="20"/>
+      </w:rPr>
+    </w:lvl>
+    <w:lvl w:ilvl="6" w:tentative="1">
+      <w:start w:val="1"/>
+      <w:numFmt w:val="bullet"/>
+      <w:lvlText w:val=""/>
+      <w:lvlJc w:val="left"/>
+      <w:pPr>
+        <w:tabs>
+          <w:tab w:val="num" w:pos="5040"/>
+        </w:tabs>
+        <w:ind w:left="5040" w:hanging="360"/>
+      </w:pPr>
+      <w:rPr>
+        <w:rFonts w:ascii="Wingdings" w:hAnsi="Wingdings" w:hint="default"/>
+        <w:sz w:val="20"/>
+      </w:rPr>
+    </w:lvl>
+    <w:lvl w:ilvl="7" w:tentative="1">
+      <w:start w:val="1"/>
+      <w:numFmt w:val="bullet"/>
+      <w:lvlText w:val=""/>
+      <w:lvlJc w:val="left"/>
+      <w:pPr>
+        <w:tabs>
+          <w:tab w:val="num" w:pos="5760"/>
+        </w:tabs>
+        <w:ind w:left="5760" w:hanging="360"/>
+      </w:pPr>
+      <w:rPr>
+        <w:rFonts w:ascii="Wingdings" w:hAnsi="Wingdings" w:hint="default"/>
+        <w:sz w:val="20"/>
+      </w:rPr>
+    </w:lvl>
+    <w:lvl w:ilvl="8" w:tentative="1">
+      <w:start w:val="1"/>
+      <w:numFmt w:val="bullet"/>
+      <w:lvlText w:val=""/>
+      <w:lvlJc w:val="left"/>
+      <w:pPr>
+        <w:tabs>
+          <w:tab w:val="num" w:pos="6480"/>
+        </w:tabs>
+        <w:ind w:left="6480" w:hanging="360"/>
+      </w:pPr>
+      <w:rPr>
+        <w:rFonts w:ascii="Wingdings" w:hAnsi="Wingdings" w:hint="default"/>
+        <w:sz w:val="20"/>
+      </w:rPr>
+    </w:lvl>
+  </w:abstractNum>
+  <w:abstractNum w:abstractNumId="12" w15:restartNumberingAfterBreak="0">
     <w:nsid w:val="58CF3B57"/>
     <w:multiLevelType w:val="hybridMultilevel"/>
     <w:tmpl w:val="2CCAADB8"/>
@@ -3600,7 +4620,7 @@
       </w:rPr>
     </w:lvl>
   </w:abstractNum>
-  <w:abstractNum w:abstractNumId="10" w15:restartNumberingAfterBreak="0">
+  <w:abstractNum w:abstractNumId="13" w15:restartNumberingAfterBreak="0">
     <w:nsid w:val="5CFB6106"/>
     <w:multiLevelType w:val="multilevel"/>
     <w:tmpl w:val="D69E02FA"/>
@@ -3749,7 +4769,120 @@
       </w:rPr>
     </w:lvl>
   </w:abstractNum>
-  <w:abstractNum w:abstractNumId="11" w15:restartNumberingAfterBreak="0">
+  <w:abstractNum w:abstractNumId="14" w15:restartNumberingAfterBreak="0">
+    <w:nsid w:val="6FF71B3F"/>
+    <w:multiLevelType w:val="hybridMultilevel"/>
+    <w:tmpl w:val="7310A5C0"/>
+    <w:lvl w:ilvl="0" w:tplc="0409000F">
+      <w:start w:val="1"/>
+      <w:numFmt w:val="decimal"/>
+      <w:lvlText w:val="%1."/>
+      <w:lvlJc w:val="left"/>
+      <w:pPr>
+        <w:ind w:left="360" w:hanging="360"/>
+      </w:pPr>
+      <w:rPr>
+        <w:rFonts w:hint="default"/>
+      </w:rPr>
+    </w:lvl>
+    <w:lvl w:ilvl="1" w:tplc="04090003">
+      <w:start w:val="1"/>
+      <w:numFmt w:val="bullet"/>
+      <w:lvlText w:val="o"/>
+      <w:lvlJc w:val="left"/>
+      <w:pPr>
+        <w:ind w:left="1080" w:hanging="360"/>
+      </w:pPr>
+      <w:rPr>
+        <w:rFonts w:ascii="Courier New" w:hAnsi="Courier New" w:cs="Courier New" w:hint="default"/>
+      </w:rPr>
+    </w:lvl>
+    <w:lvl w:ilvl="2" w:tplc="04090005" w:tentative="1">
+      <w:start w:val="1"/>
+      <w:numFmt w:val="bullet"/>
+      <w:lvlText w:val=""/>
+      <w:lvlJc w:val="left"/>
+      <w:pPr>
+        <w:ind w:left="1800" w:hanging="360"/>
+      </w:pPr>
+      <w:rPr>
+        <w:rFonts w:ascii="Wingdings" w:hAnsi="Wingdings" w:hint="default"/>
+      </w:rPr>
+    </w:lvl>
+    <w:lvl w:ilvl="3" w:tplc="04090001" w:tentative="1">
+      <w:start w:val="1"/>
+      <w:numFmt w:val="bullet"/>
+      <w:lvlText w:val=""/>
+      <w:lvlJc w:val="left"/>
+      <w:pPr>
+        <w:ind w:left="2520" w:hanging="360"/>
+      </w:pPr>
+      <w:rPr>
+        <w:rFonts w:ascii="Symbol" w:hAnsi="Symbol" w:hint="default"/>
+      </w:rPr>
+    </w:lvl>
+    <w:lvl w:ilvl="4" w:tplc="04090003" w:tentative="1">
+      <w:start w:val="1"/>
+      <w:numFmt w:val="bullet"/>
+      <w:lvlText w:val="o"/>
+      <w:lvlJc w:val="left"/>
+      <w:pPr>
+        <w:ind w:left="3240" w:hanging="360"/>
+      </w:pPr>
+      <w:rPr>
+        <w:rFonts w:ascii="Courier New" w:hAnsi="Courier New" w:cs="Courier New" w:hint="default"/>
+      </w:rPr>
+    </w:lvl>
+    <w:lvl w:ilvl="5" w:tplc="04090005" w:tentative="1">
+      <w:start w:val="1"/>
+      <w:numFmt w:val="bullet"/>
+      <w:lvlText w:val=""/>
+      <w:lvlJc w:val="left"/>
+      <w:pPr>
+        <w:ind w:left="3960" w:hanging="360"/>
+      </w:pPr>
+      <w:rPr>
+        <w:rFonts w:ascii="Wingdings" w:hAnsi="Wingdings" w:hint="default"/>
+      </w:rPr>
+    </w:lvl>
+    <w:lvl w:ilvl="6" w:tplc="04090001" w:tentative="1">
+      <w:start w:val="1"/>
+      <w:numFmt w:val="bullet"/>
+      <w:lvlText w:val=""/>
+      <w:lvlJc w:val="left"/>
+      <w:pPr>
+        <w:ind w:left="4680" w:hanging="360"/>
+      </w:pPr>
+      <w:rPr>
+        <w:rFonts w:ascii="Symbol" w:hAnsi="Symbol" w:hint="default"/>
+      </w:rPr>
+    </w:lvl>
+    <w:lvl w:ilvl="7" w:tplc="04090003" w:tentative="1">
+      <w:start w:val="1"/>
+      <w:numFmt w:val="bullet"/>
+      <w:lvlText w:val="o"/>
+      <w:lvlJc w:val="left"/>
+      <w:pPr>
+        <w:ind w:left="5400" w:hanging="360"/>
+      </w:pPr>
+      <w:rPr>
+        <w:rFonts w:ascii="Courier New" w:hAnsi="Courier New" w:cs="Courier New" w:hint="default"/>
+      </w:rPr>
+    </w:lvl>
+    <w:lvl w:ilvl="8" w:tplc="04090005" w:tentative="1">
+      <w:start w:val="1"/>
+      <w:numFmt w:val="bullet"/>
+      <w:lvlText w:val=""/>
+      <w:lvlJc w:val="left"/>
+      <w:pPr>
+        <w:ind w:left="6120" w:hanging="360"/>
+      </w:pPr>
+      <w:rPr>
+        <w:rFonts w:ascii="Wingdings" w:hAnsi="Wingdings" w:hint="default"/>
+      </w:rPr>
+    </w:lvl>
+  </w:abstractNum>
+  <w:abstractNum w:abstractNumId="15" w15:restartNumberingAfterBreak="0">
     <w:nsid w:val="764757C2"/>
     <w:multiLevelType w:val="multilevel"/>
     <w:tmpl w:val="D2440BB2"/>
@@ -3862,7 +4995,7 @@
       </w:pPr>
     </w:lvl>
   </w:abstractNum>
-  <w:abstractNum w:abstractNumId="12" w15:restartNumberingAfterBreak="0">
+  <w:abstractNum w:abstractNumId="16" w15:restartNumberingAfterBreak="0">
     <w:nsid w:val="77D16D0C"/>
     <w:multiLevelType w:val="hybridMultilevel"/>
     <w:tmpl w:val="69185904"/>
@@ -3975,7 +5108,7 @@
       </w:rPr>
     </w:lvl>
   </w:abstractNum>
-  <w:abstractNum w:abstractNumId="13" w15:restartNumberingAfterBreak="0">
+  <w:abstractNum w:abstractNumId="17" w15:restartNumberingAfterBreak="0">
     <w:nsid w:val="7F262DF9"/>
     <w:multiLevelType w:val="multilevel"/>
     <w:tmpl w:val="B8C6FE0A"/>
@@ -4125,46 +5258,58 @@
     </w:lvl>
   </w:abstractNum>
   <w:num w:numId="1">
+    <w:abstractNumId w:val="12"/>
+  </w:num>
+  <w:num w:numId="2">
+    <w:abstractNumId w:val="17"/>
+  </w:num>
+  <w:num w:numId="3">
+    <w:abstractNumId w:val="3"/>
+  </w:num>
+  <w:num w:numId="4">
+    <w:abstractNumId w:val="5"/>
+  </w:num>
+  <w:num w:numId="5">
     <w:abstractNumId w:val="9"/>
   </w:num>
-  <w:num w:numId="2">
+  <w:num w:numId="6">
+    <w:abstractNumId w:val="7"/>
+  </w:num>
+  <w:num w:numId="7">
     <w:abstractNumId w:val="13"/>
   </w:num>
-  <w:num w:numId="3">
-    <w:abstractNumId w:val="1"/>
-  </w:num>
-  <w:num w:numId="4">
-    <w:abstractNumId w:val="3"/>
-  </w:num>
-  <w:num w:numId="5">
-    <w:abstractNumId w:val="7"/>
-  </w:num>
-  <w:num w:numId="6">
-    <w:abstractNumId w:val="5"/>
-  </w:num>
-  <w:num w:numId="7">
-    <w:abstractNumId w:val="10"/>
-  </w:num>
   <w:num w:numId="8">
-    <w:abstractNumId w:val="2"/>
+    <w:abstractNumId w:val="4"/>
   </w:num>
   <w:num w:numId="9">
-    <w:abstractNumId w:val="11"/>
+    <w:abstractNumId w:val="15"/>
   </w:num>
   <w:num w:numId="10">
-    <w:abstractNumId w:val="12"/>
+    <w:abstractNumId w:val="16"/>
   </w:num>
   <w:num w:numId="11">
+    <w:abstractNumId w:val="8"/>
+  </w:num>
+  <w:num w:numId="12">
     <w:abstractNumId w:val="6"/>
   </w:num>
-  <w:num w:numId="12">
-    <w:abstractNumId w:val="4"/>
-  </w:num>
   <w:num w:numId="13">
-    <w:abstractNumId w:val="8"/>
+    <w:abstractNumId w:val="10"/>
   </w:num>
   <w:num w:numId="14">
     <w:abstractNumId w:val="0"/>
+  </w:num>
+  <w:num w:numId="15">
+    <w:abstractNumId w:val="2"/>
+  </w:num>
+  <w:num w:numId="16">
+    <w:abstractNumId w:val="11"/>
+  </w:num>
+  <w:num w:numId="17">
+    <w:abstractNumId w:val="14"/>
+  </w:num>
+  <w:num w:numId="18">
+    <w:abstractNumId w:val="1"/>
   </w:num>
 </w:numbering>
 </file>
@@ -4562,7 +5707,7 @@
   <w:style w:type="paragraph" w:default="1" w:styleId="Normal">
     <w:name w:val="Normal"/>
     <w:qFormat/>
-    <w:rsid w:val="008B2F03"/>
+    <w:rsid w:val="00B47C6E"/>
   </w:style>
   <w:style w:type="paragraph" w:styleId="Ttulo3">
     <w:name w:val="heading 3"/>

</xml_diff>

<commit_message>
Acerto do texto Relação de Cômodos e TUEs para Relação de TUEs
</commit_message>
<xml_diff>
--- a/Documentação/Sistema de Cálculo da Elétrica Residencial.docx
+++ b/Documentação/Sistema de Cálculo da Elétrica Residencial.docx
@@ -2377,6 +2377,10 @@
         <w:jc w:val="center"/>
       </w:pPr>
       <w:r>
+        <w:rPr>
+          <w:noProof/>
+          <w:lang w:val="en-US"/>
+        </w:rPr>
         <w:drawing>
           <wp:inline distT="0" distB="0" distL="0" distR="0" wp14:anchorId="46032CB9" wp14:editId="475C3827">
             <wp:extent cx="1457184" cy="2524125"/>
@@ -2611,6 +2615,10 @@
         </w:rPr>
       </w:pPr>
       <w:r>
+        <w:rPr>
+          <w:noProof/>
+          <w:lang w:val="en-US"/>
+        </w:rPr>
         <w:drawing>
           <wp:inline distT="0" distB="0" distL="0" distR="0" wp14:anchorId="5D59D218" wp14:editId="59DDD150">
             <wp:extent cx="1497226" cy="2543175"/>
@@ -2704,6 +2712,10 @@
         <w:jc w:val="center"/>
       </w:pPr>
       <w:r>
+        <w:rPr>
+          <w:noProof/>
+          <w:lang w:val="en-US"/>
+        </w:rPr>
         <w:drawing>
           <wp:inline distT="0" distB="0" distL="0" distR="0" wp14:anchorId="798B512E" wp14:editId="197AD056">
             <wp:extent cx="1328920" cy="2238375"/>
@@ -2769,6 +2781,10 @@
         <w:jc w:val="center"/>
       </w:pPr>
       <w:r>
+        <w:rPr>
+          <w:noProof/>
+          <w:lang w:val="en-US"/>
+        </w:rPr>
         <w:drawing>
           <wp:inline distT="0" distB="0" distL="0" distR="0" wp14:anchorId="4128AA8F" wp14:editId="10988791">
             <wp:extent cx="1333594" cy="2257425"/>
@@ -2844,6 +2860,10 @@
         <w:jc w:val="center"/>
       </w:pPr>
       <w:r>
+        <w:rPr>
+          <w:noProof/>
+          <w:lang w:val="en-US"/>
+        </w:rPr>
         <w:drawing>
           <wp:inline distT="0" distB="0" distL="0" distR="0" wp14:anchorId="4BA81A7D" wp14:editId="0F04069B">
             <wp:extent cx="1400175" cy="2356962"/>
@@ -2913,6 +2933,10 @@
         <w:jc w:val="center"/>
       </w:pPr>
       <w:r>
+        <w:rPr>
+          <w:noProof/>
+          <w:lang w:val="en-US"/>
+        </w:rPr>
         <w:drawing>
           <wp:inline distT="0" distB="0" distL="0" distR="0" wp14:anchorId="7863969D" wp14:editId="5A8D18BC">
             <wp:extent cx="1410557" cy="2390775"/>
@@ -2949,8 +2973,2944 @@
           </wp:inline>
         </w:drawing>
       </w:r>
+    </w:p>
+    <w:p>
+      <w:pPr>
+        <w:pStyle w:val="PargrafodaLista"/>
+        <w:ind w:left="1068"/>
+        <w:jc w:val="center"/>
+      </w:pPr>
+    </w:p>
+    <w:p>
+      <w:pPr>
+        <w:pStyle w:val="PargrafodaLista"/>
+        <w:ind w:left="1068"/>
+        <w:jc w:val="center"/>
+        <w:rPr>
+          <w:b/>
+          <w:sz w:val="32"/>
+          <w:szCs w:val="32"/>
+        </w:rPr>
+      </w:pPr>
+      <w:r>
+        <w:rPr>
+          <w:b/>
+          <w:sz w:val="32"/>
+          <w:szCs w:val="32"/>
+        </w:rPr>
+        <w:t>Exemplo de um dimensionamento com muitos cômodos e aparelhos.</w:t>
+      </w:r>
+    </w:p>
+    <w:p>
+      <w:pPr>
+        <w:pStyle w:val="PargrafodaLista"/>
+        <w:ind w:left="1068"/>
+        <w:jc w:val="both"/>
+      </w:pPr>
+    </w:p>
+    <w:p>
+      <w:pPr>
+        <w:pStyle w:val="PargrafodaLista"/>
+        <w:ind w:left="1068"/>
+        <w:jc w:val="both"/>
+      </w:pPr>
+      <w:r>
+        <w:t xml:space="preserve">Disjuntor que vem do QDC do prédio 70A e cabo de 16 mm </w:t>
+      </w:r>
+    </w:p>
+    <w:p>
+      <w:pPr>
+        <w:pStyle w:val="PargrafodaLista"/>
+        <w:ind w:left="1068"/>
+        <w:jc w:val="both"/>
+      </w:pPr>
+      <w:r>
+        <w:t xml:space="preserve">Estou usando somente o 220V, todos os disjuntores são bifásicos, inclusive o DR é bifásico de 63A e os 3 </w:t>
+      </w:r>
+      <w:proofErr w:type="spellStart"/>
+      <w:r>
+        <w:t>DPSs</w:t>
+      </w:r>
+      <w:proofErr w:type="spellEnd"/>
+      <w:r>
+        <w:t xml:space="preserve"> são de 275:</w:t>
+      </w:r>
+    </w:p>
+    <w:p>
+      <w:pPr>
+        <w:pStyle w:val="PargrafodaLista"/>
+        <w:ind w:left="1068"/>
+        <w:jc w:val="both"/>
+      </w:pPr>
+    </w:p>
+    <w:p>
+      <w:pPr>
+        <w:pStyle w:val="PargrafodaLista"/>
+        <w:ind w:left="1068"/>
+        <w:jc w:val="both"/>
+      </w:pPr>
+      <w:r>
+        <w:t>Essa combinação de disjuntores está excelente e muito bem projetada.</w:t>
+      </w:r>
+    </w:p>
+    <w:p>
+      <w:pPr>
+        <w:pStyle w:val="PargrafodaLista"/>
+        <w:ind w:left="1068"/>
+        <w:jc w:val="both"/>
+      </w:pPr>
+    </w:p>
+    <w:p>
+      <w:pPr>
+        <w:pStyle w:val="PargrafodaLista"/>
+        <w:ind w:left="1068"/>
+        <w:jc w:val="both"/>
+      </w:pPr>
+      <w:r>
+        <w:t>O disjuntor de 63A no apartamento vai cair primeiro (por segurança) se houver uma sobrecarga interna, evitando que você precise descer até o padrão do prédio para religar a chave de 70A. Além disso, o cabo de 16 mm² está muito bem protegido por eles.</w:t>
+      </w:r>
+    </w:p>
+    <w:p>
+      <w:pPr>
+        <w:pStyle w:val="PargrafodaLista"/>
+        <w:ind w:left="1068"/>
+        <w:jc w:val="both"/>
+      </w:pPr>
+      <w:r>
+        <w:t>Iremos f</w:t>
+      </w:r>
+      <w:r>
+        <w:t>azer uma l</w:t>
+      </w:r>
+      <w:r>
+        <w:t>ista completa de cômodos e equipamentos</w:t>
+      </w:r>
+      <w:r>
+        <w:t xml:space="preserve"> para calcular a carga total de um </w:t>
+      </w:r>
+      <w:r>
+        <w:t>apartamento</w:t>
+      </w:r>
+      <w:r>
+        <w:t xml:space="preserve"> e verificar</w:t>
+      </w:r>
+      <w:r>
+        <w:t>:</w:t>
+      </w:r>
+      <w:r>
+        <w:t xml:space="preserve"> </w:t>
+      </w:r>
+    </w:p>
+    <w:p>
+      <w:pPr>
+        <w:pStyle w:val="PargrafodaLista"/>
+        <w:numPr>
+          <w:ilvl w:val="1"/>
+          <w:numId w:val="18"/>
+        </w:numPr>
+        <w:jc w:val="both"/>
+      </w:pPr>
+      <w:r>
+        <w:t>Se a soma de tudo o que você tem corre o risco de desarmar o disjuntor de 63A.</w:t>
+      </w:r>
+      <w:r>
+        <w:t xml:space="preserve"> </w:t>
+      </w:r>
+    </w:p>
+    <w:p>
+      <w:pPr>
+        <w:pStyle w:val="PargrafodaLista"/>
+        <w:numPr>
+          <w:ilvl w:val="1"/>
+          <w:numId w:val="18"/>
+        </w:numPr>
+        <w:jc w:val="both"/>
+      </w:pPr>
+      <w:r>
+        <w:t>Quais equipamentos podem funcionar juntos ao mesmo tempo com total segurança.</w:t>
+      </w:r>
+      <w:r>
+        <w:t xml:space="preserve"> </w:t>
+      </w:r>
+    </w:p>
+    <w:p>
+      <w:pPr>
+        <w:pStyle w:val="PargrafodaLista"/>
+        <w:numPr>
+          <w:ilvl w:val="1"/>
+          <w:numId w:val="18"/>
+        </w:numPr>
+        <w:jc w:val="both"/>
+      </w:pPr>
+      <w:r>
+        <w:t>Se haverá necessidade de pedir aumento de carga para a concessionária de energia.</w:t>
+      </w:r>
+      <w:r>
+        <w:t xml:space="preserve"> </w:t>
+      </w:r>
+      <w:r>
+        <w:t xml:space="preserve">Pode listar os principais vilões de consumo (chuveiros, ar-condicionado, </w:t>
+      </w:r>
+      <w:proofErr w:type="spellStart"/>
+      <w:r>
+        <w:t>cooktop</w:t>
+      </w:r>
+      <w:proofErr w:type="spellEnd"/>
+      <w:r>
+        <w:t xml:space="preserve">, forno, lava e seca) e a quantidade de quartos/banheiros. </w:t>
+      </w:r>
+    </w:p>
+    <w:p>
+      <w:pPr>
+        <w:ind w:left="1080"/>
+        <w:jc w:val="both"/>
+      </w:pPr>
+      <w:r>
+        <w:t>Abaixo a lista completa de uma simulação grande de cômodos e aparelhos em um apartamento padrão:</w:t>
+      </w:r>
+    </w:p>
+    <w:p>
+      <w:pPr>
+        <w:pStyle w:val="PargrafodaLista"/>
+        <w:numPr>
+          <w:ilvl w:val="1"/>
+          <w:numId w:val="11"/>
+        </w:numPr>
+        <w:jc w:val="both"/>
+      </w:pPr>
+      <w:r>
+        <w:t>C</w:t>
+      </w:r>
+      <w:r>
+        <w:t>orredor de entrada de 2,5 X1,5 e uma luminária;</w:t>
+      </w:r>
+    </w:p>
+    <w:p>
+      <w:pPr>
+        <w:pStyle w:val="PargrafodaLista"/>
+        <w:numPr>
+          <w:ilvl w:val="1"/>
+          <w:numId w:val="11"/>
+        </w:numPr>
+        <w:jc w:val="both"/>
+      </w:pPr>
+      <w:r>
+        <w:lastRenderedPageBreak/>
+        <w:t xml:space="preserve">Cozinha com 4 X 3 tem geladeira, </w:t>
+      </w:r>
+      <w:proofErr w:type="spellStart"/>
+      <w:r>
+        <w:t>air</w:t>
+      </w:r>
+      <w:proofErr w:type="spellEnd"/>
+      <w:r>
+        <w:t xml:space="preserve"> </w:t>
+      </w:r>
+      <w:proofErr w:type="spellStart"/>
+      <w:r>
+        <w:t>fryer</w:t>
+      </w:r>
+      <w:proofErr w:type="spellEnd"/>
+      <w:r>
+        <w:t xml:space="preserve">, fogão </w:t>
+      </w:r>
+      <w:r>
+        <w:t>Electrolux</w:t>
+      </w:r>
+      <w:r>
+        <w:t xml:space="preserve"> 4 bocas com forno elétrico e outro a gás, micro ondas </w:t>
+      </w:r>
+      <w:r>
+        <w:t>Brastemp</w:t>
+      </w:r>
+      <w:r>
+        <w:t xml:space="preserve"> </w:t>
+      </w:r>
+      <w:proofErr w:type="spellStart"/>
+      <w:r>
+        <w:t>atibe</w:t>
+      </w:r>
+      <w:proofErr w:type="spellEnd"/>
+      <w:r>
+        <w:t xml:space="preserve">, lava louça </w:t>
+      </w:r>
+      <w:r>
+        <w:t>Electrolux</w:t>
+      </w:r>
+      <w:r>
+        <w:t xml:space="preserve"> 6 serviços, depurador de ar </w:t>
+      </w:r>
+      <w:proofErr w:type="gramStart"/>
+      <w:r>
+        <w:t>Electrolux</w:t>
+      </w:r>
+      <w:r>
+        <w:t xml:space="preserve"> ,</w:t>
+      </w:r>
+      <w:proofErr w:type="gramEnd"/>
+      <w:r>
+        <w:t xml:space="preserve"> 9 tomadas, uma luminária e uma </w:t>
+      </w:r>
+      <w:proofErr w:type="spellStart"/>
+      <w:r>
+        <w:t>tv</w:t>
+      </w:r>
+      <w:proofErr w:type="spellEnd"/>
+      <w:r>
+        <w:t xml:space="preserve"> </w:t>
+      </w:r>
+      <w:proofErr w:type="spellStart"/>
+      <w:r>
+        <w:t>led</w:t>
+      </w:r>
+      <w:proofErr w:type="spellEnd"/>
+      <w:r>
+        <w:t xml:space="preserve"> </w:t>
+      </w:r>
+      <w:proofErr w:type="spellStart"/>
+      <w:r>
+        <w:t>lg</w:t>
+      </w:r>
+      <w:proofErr w:type="spellEnd"/>
+      <w:r>
+        <w:t xml:space="preserve"> 32 </w:t>
+      </w:r>
+      <w:proofErr w:type="spellStart"/>
+      <w:r>
+        <w:t>pol</w:t>
+      </w:r>
+      <w:proofErr w:type="spellEnd"/>
+      <w:r>
+        <w:t xml:space="preserve">; </w:t>
+      </w:r>
+    </w:p>
+    <w:p>
+      <w:pPr>
+        <w:pStyle w:val="PargrafodaLista"/>
+        <w:numPr>
+          <w:ilvl w:val="1"/>
+          <w:numId w:val="11"/>
+        </w:numPr>
+        <w:jc w:val="both"/>
+      </w:pPr>
+      <w:r>
+        <w:t xml:space="preserve">Área de serviço 3 </w:t>
+      </w:r>
+      <w:proofErr w:type="gramStart"/>
+      <w:r>
+        <w:t>X</w:t>
+      </w:r>
+      <w:proofErr w:type="gramEnd"/>
+      <w:r>
+        <w:t xml:space="preserve"> 3 com uma </w:t>
+      </w:r>
+      <w:proofErr w:type="spellStart"/>
+      <w:r>
+        <w:t>mq</w:t>
+      </w:r>
+      <w:proofErr w:type="spellEnd"/>
+      <w:r>
+        <w:t xml:space="preserve"> lava/seca roupa </w:t>
+      </w:r>
+      <w:r>
+        <w:t>Samsung</w:t>
+      </w:r>
+      <w:r>
+        <w:t>, 4 tomadas e uma luminária;</w:t>
+      </w:r>
+    </w:p>
+    <w:p>
+      <w:pPr>
+        <w:pStyle w:val="PargrafodaLista"/>
+        <w:numPr>
+          <w:ilvl w:val="1"/>
+          <w:numId w:val="11"/>
+        </w:numPr>
+        <w:jc w:val="both"/>
+      </w:pPr>
+      <w:r>
+        <w:t xml:space="preserve">Dispensa 1,5 </w:t>
+      </w:r>
+      <w:proofErr w:type="gramStart"/>
+      <w:r>
+        <w:t>X</w:t>
+      </w:r>
+      <w:proofErr w:type="gramEnd"/>
+      <w:r>
+        <w:t xml:space="preserve"> 2 com uma tomada e uma luminária;</w:t>
+      </w:r>
+    </w:p>
+    <w:p>
+      <w:pPr>
+        <w:pStyle w:val="PargrafodaLista"/>
+        <w:numPr>
+          <w:ilvl w:val="1"/>
+          <w:numId w:val="11"/>
+        </w:numPr>
+        <w:jc w:val="both"/>
+      </w:pPr>
+      <w:r>
+        <w:t xml:space="preserve">Sala de jantar 4 </w:t>
+      </w:r>
+      <w:proofErr w:type="gramStart"/>
+      <w:r>
+        <w:t>X</w:t>
+      </w:r>
+      <w:proofErr w:type="gramEnd"/>
+      <w:r>
+        <w:t xml:space="preserve"> 3 com 4 tomadas e uma luminária;</w:t>
+      </w:r>
+    </w:p>
+    <w:p>
+      <w:pPr>
+        <w:pStyle w:val="PargrafodaLista"/>
+        <w:numPr>
+          <w:ilvl w:val="1"/>
+          <w:numId w:val="11"/>
+        </w:numPr>
+        <w:jc w:val="both"/>
+      </w:pPr>
+      <w:r>
+        <w:t xml:space="preserve">Sala de estar com 1 TV LG ALED de 65 </w:t>
+      </w:r>
+      <w:proofErr w:type="spellStart"/>
+      <w:r>
+        <w:t>pol</w:t>
+      </w:r>
+      <w:proofErr w:type="spellEnd"/>
+      <w:r>
+        <w:t xml:space="preserve">, 10 tomadas, 1 luminária, um ar condicionado de 30.000 </w:t>
+      </w:r>
+      <w:proofErr w:type="spellStart"/>
+      <w:r>
+        <w:t>btus</w:t>
+      </w:r>
+      <w:proofErr w:type="spellEnd"/>
+      <w:r>
+        <w:t xml:space="preserve"> Elgin;</w:t>
+      </w:r>
+    </w:p>
+    <w:p>
+      <w:pPr>
+        <w:pStyle w:val="PargrafodaLista"/>
+        <w:numPr>
+          <w:ilvl w:val="1"/>
+          <w:numId w:val="11"/>
+        </w:numPr>
+        <w:jc w:val="both"/>
+      </w:pPr>
+      <w:r>
+        <w:t>Um corredor central de 2,5 X1,5 e uma luminária;</w:t>
+      </w:r>
+    </w:p>
+    <w:p>
+      <w:pPr>
+        <w:pStyle w:val="PargrafodaLista"/>
+        <w:numPr>
+          <w:ilvl w:val="1"/>
+          <w:numId w:val="11"/>
+        </w:numPr>
+        <w:jc w:val="both"/>
+      </w:pPr>
+      <w:r>
+        <w:t xml:space="preserve">Quarto suíte com 4 </w:t>
+      </w:r>
+      <w:proofErr w:type="gramStart"/>
+      <w:r>
+        <w:t>X</w:t>
+      </w:r>
+      <w:proofErr w:type="gramEnd"/>
+      <w:r>
+        <w:t xml:space="preserve"> 3 com uma TV LED LG de 50 </w:t>
+      </w:r>
+      <w:proofErr w:type="spellStart"/>
+      <w:r>
+        <w:t>pol</w:t>
+      </w:r>
+      <w:proofErr w:type="spellEnd"/>
+      <w:r>
+        <w:t xml:space="preserve">, 10 tomadas e uma luminária, 2 abajures e um ar condicionado </w:t>
+      </w:r>
+      <w:proofErr w:type="spellStart"/>
+      <w:r>
+        <w:t>midea</w:t>
+      </w:r>
+      <w:proofErr w:type="spellEnd"/>
+      <w:r>
+        <w:t xml:space="preserve"> de 12.000 </w:t>
+      </w:r>
+      <w:proofErr w:type="spellStart"/>
+      <w:r>
+        <w:t>btus</w:t>
+      </w:r>
+      <w:proofErr w:type="spellEnd"/>
+      <w:r>
+        <w:t>;</w:t>
+      </w:r>
+    </w:p>
+    <w:p>
+      <w:pPr>
+        <w:pStyle w:val="PargrafodaLista"/>
+        <w:numPr>
+          <w:ilvl w:val="1"/>
+          <w:numId w:val="11"/>
+        </w:numPr>
+        <w:jc w:val="both"/>
+      </w:pPr>
+      <w:r>
+        <w:t xml:space="preserve">Banheiro Suíte de 2,5 </w:t>
+      </w:r>
+      <w:proofErr w:type="gramStart"/>
+      <w:r>
+        <w:t>X</w:t>
+      </w:r>
+      <w:proofErr w:type="gramEnd"/>
+      <w:r>
+        <w:t xml:space="preserve"> 1,75 com chuveiro de 5800W, 4 tomadas, uma luminária e uma arandela;</w:t>
+      </w:r>
+    </w:p>
+    <w:p>
+      <w:pPr>
+        <w:pStyle w:val="PargrafodaLista"/>
+        <w:numPr>
+          <w:ilvl w:val="1"/>
+          <w:numId w:val="11"/>
+        </w:numPr>
+        <w:jc w:val="both"/>
+      </w:pPr>
+      <w:r>
+        <w:t xml:space="preserve">Banheiro Social de 2,5 </w:t>
+      </w:r>
+      <w:proofErr w:type="gramStart"/>
+      <w:r>
+        <w:t>X</w:t>
+      </w:r>
+      <w:proofErr w:type="gramEnd"/>
+      <w:r>
+        <w:t xml:space="preserve"> 1,75 com chuveiro de 5800W, 4 tomadas, uma luminária e uma arandela;</w:t>
+      </w:r>
+    </w:p>
+    <w:p>
+      <w:pPr>
+        <w:pStyle w:val="PargrafodaLista"/>
+        <w:numPr>
+          <w:ilvl w:val="1"/>
+          <w:numId w:val="11"/>
+        </w:numPr>
+        <w:jc w:val="both"/>
+      </w:pPr>
+      <w:r>
+        <w:t xml:space="preserve">Escritório com 3 </w:t>
+      </w:r>
+      <w:proofErr w:type="gramStart"/>
+      <w:r>
+        <w:t>X</w:t>
+      </w:r>
+      <w:proofErr w:type="gramEnd"/>
+      <w:r>
+        <w:t xml:space="preserve"> 3 com uma TV LED LG 50 </w:t>
+      </w:r>
+      <w:proofErr w:type="spellStart"/>
+      <w:r>
+        <w:t>pol</w:t>
+      </w:r>
+      <w:proofErr w:type="spellEnd"/>
+      <w:r>
+        <w:t xml:space="preserve">, uma ar condicionado </w:t>
+      </w:r>
+      <w:proofErr w:type="spellStart"/>
+      <w:r>
+        <w:t>mídea</w:t>
+      </w:r>
+      <w:proofErr w:type="spellEnd"/>
+      <w:r>
+        <w:t xml:space="preserve"> de 9000 </w:t>
+      </w:r>
+      <w:proofErr w:type="spellStart"/>
+      <w:r>
+        <w:t>btus</w:t>
+      </w:r>
+      <w:proofErr w:type="spellEnd"/>
+      <w:r>
+        <w:t>, 14 tomadas, uma luminária e 2 notebooks.</w:t>
+      </w:r>
+    </w:p>
+    <w:p>
+      <w:pPr>
+        <w:pStyle w:val="PargrafodaLista"/>
+        <w:ind w:left="1788"/>
+        <w:jc w:val="both"/>
+      </w:pPr>
+    </w:p>
+    <w:p>
+      <w:pPr>
+        <w:pStyle w:val="PargrafodaLista"/>
+        <w:ind w:left="1068"/>
+        <w:jc w:val="both"/>
+      </w:pPr>
+      <w:r>
+        <w:t>A c</w:t>
+      </w:r>
+      <w:r>
+        <w:t xml:space="preserve">onfiguração elétrica está muito bem protegida e estruturada. </w:t>
+      </w:r>
+    </w:p>
+    <w:p>
+      <w:pPr>
+        <w:pStyle w:val="PargrafodaLista"/>
+        <w:ind w:left="1068"/>
+        <w:jc w:val="both"/>
+      </w:pPr>
+      <w:r>
+        <w:t>O uso exclusivo de circuitos bifásicos de 220V é excelente, pois reduz as correntes pela metade em comparação ao 127V, diminuindo perdas e o aquecimento da fiação. A escolha dos DPS de 275V e do IDR de 63A está correta e atende às normas técnicas (NBR 5410).</w:t>
+      </w:r>
+      <w:r>
+        <w:t xml:space="preserve"> Até aqui tudo bem, mas vamos continuar.</w:t>
+      </w:r>
+    </w:p>
+    <w:p>
+      <w:pPr>
+        <w:pStyle w:val="PargrafodaLista"/>
+        <w:ind w:left="1068"/>
+        <w:jc w:val="both"/>
+      </w:pPr>
+    </w:p>
+    <w:p>
+      <w:pPr>
+        <w:pStyle w:val="PargrafodaLista"/>
+        <w:ind w:left="1068"/>
+        <w:jc w:val="both"/>
+        <w:rPr>
+          <w:b/>
+        </w:rPr>
+      </w:pPr>
+      <w:r>
+        <w:rPr>
+          <w:b/>
+        </w:rPr>
+        <w:t>C</w:t>
+      </w:r>
+      <w:r>
+        <w:rPr>
+          <w:b/>
+        </w:rPr>
+        <w:t xml:space="preserve">álculo da Demanda Estimada do apartamento. </w:t>
+      </w:r>
+    </w:p>
+    <w:p>
+      <w:pPr>
+        <w:pStyle w:val="PargrafodaLista"/>
+        <w:ind w:left="1068"/>
+        <w:jc w:val="both"/>
+      </w:pPr>
+      <w:r>
+        <w:t>Em instalações residenciais, aplicamos um "Fator de Demanda", pois a engenharia sabe que você nunca ligará absolutamente tudo (todas as tomadas, luzes e eletrodomésticos) no mesmo segundo.</w:t>
+      </w:r>
+    </w:p>
+    <w:p>
+      <w:pPr>
+        <w:pStyle w:val="PargrafodaLista"/>
+        <w:ind w:left="1068"/>
+        <w:jc w:val="both"/>
+        <w:rPr>
+          <w:b/>
+        </w:rPr>
+      </w:pPr>
+      <w:r>
+        <w:rPr>
+          <w:rFonts w:ascii="Segoe UI Symbol" w:hAnsi="Segoe UI Symbol" w:cs="Segoe UI Symbol"/>
+          <w:b/>
+        </w:rPr>
+        <w:t>📊</w:t>
+      </w:r>
+      <w:r>
+        <w:rPr>
+          <w:b/>
+        </w:rPr>
+        <w:t xml:space="preserve"> Análise da Carga Total </w:t>
+      </w:r>
+      <w:proofErr w:type="gramStart"/>
+      <w:r>
+        <w:rPr>
+          <w:b/>
+        </w:rPr>
+        <w:t>x</w:t>
+      </w:r>
+      <w:proofErr w:type="gramEnd"/>
+      <w:r>
+        <w:rPr>
+          <w:b/>
+        </w:rPr>
+        <w:t xml:space="preserve"> Capacidade do seu </w:t>
+      </w:r>
+      <w:proofErr w:type="spellStart"/>
+      <w:r>
+        <w:rPr>
+          <w:b/>
+        </w:rPr>
+        <w:t>DisjuntorCapacidade</w:t>
+      </w:r>
+      <w:proofErr w:type="spellEnd"/>
+    </w:p>
+    <w:p>
+      <w:pPr>
+        <w:pStyle w:val="PargrafodaLista"/>
+        <w:ind w:left="1068"/>
+        <w:jc w:val="both"/>
+      </w:pPr>
+      <w:r>
+        <w:t>Máxima do seu Disjuntor (63A em 220V): Suporta até 13.860 Watts (13,8 kW) de carga contínua simultânea.</w:t>
+      </w:r>
+      <w:r>
+        <w:t xml:space="preserve"> </w:t>
+      </w:r>
+    </w:p>
+    <w:p>
+      <w:pPr>
+        <w:pStyle w:val="PargrafodaLista"/>
+        <w:ind w:left="1068"/>
+        <w:jc w:val="both"/>
+      </w:pPr>
+      <w:r>
+        <w:t>Carga Total Instalada (Se ligasse 100% de tudo): Cerca de 32.000 Watts (32 kW).</w:t>
+      </w:r>
+    </w:p>
+    <w:p>
+      <w:pPr>
+        <w:pStyle w:val="PargrafodaLista"/>
+        <w:ind w:left="1068"/>
+        <w:jc w:val="both"/>
+      </w:pPr>
+      <w:r>
+        <w:t>Demanda Provável de Uso (Uso real simultâneo): Cerca de 11.500 Watts a 13.000 Watts.</w:t>
+      </w:r>
+    </w:p>
+    <w:p>
+      <w:pPr>
+        <w:pStyle w:val="PargrafodaLista"/>
+        <w:ind w:left="1068"/>
+        <w:jc w:val="both"/>
+      </w:pPr>
+      <w:r>
+        <w:t>Conclusão: O seu disjuntor de 63A e os cabos de 16 mm² são suficientes, mas você estará operando próximo ao limite seguro se houver um dia de uso muito intenso.</w:t>
+      </w:r>
+    </w:p>
+    <w:p>
+      <w:pPr>
+        <w:pStyle w:val="PargrafodaLista"/>
+        <w:ind w:left="1068"/>
+        <w:jc w:val="both"/>
+      </w:pPr>
+      <w:r>
+        <w:rPr>
+          <w:rFonts w:ascii="Segoe UI Symbol" w:hAnsi="Segoe UI Symbol" w:cs="Segoe UI Symbol"/>
+          <w:b/>
+        </w:rPr>
+        <w:t>🚦</w:t>
+      </w:r>
+      <w:r>
+        <w:rPr>
+          <w:b/>
+        </w:rPr>
+        <w:t xml:space="preserve"> Guia de Convivência dos Equipamentos (O que pode ligar junto?)</w:t>
+      </w:r>
+    </w:p>
+    <w:p>
+      <w:pPr>
+        <w:pStyle w:val="PargrafodaLista"/>
+        <w:ind w:left="1068"/>
+        <w:jc w:val="both"/>
+      </w:pPr>
+      <w:r>
+        <w:t>Para garantir que o disjuntor de 63A nunca desarme no meio do dia, gerencie o uso dos maiores vilões de energia:</w:t>
+      </w:r>
+    </w:p>
+    <w:p>
+      <w:pPr>
+        <w:pStyle w:val="PargrafodaLista"/>
+        <w:ind w:left="1068"/>
+        <w:jc w:val="both"/>
+        <w:rPr>
+          <w:b/>
+        </w:rPr>
+      </w:pPr>
+      <w:r>
+        <w:rPr>
+          <w:rFonts w:ascii="Segoe UI Symbol" w:hAnsi="Segoe UI Symbol" w:cs="Segoe UI Symbol"/>
+          <w:b/>
+        </w:rPr>
+        <w:lastRenderedPageBreak/>
+        <w:t>✅</w:t>
+      </w:r>
+      <w:r>
+        <w:rPr>
+          <w:b/>
+        </w:rPr>
+        <w:t xml:space="preserve"> Cenário 1: </w:t>
+      </w:r>
+    </w:p>
+    <w:p>
+      <w:pPr>
+        <w:pStyle w:val="PargrafodaLista"/>
+        <w:numPr>
+          <w:ilvl w:val="0"/>
+          <w:numId w:val="20"/>
+        </w:numPr>
+        <w:jc w:val="both"/>
+      </w:pPr>
+      <w:r>
+        <w:t>Totalmente Seguro (Dia a Dia)</w:t>
+      </w:r>
+      <w:r>
+        <w:t xml:space="preserve">. </w:t>
+      </w:r>
+      <w:r>
+        <w:t xml:space="preserve">Você pode ligar simultaneamente: </w:t>
+      </w:r>
+    </w:p>
+    <w:p>
+      <w:pPr>
+        <w:pStyle w:val="PargrafodaLista"/>
+        <w:ind w:left="1788"/>
+        <w:jc w:val="both"/>
+      </w:pPr>
+      <w:r>
+        <w:t xml:space="preserve">Os 3 aparelhos de ar-condicionado juntos (30k + 12k + 9k </w:t>
+      </w:r>
+      <w:proofErr w:type="spellStart"/>
+      <w:r>
+        <w:t>BTUs</w:t>
+      </w:r>
+      <w:proofErr w:type="spellEnd"/>
+      <w:r>
+        <w:t>).1 chuveiro (5800W).</w:t>
+      </w:r>
+      <w:r>
+        <w:t xml:space="preserve"> </w:t>
+      </w:r>
+      <w:r>
+        <w:t>Todos os eletrônicos (Geladeira, Lava e Seca, TVs, Notebooks e Luzes).</w:t>
+      </w:r>
+      <w:r>
+        <w:t xml:space="preserve"> </w:t>
+      </w:r>
+      <w:r>
+        <w:t>O disjuntor trabalhará folgado.</w:t>
+      </w:r>
+    </w:p>
+    <w:p>
+      <w:pPr>
+        <w:pStyle w:val="PargrafodaLista"/>
+        <w:ind w:left="1068"/>
+        <w:jc w:val="both"/>
+        <w:rPr>
+          <w:b/>
+        </w:rPr>
+      </w:pPr>
+      <w:r>
+        <w:rPr>
+          <w:rFonts w:ascii="Segoe UI Symbol" w:hAnsi="Segoe UI Symbol" w:cs="Segoe UI Symbol"/>
+          <w:b/>
+        </w:rPr>
+        <w:t>⚠</w:t>
+      </w:r>
+      <w:r>
+        <w:rPr>
+          <w:b/>
+        </w:rPr>
+        <w:t xml:space="preserve">️ Cenário 2: </w:t>
+      </w:r>
+    </w:p>
+    <w:p>
+      <w:pPr>
+        <w:pStyle w:val="PargrafodaLista"/>
+        <w:numPr>
+          <w:ilvl w:val="0"/>
+          <w:numId w:val="20"/>
+        </w:numPr>
+        <w:jc w:val="both"/>
+      </w:pPr>
+      <w:r>
+        <w:t>Limite Máximo (Atenção)</w:t>
+      </w:r>
+      <w:r>
+        <w:t xml:space="preserve">. </w:t>
+      </w:r>
+      <w:r>
+        <w:t>Se você ligar:</w:t>
+      </w:r>
+    </w:p>
+    <w:p>
+      <w:pPr>
+        <w:pStyle w:val="PargrafodaLista"/>
+        <w:ind w:left="1788"/>
+        <w:jc w:val="both"/>
+      </w:pPr>
+      <w:r>
+        <w:t xml:space="preserve">Os 2 chuveiros ao mesmo tempo (5800 ligados, os aparelhos de ar-condicionado devem ser desligados ou mantidos no mínimo, e você não deve usar a Air </w:t>
+      </w:r>
+      <w:proofErr w:type="spellStart"/>
+      <w:r>
+        <w:t>Fryer</w:t>
+      </w:r>
+      <w:proofErr w:type="spellEnd"/>
+      <w:r>
+        <w:t>, o forno elétrico ou o micro-ondas até que alguém saia do banho.</w:t>
+      </w:r>
+    </w:p>
+    <w:p>
+      <w:pPr>
+        <w:pStyle w:val="PargrafodaLista"/>
+        <w:ind w:left="1068"/>
+        <w:jc w:val="both"/>
+        <w:rPr>
+          <w:b/>
+        </w:rPr>
+      </w:pPr>
+      <w:r>
+        <w:rPr>
+          <w:rFonts w:ascii="Segoe UI Symbol" w:hAnsi="Segoe UI Symbol" w:cs="Segoe UI Symbol"/>
+          <w:b/>
+        </w:rPr>
+        <w:t>❌</w:t>
+      </w:r>
+      <w:r>
+        <w:rPr>
+          <w:b/>
+        </w:rPr>
+        <w:t xml:space="preserve"> Cenário 3: </w:t>
+      </w:r>
+    </w:p>
+    <w:p>
+      <w:pPr>
+        <w:pStyle w:val="PargrafodaLista"/>
+        <w:numPr>
+          <w:ilvl w:val="0"/>
+          <w:numId w:val="20"/>
+        </w:numPr>
+        <w:jc w:val="both"/>
+      </w:pPr>
+      <w:r>
+        <w:t>Risco de Queda do Disjuntor</w:t>
+      </w:r>
+      <w:r>
+        <w:t xml:space="preserve">. </w:t>
+      </w:r>
+      <w:r>
+        <w:t>O disjuntor geral de 63A irá desarmar se coincidir:</w:t>
+      </w:r>
+      <w:r>
+        <w:t xml:space="preserve"> </w:t>
+      </w:r>
+    </w:p>
+    <w:p>
+      <w:pPr>
+        <w:pStyle w:val="PargrafodaLista"/>
+        <w:ind w:left="1788"/>
+        <w:jc w:val="both"/>
+      </w:pPr>
+      <w:r>
+        <w:t xml:space="preserve">2 chuveiros ligados </w:t>
+      </w:r>
+      <w:proofErr w:type="gramStart"/>
+      <w:r>
+        <w:t>+</w:t>
+      </w:r>
+      <w:proofErr w:type="gramEnd"/>
+      <w:r>
+        <w:t xml:space="preserve"> Ar Condicionado de 30.000 </w:t>
+      </w:r>
+      <w:proofErr w:type="spellStart"/>
+      <w:r>
+        <w:t>BTUs</w:t>
+      </w:r>
+      <w:proofErr w:type="spellEnd"/>
+      <w:r>
+        <w:t xml:space="preserve"> + Forno Elétrico ou Air </w:t>
+      </w:r>
+      <w:proofErr w:type="spellStart"/>
+      <w:r>
+        <w:t>Fryer</w:t>
+      </w:r>
+      <w:proofErr w:type="spellEnd"/>
+      <w:r>
+        <w:t>.</w:t>
+      </w:r>
+    </w:p>
+    <w:p>
+      <w:pPr>
+        <w:pStyle w:val="PargrafodaLista"/>
+        <w:ind w:left="1788"/>
+        <w:jc w:val="both"/>
+        <w:rPr>
+          <w:rFonts w:ascii="Segoe UI Symbol" w:hAnsi="Segoe UI Symbol" w:cs="Segoe UI Symbol"/>
+        </w:rPr>
+      </w:pPr>
+    </w:p>
+    <w:p>
+      <w:pPr>
+        <w:pStyle w:val="PargrafodaLista"/>
+        <w:ind w:left="1068"/>
+        <w:jc w:val="both"/>
+        <w:rPr>
+          <w:rFonts w:ascii="Segoe UI Symbol" w:hAnsi="Segoe UI Symbol" w:cs="Segoe UI Symbol"/>
+          <w:b/>
+        </w:rPr>
+      </w:pPr>
+      <w:r>
+        <w:rPr>
+          <w:rFonts w:ascii="Segoe UI Symbol" w:hAnsi="Segoe UI Symbol" w:cs="Segoe UI Symbol"/>
+          <w:b/>
+        </w:rPr>
+        <w:t>🛠</w:t>
+      </w:r>
+      <w:proofErr w:type="gramStart"/>
+      <w:r>
+        <w:rPr>
+          <w:rFonts w:ascii="Segoe UI Symbol" w:hAnsi="Segoe UI Symbol" w:cs="Segoe UI Symbol"/>
+          <w:b/>
+        </w:rPr>
+        <w:t>️ Próximos</w:t>
+      </w:r>
+      <w:proofErr w:type="gramEnd"/>
+      <w:r>
+        <w:rPr>
+          <w:rFonts w:ascii="Segoe UI Symbol" w:hAnsi="Segoe UI Symbol" w:cs="Segoe UI Symbol"/>
+          <w:b/>
+        </w:rPr>
+        <w:t xml:space="preserve"> passos recomendados para o eletricista</w:t>
+      </w:r>
+      <w:r>
+        <w:rPr>
+          <w:rFonts w:ascii="Segoe UI Symbol" w:hAnsi="Segoe UI Symbol" w:cs="Segoe UI Symbol"/>
+          <w:b/>
+        </w:rPr>
+        <w:t>:</w:t>
+      </w:r>
+    </w:p>
+    <w:p>
+      <w:pPr>
+        <w:pStyle w:val="PargrafodaLista"/>
+        <w:ind w:left="1068"/>
+        <w:jc w:val="both"/>
+      </w:pPr>
+      <w:r>
+        <w:t>Para fechar o projeto com chave de ouro conferir três detalhes no quadro:</w:t>
+      </w:r>
+      <w:r>
+        <w:t xml:space="preserve"> </w:t>
+      </w:r>
+    </w:p>
+    <w:p>
+      <w:pPr>
+        <w:pStyle w:val="PargrafodaLista"/>
+        <w:numPr>
+          <w:ilvl w:val="0"/>
+          <w:numId w:val="20"/>
+        </w:numPr>
+        <w:jc w:val="both"/>
+      </w:pPr>
+      <w:r>
+        <w:rPr>
+          <w:b/>
+        </w:rPr>
+        <w:t>Balanceamento de Fases:</w:t>
+      </w:r>
+      <w:r>
+        <w:t xml:space="preserve"> Como todos os circuitos são bifásicos (Fase-Fase), o balanceamento é praticamente automático, mas garanta que os circuitos de maior potência (como os chuveiros e o ar de 30k) estejam distribuídos igualmente para não sobrecarregar uma única combinação de fases no barramento.</w:t>
+      </w:r>
+    </w:p>
+    <w:p>
+      <w:pPr>
+        <w:pStyle w:val="PargrafodaLista"/>
+        <w:numPr>
+          <w:ilvl w:val="0"/>
+          <w:numId w:val="20"/>
+        </w:numPr>
+        <w:jc w:val="both"/>
+      </w:pPr>
+      <w:r>
+        <w:rPr>
+          <w:b/>
+        </w:rPr>
+        <w:t>A fiação dos chuveiros:</w:t>
+      </w:r>
+      <w:r>
+        <w:t xml:space="preserve"> Certifique-se de que os cabos que saem do QDC para os chuveiros de 5800W (220V) sejam de, no mínimo, 4 mm² (com disjuntor bipolar de 32A).</w:t>
+      </w:r>
+    </w:p>
+    <w:p>
+      <w:pPr>
+        <w:pStyle w:val="PargrafodaLista"/>
+        <w:numPr>
+          <w:ilvl w:val="0"/>
+          <w:numId w:val="20"/>
+        </w:numPr>
+        <w:jc w:val="both"/>
+      </w:pPr>
+      <w:r>
+        <w:rPr>
+          <w:b/>
+        </w:rPr>
+        <w:t xml:space="preserve">A fiação do Ar de 30k </w:t>
+      </w:r>
+      <w:proofErr w:type="spellStart"/>
+      <w:r>
+        <w:rPr>
+          <w:b/>
+        </w:rPr>
+        <w:t>BTUs</w:t>
+      </w:r>
+      <w:proofErr w:type="spellEnd"/>
+      <w:r>
+        <w:rPr>
+          <w:b/>
+        </w:rPr>
+        <w:t xml:space="preserve"> e Cozinha:</w:t>
+      </w:r>
+      <w:r>
+        <w:t xml:space="preserve"> O ar-condicionado de 30.000 </w:t>
+      </w:r>
+      <w:proofErr w:type="spellStart"/>
+      <w:r>
+        <w:t>BTUs</w:t>
+      </w:r>
+      <w:proofErr w:type="spellEnd"/>
+      <w:r>
+        <w:t xml:space="preserve"> e o circuito das tomadas da cozinha (Air </w:t>
+      </w:r>
+      <w:proofErr w:type="spellStart"/>
+      <w:r>
+        <w:t>Fryer</w:t>
+      </w:r>
+      <w:proofErr w:type="spellEnd"/>
+      <w:r>
+        <w:t xml:space="preserve">/Forno) devem usar cabos de 4 mm². </w:t>
+      </w:r>
+    </w:p>
+    <w:p>
+      <w:pPr>
+        <w:pStyle w:val="PargrafodaLista"/>
+        <w:ind w:left="1068"/>
+        <w:jc w:val="both"/>
+      </w:pPr>
+      <w:r>
+        <w:t>Os demais ambientes podem usar 2,5 mm² para tomadas e 1,5 mm² para iluminação.</w:t>
+      </w:r>
+    </w:p>
+    <w:p>
+      <w:pPr>
+        <w:jc w:val="both"/>
+      </w:pPr>
+      <w:r>
+        <w:t>A i</w:t>
+      </w:r>
+      <w:r>
+        <w:t>n</w:t>
+      </w:r>
+      <w:r>
+        <w:t xml:space="preserve">stalação </w:t>
+      </w:r>
+      <w:r>
+        <w:t xml:space="preserve">está </w:t>
+      </w:r>
+      <w:r>
+        <w:t xml:space="preserve">extremamente bem dimensionada e protegida. Com o uso de </w:t>
+      </w:r>
+      <w:r>
+        <w:rPr>
+          <w:rStyle w:val="Forte"/>
+          <w:b w:val="0"/>
+        </w:rPr>
+        <w:t>220V em todos os circuitos</w:t>
+      </w:r>
+      <w:r>
+        <w:t>, você reduz a corrente</w:t>
+      </w:r>
+      <w:r>
+        <w:t xml:space="preserve"> elétrica pela metade, o que evita o aquecimento dos cabos e aumenta a vida útil dos equipamentos.</w:t>
+      </w:r>
+    </w:p>
+    <w:p>
+      <w:pPr>
+        <w:jc w:val="both"/>
+      </w:pPr>
+      <w:r>
+        <w:t>Abaixo está o mapeamento técnico detalhado para cada circuito, considerando as normas técnicas brasileiras (NBR 5410</w:t>
+      </w:r>
+      <w:r>
+        <w:t>.</w:t>
+      </w:r>
+    </w:p>
+    <w:p>
+      <w:pPr>
+        <w:rPr>
+          <w:b/>
+          <w:bCs/>
+          <w:sz w:val="30"/>
+          <w:szCs w:val="30"/>
+        </w:rPr>
+      </w:pPr>
+      <w:r>
+        <w:rPr>
+          <w:rFonts w:ascii="Segoe UI Symbol" w:hAnsi="Segoe UI Symbol" w:cs="Segoe UI Symbol"/>
+          <w:b/>
+          <w:bCs/>
+          <w:sz w:val="30"/>
+          <w:szCs w:val="30"/>
+        </w:rPr>
+        <w:t>⚡</w:t>
+      </w:r>
+      <w:r>
+        <w:rPr>
+          <w:b/>
+          <w:bCs/>
+          <w:sz w:val="30"/>
+          <w:szCs w:val="30"/>
+        </w:rPr>
+        <w:t xml:space="preserve"> Divisão de Circuitos e Dimensionamento</w:t>
+      </w:r>
+    </w:p>
+    <w:p>
+      <w:pPr>
+        <w:jc w:val="both"/>
+      </w:pPr>
+      <w:r>
+        <w:t xml:space="preserve">Como </w:t>
+      </w:r>
+      <w:r>
+        <w:t>é</w:t>
+      </w:r>
+      <w:r>
+        <w:t xml:space="preserve"> utiliza</w:t>
+      </w:r>
+      <w:r>
+        <w:t>do</w:t>
+      </w:r>
+      <w:r>
+        <w:t xml:space="preserve"> apenas disjuntores bifásicos, todos devem ser do tipo </w:t>
+      </w:r>
+      <w:r>
+        <w:rPr>
+          <w:rStyle w:val="Forte"/>
+        </w:rPr>
+        <w:t>DIN Curva C</w:t>
+      </w:r>
+      <w:r>
+        <w:t xml:space="preserve"> (ideal para cargas residenciais e</w:t>
+      </w:r>
+      <w:r>
+        <w:t xml:space="preserve"> motores como ar-condicionado).</w:t>
+      </w:r>
+    </w:p>
+    <w:p>
+      <w:pPr>
+        <w:jc w:val="both"/>
+      </w:pPr>
+    </w:p>
+    <w:tbl>
+      <w:tblPr>
+        <w:tblW w:w="0" w:type="auto"/>
+        <w:tblCellSpacing w:w="15" w:type="dxa"/>
+        <w:tblCellMar>
+          <w:top w:w="15" w:type="dxa"/>
+          <w:left w:w="15" w:type="dxa"/>
+          <w:bottom w:w="15" w:type="dxa"/>
+          <w:right w:w="15" w:type="dxa"/>
+        </w:tblCellMar>
+        <w:tblLook w:val="04A0" w:firstRow="1" w:lastRow="0" w:firstColumn="1" w:lastColumn="0" w:noHBand="0" w:noVBand="1"/>
+      </w:tblPr>
+      <w:tblGrid>
+        <w:gridCol w:w="2012"/>
+        <w:gridCol w:w="2570"/>
+        <w:gridCol w:w="1904"/>
+        <w:gridCol w:w="2164"/>
+      </w:tblGrid>
+      <w:tr>
+        <w:trPr>
+          <w:tblCellSpacing w:w="15" w:type="dxa"/>
+        </w:trPr>
+        <w:tc>
+          <w:tcPr>
+            <w:tcW w:w="0" w:type="auto"/>
+            <w:tcBorders>
+              <w:bottom w:val="single" w:sz="6" w:space="0" w:color="363840"/>
+            </w:tcBorders>
+            <w:vAlign w:val="center"/>
+            <w:hideMark/>
+          </w:tcPr>
+          <w:p>
+            <w:pPr>
+              <w:jc w:val="center"/>
+              <w:rPr>
+                <w:b/>
+                <w:bCs/>
+                <w:sz w:val="21"/>
+                <w:szCs w:val="21"/>
+              </w:rPr>
+            </w:pPr>
+            <w:r>
+              <w:rPr>
+                <w:b/>
+                <w:bCs/>
+                <w:sz w:val="21"/>
+                <w:szCs w:val="21"/>
+              </w:rPr>
+              <w:lastRenderedPageBreak/>
+              <w:t>Circuito / Ambiente</w:t>
+            </w:r>
+          </w:p>
+        </w:tc>
+        <w:tc>
+          <w:tcPr>
+            <w:tcW w:w="0" w:type="auto"/>
+            <w:tcBorders>
+              <w:bottom w:val="single" w:sz="6" w:space="0" w:color="363840"/>
+            </w:tcBorders>
+            <w:vAlign w:val="center"/>
+            <w:hideMark/>
+          </w:tcPr>
+          <w:p>
+            <w:pPr>
+              <w:jc w:val="center"/>
+              <w:rPr>
+                <w:b/>
+                <w:bCs/>
+                <w:sz w:val="21"/>
+                <w:szCs w:val="21"/>
+              </w:rPr>
+            </w:pPr>
+            <w:r>
+              <w:rPr>
+                <w:b/>
+                <w:bCs/>
+                <w:sz w:val="21"/>
+                <w:szCs w:val="21"/>
+              </w:rPr>
+              <w:t>Equipamento</w:t>
+            </w:r>
+          </w:p>
+        </w:tc>
+        <w:tc>
+          <w:tcPr>
+            <w:tcW w:w="0" w:type="auto"/>
+            <w:tcBorders>
+              <w:bottom w:val="single" w:sz="6" w:space="0" w:color="363840"/>
+            </w:tcBorders>
+            <w:vAlign w:val="center"/>
+            <w:hideMark/>
+          </w:tcPr>
+          <w:p>
+            <w:pPr>
+              <w:jc w:val="center"/>
+              <w:rPr>
+                <w:b/>
+                <w:bCs/>
+                <w:sz w:val="21"/>
+                <w:szCs w:val="21"/>
+              </w:rPr>
+            </w:pPr>
+            <w:r>
+              <w:rPr>
+                <w:b/>
+                <w:bCs/>
+                <w:sz w:val="21"/>
+                <w:szCs w:val="21"/>
+              </w:rPr>
+              <w:t>Disjuntor (Bipolar)</w:t>
+            </w:r>
+          </w:p>
+        </w:tc>
+        <w:tc>
+          <w:tcPr>
+            <w:tcW w:w="0" w:type="auto"/>
+            <w:tcBorders>
+              <w:bottom w:val="single" w:sz="6" w:space="0" w:color="363840"/>
+            </w:tcBorders>
+            <w:vAlign w:val="center"/>
+            <w:hideMark/>
+          </w:tcPr>
+          <w:p>
+            <w:pPr>
+              <w:jc w:val="center"/>
+              <w:rPr>
+                <w:b/>
+                <w:bCs/>
+                <w:sz w:val="21"/>
+                <w:szCs w:val="21"/>
+              </w:rPr>
+            </w:pPr>
+            <w:r>
+              <w:rPr>
+                <w:b/>
+                <w:bCs/>
+                <w:sz w:val="21"/>
+                <w:szCs w:val="21"/>
+              </w:rPr>
+              <w:t>Cabo (Bitola Mínima)</w:t>
+            </w:r>
+          </w:p>
+        </w:tc>
+      </w:tr>
+      <w:tr>
+        <w:trPr>
+          <w:tblCellSpacing w:w="15" w:type="dxa"/>
+        </w:trPr>
+        <w:tc>
+          <w:tcPr>
+            <w:tcW w:w="0" w:type="auto"/>
+            <w:tcBorders>
+              <w:bottom w:val="single" w:sz="6" w:space="0" w:color="363840"/>
+            </w:tcBorders>
+            <w:vAlign w:val="center"/>
+            <w:hideMark/>
+          </w:tcPr>
+          <w:p>
+            <w:pPr>
+              <w:jc w:val="center"/>
+              <w:rPr>
+                <w:sz w:val="21"/>
+                <w:szCs w:val="21"/>
+              </w:rPr>
+            </w:pPr>
+            <w:r>
+              <w:rPr>
+                <w:rStyle w:val="Forte"/>
+                <w:sz w:val="21"/>
+                <w:szCs w:val="21"/>
+              </w:rPr>
+              <w:t>Geral Apartamento</w:t>
+            </w:r>
+          </w:p>
+        </w:tc>
+        <w:tc>
+          <w:tcPr>
+            <w:tcW w:w="0" w:type="auto"/>
+            <w:tcBorders>
+              <w:bottom w:val="single" w:sz="6" w:space="0" w:color="363840"/>
+            </w:tcBorders>
+            <w:vAlign w:val="center"/>
+            <w:hideMark/>
+          </w:tcPr>
+          <w:p>
+            <w:pPr>
+              <w:jc w:val="center"/>
+              <w:rPr>
+                <w:sz w:val="21"/>
+                <w:szCs w:val="21"/>
+              </w:rPr>
+            </w:pPr>
+            <w:r>
+              <w:rPr>
+                <w:sz w:val="21"/>
+                <w:szCs w:val="21"/>
+              </w:rPr>
+              <w:t>Entrada Principal</w:t>
+            </w:r>
+          </w:p>
+        </w:tc>
+        <w:tc>
+          <w:tcPr>
+            <w:tcW w:w="0" w:type="auto"/>
+            <w:tcBorders>
+              <w:bottom w:val="single" w:sz="6" w:space="0" w:color="363840"/>
+            </w:tcBorders>
+            <w:vAlign w:val="center"/>
+            <w:hideMark/>
+          </w:tcPr>
+          <w:p>
+            <w:pPr>
+              <w:jc w:val="center"/>
+              <w:rPr>
+                <w:b/>
+                <w:sz w:val="21"/>
+                <w:szCs w:val="21"/>
+              </w:rPr>
+            </w:pPr>
+            <w:r>
+              <w:rPr>
+                <w:rStyle w:val="Forte"/>
+                <w:b w:val="0"/>
+                <w:sz w:val="21"/>
+                <w:szCs w:val="21"/>
+              </w:rPr>
+              <w:t>63A</w:t>
+            </w:r>
+          </w:p>
+        </w:tc>
+        <w:tc>
+          <w:tcPr>
+            <w:tcW w:w="0" w:type="auto"/>
+            <w:tcBorders>
+              <w:bottom w:val="single" w:sz="6" w:space="0" w:color="363840"/>
+            </w:tcBorders>
+            <w:vAlign w:val="center"/>
+            <w:hideMark/>
+          </w:tcPr>
+          <w:p>
+            <w:pPr>
+              <w:jc w:val="center"/>
+              <w:rPr>
+                <w:b/>
+                <w:sz w:val="21"/>
+                <w:szCs w:val="21"/>
+              </w:rPr>
+            </w:pPr>
+            <w:r>
+              <w:rPr>
+                <w:rStyle w:val="Forte"/>
+                <w:b w:val="0"/>
+                <w:sz w:val="21"/>
+                <w:szCs w:val="21"/>
+              </w:rPr>
+              <w:t>16 mm²</w:t>
+            </w:r>
+          </w:p>
+        </w:tc>
+      </w:tr>
+      <w:tr>
+        <w:trPr>
+          <w:tblCellSpacing w:w="15" w:type="dxa"/>
+        </w:trPr>
+        <w:tc>
+          <w:tcPr>
+            <w:tcW w:w="0" w:type="auto"/>
+            <w:tcBorders>
+              <w:bottom w:val="single" w:sz="6" w:space="0" w:color="363840"/>
+            </w:tcBorders>
+            <w:vAlign w:val="center"/>
+            <w:hideMark/>
+          </w:tcPr>
+          <w:p>
+            <w:pPr>
+              <w:jc w:val="center"/>
+              <w:rPr>
+                <w:sz w:val="21"/>
+                <w:szCs w:val="21"/>
+              </w:rPr>
+            </w:pPr>
+            <w:r>
+              <w:rPr>
+                <w:rStyle w:val="Forte"/>
+                <w:sz w:val="21"/>
+                <w:szCs w:val="21"/>
+              </w:rPr>
+              <w:t>Banheiro Suíte</w:t>
+            </w:r>
+          </w:p>
+        </w:tc>
+        <w:tc>
+          <w:tcPr>
+            <w:tcW w:w="0" w:type="auto"/>
+            <w:tcBorders>
+              <w:bottom w:val="single" w:sz="6" w:space="0" w:color="363840"/>
+            </w:tcBorders>
+            <w:vAlign w:val="center"/>
+            <w:hideMark/>
+          </w:tcPr>
+          <w:p>
+            <w:pPr>
+              <w:jc w:val="center"/>
+              <w:rPr>
+                <w:sz w:val="21"/>
+                <w:szCs w:val="21"/>
+              </w:rPr>
+            </w:pPr>
+            <w:r>
+              <w:rPr>
+                <w:sz w:val="21"/>
+                <w:szCs w:val="21"/>
+              </w:rPr>
+              <w:t>Chuveiro (5800W)</w:t>
+            </w:r>
+          </w:p>
+        </w:tc>
+        <w:tc>
+          <w:tcPr>
+            <w:tcW w:w="0" w:type="auto"/>
+            <w:tcBorders>
+              <w:bottom w:val="single" w:sz="6" w:space="0" w:color="363840"/>
+            </w:tcBorders>
+            <w:vAlign w:val="center"/>
+            <w:hideMark/>
+          </w:tcPr>
+          <w:p>
+            <w:pPr>
+              <w:jc w:val="center"/>
+              <w:rPr>
+                <w:sz w:val="21"/>
+                <w:szCs w:val="21"/>
+              </w:rPr>
+            </w:pPr>
+            <w:r>
+              <w:rPr>
+                <w:sz w:val="21"/>
+                <w:szCs w:val="21"/>
+              </w:rPr>
+              <w:t>32A</w:t>
+            </w:r>
+          </w:p>
+        </w:tc>
+        <w:tc>
+          <w:tcPr>
+            <w:tcW w:w="0" w:type="auto"/>
+            <w:tcBorders>
+              <w:bottom w:val="single" w:sz="6" w:space="0" w:color="363840"/>
+            </w:tcBorders>
+            <w:vAlign w:val="center"/>
+            <w:hideMark/>
+          </w:tcPr>
+          <w:p>
+            <w:pPr>
+              <w:jc w:val="center"/>
+              <w:rPr>
+                <w:sz w:val="21"/>
+                <w:szCs w:val="21"/>
+              </w:rPr>
+            </w:pPr>
+            <w:r>
+              <w:rPr>
+                <w:sz w:val="21"/>
+                <w:szCs w:val="21"/>
+              </w:rPr>
+              <w:t>4 mm²</w:t>
+            </w:r>
+          </w:p>
+        </w:tc>
+      </w:tr>
+      <w:tr>
+        <w:trPr>
+          <w:tblCellSpacing w:w="15" w:type="dxa"/>
+        </w:trPr>
+        <w:tc>
+          <w:tcPr>
+            <w:tcW w:w="0" w:type="auto"/>
+            <w:tcBorders>
+              <w:bottom w:val="single" w:sz="6" w:space="0" w:color="363840"/>
+            </w:tcBorders>
+            <w:vAlign w:val="center"/>
+            <w:hideMark/>
+          </w:tcPr>
+          <w:p>
+            <w:pPr>
+              <w:jc w:val="center"/>
+              <w:rPr>
+                <w:sz w:val="21"/>
+                <w:szCs w:val="21"/>
+              </w:rPr>
+            </w:pPr>
+            <w:r>
+              <w:rPr>
+                <w:rStyle w:val="Forte"/>
+                <w:sz w:val="21"/>
+                <w:szCs w:val="21"/>
+              </w:rPr>
+              <w:t>Banheiro Social</w:t>
+            </w:r>
+          </w:p>
+        </w:tc>
+        <w:tc>
+          <w:tcPr>
+            <w:tcW w:w="0" w:type="auto"/>
+            <w:tcBorders>
+              <w:bottom w:val="single" w:sz="6" w:space="0" w:color="363840"/>
+            </w:tcBorders>
+            <w:vAlign w:val="center"/>
+            <w:hideMark/>
+          </w:tcPr>
+          <w:p>
+            <w:pPr>
+              <w:jc w:val="center"/>
+              <w:rPr>
+                <w:sz w:val="21"/>
+                <w:szCs w:val="21"/>
+              </w:rPr>
+            </w:pPr>
+            <w:r>
+              <w:rPr>
+                <w:sz w:val="21"/>
+                <w:szCs w:val="21"/>
+              </w:rPr>
+              <w:t>Chuveiro (5800W)</w:t>
+            </w:r>
+          </w:p>
+        </w:tc>
+        <w:tc>
+          <w:tcPr>
+            <w:tcW w:w="0" w:type="auto"/>
+            <w:tcBorders>
+              <w:bottom w:val="single" w:sz="6" w:space="0" w:color="363840"/>
+            </w:tcBorders>
+            <w:vAlign w:val="center"/>
+            <w:hideMark/>
+          </w:tcPr>
+          <w:p>
+            <w:pPr>
+              <w:jc w:val="center"/>
+              <w:rPr>
+                <w:sz w:val="21"/>
+                <w:szCs w:val="21"/>
+              </w:rPr>
+            </w:pPr>
+            <w:r>
+              <w:rPr>
+                <w:sz w:val="21"/>
+                <w:szCs w:val="21"/>
+              </w:rPr>
+              <w:t>32A</w:t>
+            </w:r>
+          </w:p>
+        </w:tc>
+        <w:tc>
+          <w:tcPr>
+            <w:tcW w:w="0" w:type="auto"/>
+            <w:tcBorders>
+              <w:bottom w:val="single" w:sz="6" w:space="0" w:color="363840"/>
+            </w:tcBorders>
+            <w:vAlign w:val="center"/>
+            <w:hideMark/>
+          </w:tcPr>
+          <w:p>
+            <w:pPr>
+              <w:jc w:val="center"/>
+              <w:rPr>
+                <w:sz w:val="21"/>
+                <w:szCs w:val="21"/>
+              </w:rPr>
+            </w:pPr>
+            <w:r>
+              <w:rPr>
+                <w:sz w:val="21"/>
+                <w:szCs w:val="21"/>
+              </w:rPr>
+              <w:t>4 mm²</w:t>
+            </w:r>
+          </w:p>
+        </w:tc>
+      </w:tr>
+      <w:tr>
+        <w:trPr>
+          <w:tblCellSpacing w:w="15" w:type="dxa"/>
+        </w:trPr>
+        <w:tc>
+          <w:tcPr>
+            <w:tcW w:w="0" w:type="auto"/>
+            <w:tcBorders>
+              <w:bottom w:val="single" w:sz="6" w:space="0" w:color="363840"/>
+            </w:tcBorders>
+            <w:vAlign w:val="center"/>
+            <w:hideMark/>
+          </w:tcPr>
+          <w:p>
+            <w:pPr>
+              <w:jc w:val="center"/>
+              <w:rPr>
+                <w:sz w:val="21"/>
+                <w:szCs w:val="21"/>
+              </w:rPr>
+            </w:pPr>
+            <w:r>
+              <w:rPr>
+                <w:rStyle w:val="Forte"/>
+                <w:sz w:val="21"/>
+                <w:szCs w:val="21"/>
+              </w:rPr>
+              <w:t>Sala de Estar</w:t>
+            </w:r>
+          </w:p>
+        </w:tc>
+        <w:tc>
+          <w:tcPr>
+            <w:tcW w:w="0" w:type="auto"/>
+            <w:tcBorders>
+              <w:bottom w:val="single" w:sz="6" w:space="0" w:color="363840"/>
+            </w:tcBorders>
+            <w:vAlign w:val="center"/>
+            <w:hideMark/>
+          </w:tcPr>
+          <w:p>
+            <w:pPr>
+              <w:jc w:val="center"/>
+              <w:rPr>
+                <w:sz w:val="21"/>
+                <w:szCs w:val="21"/>
+              </w:rPr>
+            </w:pPr>
+            <w:r>
+              <w:rPr>
+                <w:sz w:val="21"/>
+                <w:szCs w:val="21"/>
+              </w:rPr>
+              <w:t xml:space="preserve">Ar Cond. (30.000 </w:t>
+            </w:r>
+            <w:proofErr w:type="spellStart"/>
+            <w:r>
+              <w:rPr>
+                <w:sz w:val="21"/>
+                <w:szCs w:val="21"/>
+              </w:rPr>
+              <w:t>BTUs</w:t>
+            </w:r>
+            <w:proofErr w:type="spellEnd"/>
+            <w:r>
+              <w:rPr>
+                <w:sz w:val="21"/>
+                <w:szCs w:val="21"/>
+              </w:rPr>
+              <w:t>)</w:t>
+            </w:r>
+          </w:p>
+        </w:tc>
+        <w:tc>
+          <w:tcPr>
+            <w:tcW w:w="0" w:type="auto"/>
+            <w:tcBorders>
+              <w:bottom w:val="single" w:sz="6" w:space="0" w:color="363840"/>
+            </w:tcBorders>
+            <w:vAlign w:val="center"/>
+            <w:hideMark/>
+          </w:tcPr>
+          <w:p>
+            <w:pPr>
+              <w:jc w:val="center"/>
+              <w:rPr>
+                <w:b/>
+                <w:sz w:val="21"/>
+                <w:szCs w:val="21"/>
+              </w:rPr>
+            </w:pPr>
+            <w:r>
+              <w:rPr>
+                <w:rStyle w:val="Forte"/>
+                <w:b w:val="0"/>
+                <w:sz w:val="21"/>
+                <w:szCs w:val="21"/>
+              </w:rPr>
+              <w:t>25A</w:t>
+            </w:r>
+          </w:p>
+        </w:tc>
+        <w:tc>
+          <w:tcPr>
+            <w:tcW w:w="0" w:type="auto"/>
+            <w:tcBorders>
+              <w:bottom w:val="single" w:sz="6" w:space="0" w:color="363840"/>
+            </w:tcBorders>
+            <w:vAlign w:val="center"/>
+            <w:hideMark/>
+          </w:tcPr>
+          <w:p>
+            <w:pPr>
+              <w:jc w:val="center"/>
+              <w:rPr>
+                <w:b/>
+                <w:sz w:val="21"/>
+                <w:szCs w:val="21"/>
+              </w:rPr>
+            </w:pPr>
+            <w:r>
+              <w:rPr>
+                <w:rStyle w:val="Forte"/>
+                <w:b w:val="0"/>
+                <w:sz w:val="21"/>
+                <w:szCs w:val="21"/>
+              </w:rPr>
+              <w:t>6 mm²</w:t>
+            </w:r>
+          </w:p>
+        </w:tc>
+      </w:tr>
+      <w:tr>
+        <w:trPr>
+          <w:tblCellSpacing w:w="15" w:type="dxa"/>
+        </w:trPr>
+        <w:tc>
+          <w:tcPr>
+            <w:tcW w:w="0" w:type="auto"/>
+            <w:tcBorders>
+              <w:bottom w:val="single" w:sz="6" w:space="0" w:color="363840"/>
+            </w:tcBorders>
+            <w:vAlign w:val="center"/>
+            <w:hideMark/>
+          </w:tcPr>
+          <w:p>
+            <w:pPr>
+              <w:jc w:val="center"/>
+              <w:rPr>
+                <w:sz w:val="21"/>
+                <w:szCs w:val="21"/>
+              </w:rPr>
+            </w:pPr>
+            <w:r>
+              <w:rPr>
+                <w:rStyle w:val="Forte"/>
+                <w:sz w:val="21"/>
+                <w:szCs w:val="21"/>
+              </w:rPr>
+              <w:t>Cozinha (Pesado)</w:t>
+            </w:r>
+          </w:p>
+        </w:tc>
+        <w:tc>
+          <w:tcPr>
+            <w:tcW w:w="0" w:type="auto"/>
+            <w:tcBorders>
+              <w:bottom w:val="single" w:sz="6" w:space="0" w:color="363840"/>
+            </w:tcBorders>
+            <w:vAlign w:val="center"/>
+            <w:hideMark/>
+          </w:tcPr>
+          <w:p>
+            <w:pPr>
+              <w:jc w:val="center"/>
+              <w:rPr>
+                <w:sz w:val="21"/>
+                <w:szCs w:val="21"/>
+              </w:rPr>
+            </w:pPr>
+            <w:r>
+              <w:rPr>
+                <w:sz w:val="21"/>
+                <w:szCs w:val="21"/>
+              </w:rPr>
+              <w:t>Forno Elétrico / Lava-louça</w:t>
+            </w:r>
+          </w:p>
+        </w:tc>
+        <w:tc>
+          <w:tcPr>
+            <w:tcW w:w="0" w:type="auto"/>
+            <w:tcBorders>
+              <w:bottom w:val="single" w:sz="6" w:space="0" w:color="363840"/>
+            </w:tcBorders>
+            <w:vAlign w:val="center"/>
+            <w:hideMark/>
+          </w:tcPr>
+          <w:p>
+            <w:pPr>
+              <w:jc w:val="center"/>
+              <w:rPr>
+                <w:sz w:val="21"/>
+                <w:szCs w:val="21"/>
+              </w:rPr>
+            </w:pPr>
+            <w:r>
+              <w:rPr>
+                <w:sz w:val="21"/>
+                <w:szCs w:val="21"/>
+              </w:rPr>
+              <w:t>25A</w:t>
+            </w:r>
+          </w:p>
+        </w:tc>
+        <w:tc>
+          <w:tcPr>
+            <w:tcW w:w="0" w:type="auto"/>
+            <w:tcBorders>
+              <w:bottom w:val="single" w:sz="6" w:space="0" w:color="363840"/>
+            </w:tcBorders>
+            <w:vAlign w:val="center"/>
+            <w:hideMark/>
+          </w:tcPr>
+          <w:p>
+            <w:pPr>
+              <w:jc w:val="center"/>
+              <w:rPr>
+                <w:sz w:val="21"/>
+                <w:szCs w:val="21"/>
+              </w:rPr>
+            </w:pPr>
+            <w:r>
+              <w:rPr>
+                <w:sz w:val="21"/>
+                <w:szCs w:val="21"/>
+              </w:rPr>
+              <w:t>4 mm²</w:t>
+            </w:r>
+          </w:p>
+        </w:tc>
+      </w:tr>
+      <w:tr>
+        <w:trPr>
+          <w:tblCellSpacing w:w="15" w:type="dxa"/>
+        </w:trPr>
+        <w:tc>
+          <w:tcPr>
+            <w:tcW w:w="0" w:type="auto"/>
+            <w:tcBorders>
+              <w:bottom w:val="single" w:sz="6" w:space="0" w:color="363840"/>
+            </w:tcBorders>
+            <w:vAlign w:val="center"/>
+            <w:hideMark/>
+          </w:tcPr>
+          <w:p>
+            <w:pPr>
+              <w:jc w:val="center"/>
+              <w:rPr>
+                <w:sz w:val="21"/>
+                <w:szCs w:val="21"/>
+              </w:rPr>
+            </w:pPr>
+            <w:r>
+              <w:rPr>
+                <w:rStyle w:val="Forte"/>
+                <w:sz w:val="21"/>
+                <w:szCs w:val="21"/>
+              </w:rPr>
+              <w:t>Cozinha (Tomadas)</w:t>
+            </w:r>
+          </w:p>
+        </w:tc>
+        <w:tc>
+          <w:tcPr>
+            <w:tcW w:w="0" w:type="auto"/>
+            <w:tcBorders>
+              <w:bottom w:val="single" w:sz="6" w:space="0" w:color="363840"/>
+            </w:tcBorders>
+            <w:vAlign w:val="center"/>
+            <w:hideMark/>
+          </w:tcPr>
+          <w:p>
+            <w:pPr>
+              <w:jc w:val="center"/>
+              <w:rPr>
+                <w:sz w:val="21"/>
+                <w:szCs w:val="21"/>
+              </w:rPr>
+            </w:pPr>
+            <w:r>
+              <w:rPr>
+                <w:sz w:val="21"/>
+                <w:szCs w:val="21"/>
+              </w:rPr>
+              <w:t xml:space="preserve">Air </w:t>
+            </w:r>
+            <w:proofErr w:type="spellStart"/>
+            <w:r>
+              <w:rPr>
+                <w:sz w:val="21"/>
+                <w:szCs w:val="21"/>
+              </w:rPr>
+              <w:t>Fryer</w:t>
+            </w:r>
+            <w:proofErr w:type="spellEnd"/>
+            <w:r>
+              <w:rPr>
+                <w:sz w:val="21"/>
+                <w:szCs w:val="21"/>
+              </w:rPr>
+              <w:t xml:space="preserve"> / Micro-ondas</w:t>
+            </w:r>
+          </w:p>
+        </w:tc>
+        <w:tc>
+          <w:tcPr>
+            <w:tcW w:w="0" w:type="auto"/>
+            <w:tcBorders>
+              <w:bottom w:val="single" w:sz="6" w:space="0" w:color="363840"/>
+            </w:tcBorders>
+            <w:vAlign w:val="center"/>
+            <w:hideMark/>
+          </w:tcPr>
+          <w:p>
+            <w:pPr>
+              <w:jc w:val="center"/>
+              <w:rPr>
+                <w:sz w:val="21"/>
+                <w:szCs w:val="21"/>
+              </w:rPr>
+            </w:pPr>
+            <w:r>
+              <w:rPr>
+                <w:sz w:val="21"/>
+                <w:szCs w:val="21"/>
+              </w:rPr>
+              <w:t>20A</w:t>
+            </w:r>
+          </w:p>
+        </w:tc>
+        <w:tc>
+          <w:tcPr>
+            <w:tcW w:w="0" w:type="auto"/>
+            <w:tcBorders>
+              <w:bottom w:val="single" w:sz="6" w:space="0" w:color="363840"/>
+            </w:tcBorders>
+            <w:vAlign w:val="center"/>
+            <w:hideMark/>
+          </w:tcPr>
+          <w:p>
+            <w:pPr>
+              <w:jc w:val="center"/>
+              <w:rPr>
+                <w:sz w:val="21"/>
+                <w:szCs w:val="21"/>
+              </w:rPr>
+            </w:pPr>
+            <w:r>
+              <w:rPr>
+                <w:sz w:val="21"/>
+                <w:szCs w:val="21"/>
+              </w:rPr>
+              <w:t>2,5 mm²</w:t>
+            </w:r>
+          </w:p>
+        </w:tc>
+      </w:tr>
+      <w:tr>
+        <w:trPr>
+          <w:tblCellSpacing w:w="15" w:type="dxa"/>
+        </w:trPr>
+        <w:tc>
+          <w:tcPr>
+            <w:tcW w:w="0" w:type="auto"/>
+            <w:tcBorders>
+              <w:bottom w:val="single" w:sz="6" w:space="0" w:color="363840"/>
+            </w:tcBorders>
+            <w:vAlign w:val="center"/>
+            <w:hideMark/>
+          </w:tcPr>
+          <w:p>
+            <w:pPr>
+              <w:jc w:val="center"/>
+              <w:rPr>
+                <w:sz w:val="21"/>
+                <w:szCs w:val="21"/>
+              </w:rPr>
+            </w:pPr>
+            <w:r>
+              <w:rPr>
+                <w:rStyle w:val="Forte"/>
+                <w:sz w:val="21"/>
+                <w:szCs w:val="21"/>
+              </w:rPr>
+              <w:t>Área de Serviço</w:t>
+            </w:r>
+          </w:p>
+        </w:tc>
+        <w:tc>
+          <w:tcPr>
+            <w:tcW w:w="0" w:type="auto"/>
+            <w:tcBorders>
+              <w:bottom w:val="single" w:sz="6" w:space="0" w:color="363840"/>
+            </w:tcBorders>
+            <w:vAlign w:val="center"/>
+            <w:hideMark/>
+          </w:tcPr>
+          <w:p>
+            <w:pPr>
+              <w:jc w:val="center"/>
+              <w:rPr>
+                <w:sz w:val="21"/>
+                <w:szCs w:val="21"/>
+              </w:rPr>
+            </w:pPr>
+            <w:r>
+              <w:rPr>
+                <w:sz w:val="21"/>
+                <w:szCs w:val="21"/>
+              </w:rPr>
+              <w:t>Lava e Seca Samsung</w:t>
+            </w:r>
+          </w:p>
+        </w:tc>
+        <w:tc>
+          <w:tcPr>
+            <w:tcW w:w="0" w:type="auto"/>
+            <w:tcBorders>
+              <w:bottom w:val="single" w:sz="6" w:space="0" w:color="363840"/>
+            </w:tcBorders>
+            <w:vAlign w:val="center"/>
+            <w:hideMark/>
+          </w:tcPr>
+          <w:p>
+            <w:pPr>
+              <w:jc w:val="center"/>
+              <w:rPr>
+                <w:sz w:val="21"/>
+                <w:szCs w:val="21"/>
+              </w:rPr>
+            </w:pPr>
+            <w:r>
+              <w:rPr>
+                <w:sz w:val="21"/>
+                <w:szCs w:val="21"/>
+              </w:rPr>
+              <w:t>20A</w:t>
+            </w:r>
+          </w:p>
+        </w:tc>
+        <w:tc>
+          <w:tcPr>
+            <w:tcW w:w="0" w:type="auto"/>
+            <w:tcBorders>
+              <w:bottom w:val="single" w:sz="6" w:space="0" w:color="363840"/>
+            </w:tcBorders>
+            <w:vAlign w:val="center"/>
+            <w:hideMark/>
+          </w:tcPr>
+          <w:p>
+            <w:pPr>
+              <w:jc w:val="center"/>
+              <w:rPr>
+                <w:sz w:val="21"/>
+                <w:szCs w:val="21"/>
+              </w:rPr>
+            </w:pPr>
+            <w:r>
+              <w:rPr>
+                <w:sz w:val="21"/>
+                <w:szCs w:val="21"/>
+              </w:rPr>
+              <w:t>2,5 mm²</w:t>
+            </w:r>
+          </w:p>
+        </w:tc>
+      </w:tr>
+      <w:tr>
+        <w:trPr>
+          <w:tblCellSpacing w:w="15" w:type="dxa"/>
+        </w:trPr>
+        <w:tc>
+          <w:tcPr>
+            <w:tcW w:w="0" w:type="auto"/>
+            <w:tcBorders>
+              <w:bottom w:val="single" w:sz="6" w:space="0" w:color="363840"/>
+            </w:tcBorders>
+            <w:vAlign w:val="center"/>
+            <w:hideMark/>
+          </w:tcPr>
+          <w:p>
+            <w:pPr>
+              <w:jc w:val="center"/>
+              <w:rPr>
+                <w:sz w:val="21"/>
+                <w:szCs w:val="21"/>
+              </w:rPr>
+            </w:pPr>
+            <w:r>
+              <w:rPr>
+                <w:rStyle w:val="Forte"/>
+                <w:sz w:val="21"/>
+                <w:szCs w:val="21"/>
+              </w:rPr>
+              <w:t>Suíte / Escritório</w:t>
+            </w:r>
+          </w:p>
+        </w:tc>
+        <w:tc>
+          <w:tcPr>
+            <w:tcW w:w="0" w:type="auto"/>
+            <w:tcBorders>
+              <w:bottom w:val="single" w:sz="6" w:space="0" w:color="363840"/>
+            </w:tcBorders>
+            <w:vAlign w:val="center"/>
+            <w:hideMark/>
+          </w:tcPr>
+          <w:p>
+            <w:pPr>
+              <w:jc w:val="center"/>
+              <w:rPr>
+                <w:sz w:val="21"/>
+                <w:szCs w:val="21"/>
+              </w:rPr>
+            </w:pPr>
+            <w:r>
+              <w:rPr>
+                <w:sz w:val="21"/>
+                <w:szCs w:val="21"/>
+              </w:rPr>
+              <w:t xml:space="preserve">Ar Cond. (12k e 9k </w:t>
+            </w:r>
+            <w:proofErr w:type="spellStart"/>
+            <w:r>
+              <w:rPr>
+                <w:sz w:val="21"/>
+                <w:szCs w:val="21"/>
+              </w:rPr>
+              <w:t>BTUs</w:t>
+            </w:r>
+            <w:proofErr w:type="spellEnd"/>
+            <w:r>
+              <w:rPr>
+                <w:sz w:val="21"/>
+                <w:szCs w:val="21"/>
+              </w:rPr>
+              <w:t>)</w:t>
+            </w:r>
+          </w:p>
+        </w:tc>
+        <w:tc>
+          <w:tcPr>
+            <w:tcW w:w="0" w:type="auto"/>
+            <w:tcBorders>
+              <w:bottom w:val="single" w:sz="6" w:space="0" w:color="363840"/>
+            </w:tcBorders>
+            <w:vAlign w:val="center"/>
+            <w:hideMark/>
+          </w:tcPr>
+          <w:p>
+            <w:pPr>
+              <w:jc w:val="center"/>
+              <w:rPr>
+                <w:sz w:val="21"/>
+                <w:szCs w:val="21"/>
+              </w:rPr>
+            </w:pPr>
+            <w:r>
+              <w:rPr>
+                <w:sz w:val="21"/>
+                <w:szCs w:val="21"/>
+              </w:rPr>
+              <w:t>15A ou 20A</w:t>
+            </w:r>
+          </w:p>
+        </w:tc>
+        <w:tc>
+          <w:tcPr>
+            <w:tcW w:w="0" w:type="auto"/>
+            <w:tcBorders>
+              <w:bottom w:val="single" w:sz="6" w:space="0" w:color="363840"/>
+            </w:tcBorders>
+            <w:vAlign w:val="center"/>
+            <w:hideMark/>
+          </w:tcPr>
+          <w:p>
+            <w:pPr>
+              <w:jc w:val="center"/>
+              <w:rPr>
+                <w:sz w:val="21"/>
+                <w:szCs w:val="21"/>
+              </w:rPr>
+            </w:pPr>
+            <w:r>
+              <w:rPr>
+                <w:sz w:val="21"/>
+                <w:szCs w:val="21"/>
+              </w:rPr>
+              <w:t>2,5 mm²</w:t>
+            </w:r>
+          </w:p>
+        </w:tc>
+      </w:tr>
+      <w:tr>
+        <w:trPr>
+          <w:tblCellSpacing w:w="15" w:type="dxa"/>
+        </w:trPr>
+        <w:tc>
+          <w:tcPr>
+            <w:tcW w:w="0" w:type="auto"/>
+            <w:tcBorders>
+              <w:bottom w:val="single" w:sz="6" w:space="0" w:color="363840"/>
+            </w:tcBorders>
+            <w:vAlign w:val="center"/>
+            <w:hideMark/>
+          </w:tcPr>
+          <w:p>
+            <w:pPr>
+              <w:jc w:val="center"/>
+              <w:rPr>
+                <w:sz w:val="21"/>
+                <w:szCs w:val="21"/>
+              </w:rPr>
+            </w:pPr>
+            <w:r>
+              <w:rPr>
+                <w:rStyle w:val="Forte"/>
+                <w:sz w:val="21"/>
+                <w:szCs w:val="21"/>
+              </w:rPr>
+              <w:t>Geral Tomadas</w:t>
+            </w:r>
+          </w:p>
+        </w:tc>
+        <w:tc>
+          <w:tcPr>
+            <w:tcW w:w="0" w:type="auto"/>
+            <w:tcBorders>
+              <w:bottom w:val="single" w:sz="6" w:space="0" w:color="363840"/>
+            </w:tcBorders>
+            <w:vAlign w:val="center"/>
+            <w:hideMark/>
+          </w:tcPr>
+          <w:p>
+            <w:pPr>
+              <w:jc w:val="center"/>
+              <w:rPr>
+                <w:sz w:val="21"/>
+                <w:szCs w:val="21"/>
+              </w:rPr>
+            </w:pPr>
+            <w:r>
+              <w:rPr>
+                <w:sz w:val="21"/>
+                <w:szCs w:val="21"/>
+              </w:rPr>
+              <w:t>Quartos / Salas</w:t>
+            </w:r>
+          </w:p>
+        </w:tc>
+        <w:tc>
+          <w:tcPr>
+            <w:tcW w:w="0" w:type="auto"/>
+            <w:tcBorders>
+              <w:bottom w:val="single" w:sz="6" w:space="0" w:color="363840"/>
+            </w:tcBorders>
+            <w:vAlign w:val="center"/>
+            <w:hideMark/>
+          </w:tcPr>
+          <w:p>
+            <w:pPr>
+              <w:jc w:val="center"/>
+              <w:rPr>
+                <w:sz w:val="21"/>
+                <w:szCs w:val="21"/>
+              </w:rPr>
+            </w:pPr>
+            <w:r>
+              <w:rPr>
+                <w:sz w:val="21"/>
+                <w:szCs w:val="21"/>
+              </w:rPr>
+              <w:t>20A</w:t>
+            </w:r>
+          </w:p>
+        </w:tc>
+        <w:tc>
+          <w:tcPr>
+            <w:tcW w:w="0" w:type="auto"/>
+            <w:tcBorders>
+              <w:bottom w:val="single" w:sz="6" w:space="0" w:color="363840"/>
+            </w:tcBorders>
+            <w:vAlign w:val="center"/>
+            <w:hideMark/>
+          </w:tcPr>
+          <w:p>
+            <w:pPr>
+              <w:jc w:val="center"/>
+              <w:rPr>
+                <w:sz w:val="21"/>
+                <w:szCs w:val="21"/>
+              </w:rPr>
+            </w:pPr>
+            <w:r>
+              <w:rPr>
+                <w:sz w:val="21"/>
+                <w:szCs w:val="21"/>
+              </w:rPr>
+              <w:t>2,5 mm²</w:t>
+            </w:r>
+          </w:p>
+        </w:tc>
+      </w:tr>
+      <w:tr>
+        <w:trPr>
+          <w:tblCellSpacing w:w="15" w:type="dxa"/>
+        </w:trPr>
+        <w:tc>
+          <w:tcPr>
+            <w:tcW w:w="0" w:type="auto"/>
+            <w:tcBorders>
+              <w:bottom w:val="nil"/>
+            </w:tcBorders>
+            <w:vAlign w:val="center"/>
+            <w:hideMark/>
+          </w:tcPr>
+          <w:p>
+            <w:pPr>
+              <w:jc w:val="center"/>
+              <w:rPr>
+                <w:sz w:val="21"/>
+                <w:szCs w:val="21"/>
+              </w:rPr>
+            </w:pPr>
+            <w:r>
+              <w:rPr>
+                <w:rStyle w:val="Forte"/>
+                <w:sz w:val="21"/>
+                <w:szCs w:val="21"/>
+              </w:rPr>
+              <w:t>Iluminação</w:t>
+            </w:r>
+          </w:p>
+        </w:tc>
+        <w:tc>
+          <w:tcPr>
+            <w:tcW w:w="0" w:type="auto"/>
+            <w:tcBorders>
+              <w:bottom w:val="nil"/>
+            </w:tcBorders>
+            <w:vAlign w:val="center"/>
+            <w:hideMark/>
+          </w:tcPr>
+          <w:p>
+            <w:pPr>
+              <w:jc w:val="center"/>
+              <w:rPr>
+                <w:sz w:val="21"/>
+                <w:szCs w:val="21"/>
+              </w:rPr>
+            </w:pPr>
+            <w:r>
+              <w:rPr>
+                <w:sz w:val="21"/>
+                <w:szCs w:val="21"/>
+              </w:rPr>
+              <w:t>Todos os ambientes</w:t>
+            </w:r>
+          </w:p>
+        </w:tc>
+        <w:tc>
+          <w:tcPr>
+            <w:tcW w:w="0" w:type="auto"/>
+            <w:tcBorders>
+              <w:bottom w:val="nil"/>
+            </w:tcBorders>
+            <w:vAlign w:val="center"/>
+            <w:hideMark/>
+          </w:tcPr>
+          <w:p>
+            <w:pPr>
+              <w:jc w:val="center"/>
+              <w:rPr>
+                <w:sz w:val="21"/>
+                <w:szCs w:val="21"/>
+              </w:rPr>
+            </w:pPr>
+            <w:r>
+              <w:rPr>
+                <w:sz w:val="21"/>
+                <w:szCs w:val="21"/>
+              </w:rPr>
+              <w:t>10A</w:t>
+            </w:r>
+          </w:p>
+        </w:tc>
+        <w:tc>
+          <w:tcPr>
+            <w:tcW w:w="0" w:type="auto"/>
+            <w:tcBorders>
+              <w:bottom w:val="nil"/>
+            </w:tcBorders>
+            <w:vAlign w:val="center"/>
+            <w:hideMark/>
+          </w:tcPr>
+          <w:p>
+            <w:pPr>
+              <w:jc w:val="center"/>
+              <w:rPr>
+                <w:sz w:val="21"/>
+                <w:szCs w:val="21"/>
+              </w:rPr>
+            </w:pPr>
+            <w:r>
+              <w:rPr>
+                <w:sz w:val="21"/>
+                <w:szCs w:val="21"/>
+              </w:rPr>
+              <w:t>1,5 mm²</w:t>
+            </w:r>
+          </w:p>
+        </w:tc>
+      </w:tr>
+    </w:tbl>
+    <w:p>
+      <w:pPr>
+        <w:jc w:val="both"/>
+        <w:rPr>
+          <w:rFonts w:ascii="Segoe UI Symbol" w:hAnsi="Segoe UI Symbol" w:cs="Segoe UI Symbol"/>
+          <w:b/>
+          <w:bCs/>
+          <w:sz w:val="30"/>
+          <w:szCs w:val="30"/>
+        </w:rPr>
+      </w:pPr>
+    </w:p>
+    <w:p>
+      <w:pPr>
+        <w:jc w:val="both"/>
+        <w:rPr>
+          <w:b/>
+          <w:bCs/>
+          <w:sz w:val="30"/>
+          <w:szCs w:val="30"/>
+        </w:rPr>
+      </w:pPr>
+      <w:r>
+        <w:rPr>
+          <w:rFonts w:ascii="Segoe UI Symbol" w:hAnsi="Segoe UI Symbol" w:cs="Segoe UI Symbol"/>
+          <w:b/>
+          <w:bCs/>
+          <w:sz w:val="30"/>
+          <w:szCs w:val="30"/>
+        </w:rPr>
+        <w:t>📋</w:t>
+      </w:r>
+      <w:r>
+        <w:rPr>
+          <w:b/>
+          <w:bCs/>
+          <w:sz w:val="30"/>
+          <w:szCs w:val="30"/>
+        </w:rPr>
+        <w:t xml:space="preserve"> Recomendações de Segurança e Componentes</w:t>
+      </w:r>
+    </w:p>
+    <w:p>
+      <w:pPr>
+        <w:jc w:val="both"/>
+      </w:pPr>
+      <w:r>
+        <w:t>Para manter o padrão profissional:</w:t>
+      </w:r>
+    </w:p>
+    <w:p>
+      <w:pPr>
+        <w:numPr>
+          <w:ilvl w:val="0"/>
+          <w:numId w:val="21"/>
+        </w:numPr>
+        <w:spacing w:after="0" w:line="240" w:lineRule="auto"/>
+        <w:ind w:left="426"/>
+        <w:jc w:val="both"/>
+      </w:pPr>
+      <w:r>
+        <w:rPr>
+          <w:rStyle w:val="Forte"/>
+        </w:rPr>
+        <w:t xml:space="preserve">Ar-Condicionado 30k </w:t>
+      </w:r>
+      <w:proofErr w:type="spellStart"/>
+      <w:r>
+        <w:rPr>
+          <w:rStyle w:val="Forte"/>
+        </w:rPr>
+        <w:t>BTUs</w:t>
+      </w:r>
+      <w:proofErr w:type="spellEnd"/>
+      <w:r>
+        <w:rPr>
+          <w:rStyle w:val="Forte"/>
+        </w:rPr>
+        <w:t>:</w:t>
+      </w:r>
+      <w:r>
+        <w:rPr>
+          <w:rStyle w:val="t286pc"/>
+        </w:rPr>
+        <w:t xml:space="preserve"> Embora o cabo de 4 mm² suporte a corrente, o uso de </w:t>
+      </w:r>
+      <w:r>
+        <w:rPr>
+          <w:rStyle w:val="Forte"/>
+        </w:rPr>
+        <w:t>6 mm²</w:t>
+      </w:r>
+      <w:r>
+        <w:rPr>
+          <w:rStyle w:val="t286pc"/>
+        </w:rPr>
+        <w:t xml:space="preserve"> é recomendado para evitar quedas de tensão na partida do compressor.</w:t>
+      </w:r>
+    </w:p>
+    <w:p>
+      <w:pPr>
+        <w:numPr>
+          <w:ilvl w:val="0"/>
+          <w:numId w:val="21"/>
+        </w:numPr>
+        <w:spacing w:after="0" w:line="240" w:lineRule="auto"/>
+        <w:ind w:left="426"/>
+        <w:jc w:val="both"/>
+        <w:rPr>
+          <w:rStyle w:val="Forte"/>
+          <w:b w:val="0"/>
+        </w:rPr>
+      </w:pPr>
+      <w:r>
+        <w:rPr>
+          <w:rStyle w:val="Forte"/>
+        </w:rPr>
+        <w:t>Barramento Pente:</w:t>
+      </w:r>
+      <w:r>
+        <w:rPr>
+          <w:rStyle w:val="Forte"/>
+        </w:rPr>
+        <w:t xml:space="preserve"> </w:t>
+      </w:r>
+      <w:r>
+        <w:rPr>
+          <w:rStyle w:val="Forte"/>
+          <w:b w:val="0"/>
+        </w:rPr>
+        <w:t xml:space="preserve">Utilize um </w:t>
+      </w:r>
+      <w:r>
+        <w:rPr>
+          <w:rStyle w:val="Forte"/>
+          <w:b w:val="0"/>
+        </w:rPr>
+        <w:t>barramento pente bifásico de 63A</w:t>
+      </w:r>
+      <w:r>
+        <w:rPr>
+          <w:rStyle w:val="Forte"/>
+          <w:b w:val="0"/>
+        </w:rPr>
+        <w:t xml:space="preserve"> para interconectar os disjuntores. Isso elimina o uso de "jumpers" (pontes de fios), que são pontos comuns de aquecimento e falhas.</w:t>
+      </w:r>
+    </w:p>
+    <w:p>
+      <w:pPr>
+        <w:numPr>
+          <w:ilvl w:val="0"/>
+          <w:numId w:val="21"/>
+        </w:numPr>
+        <w:spacing w:after="0" w:line="240" w:lineRule="auto"/>
+        <w:ind w:left="426"/>
+        <w:jc w:val="both"/>
+        <w:rPr>
+          <w:rStyle w:val="Forte"/>
+          <w:b w:val="0"/>
+        </w:rPr>
+      </w:pPr>
+      <w:r>
+        <w:rPr>
+          <w:rStyle w:val="Forte"/>
+        </w:rPr>
+        <w:t>Proteção (DPS e IDR):</w:t>
+      </w:r>
+      <w:r>
+        <w:rPr>
+          <w:rStyle w:val="Forte"/>
+        </w:rPr>
+        <w:t xml:space="preserve"> </w:t>
+      </w:r>
+      <w:r>
+        <w:rPr>
+          <w:rStyle w:val="Forte"/>
+          <w:b w:val="0"/>
+        </w:rPr>
+        <w:t xml:space="preserve">Mantenha os 3 </w:t>
+      </w:r>
+      <w:proofErr w:type="spellStart"/>
+      <w:r>
+        <w:rPr>
+          <w:rStyle w:val="Forte"/>
+          <w:b w:val="0"/>
+        </w:rPr>
+        <w:t>DPSs</w:t>
+      </w:r>
+      <w:proofErr w:type="spellEnd"/>
+      <w:r>
+        <w:rPr>
+          <w:rStyle w:val="Forte"/>
+          <w:b w:val="0"/>
+        </w:rPr>
+        <w:t xml:space="preserve"> de 275V para proteger contra surtos de raios. O seu IDR de 63A é a proteção vital contra choques elétricos e deve ser testado mensalmente pelo botão "Test".</w:t>
+      </w:r>
+    </w:p>
+    <w:p>
+      <w:pPr>
+        <w:numPr>
+          <w:ilvl w:val="0"/>
+          <w:numId w:val="21"/>
+        </w:numPr>
+        <w:spacing w:after="0" w:line="240" w:lineRule="auto"/>
+        <w:ind w:left="426"/>
+        <w:jc w:val="both"/>
+        <w:rPr>
+          <w:rStyle w:val="Forte"/>
+          <w:b w:val="0"/>
+        </w:rPr>
+      </w:pPr>
+      <w:r>
+        <w:rPr>
+          <w:rStyle w:val="Forte"/>
+        </w:rPr>
+        <w:t>Quadro de Distribuição (QDC</w:t>
+      </w:r>
+      <w:r>
+        <w:rPr>
+          <w:rStyle w:val="Forte"/>
+          <w:b w:val="0"/>
+        </w:rPr>
+        <w:t>):</w:t>
+      </w:r>
+      <w:r>
+        <w:rPr>
+          <w:rStyle w:val="Forte"/>
+          <w:b w:val="0"/>
+        </w:rPr>
+        <w:t xml:space="preserve"> Para acomodar todos esses disjuntores bifásicos, DR e DPS, você precisará</w:t>
+      </w:r>
       <w:bookmarkStart w:id="0" w:name="_GoBack"/>
       <w:bookmarkEnd w:id="0"/>
+      <w:r>
+        <w:rPr>
+          <w:rStyle w:val="Forte"/>
+          <w:b w:val="0"/>
+        </w:rPr>
+        <w:t xml:space="preserve"> de um quadro com capacidade para pelo menos </w:t>
+      </w:r>
+      <w:r>
+        <w:rPr>
+          <w:rStyle w:val="Forte"/>
+          <w:b w:val="0"/>
+        </w:rPr>
+        <w:t>18 a 24 módulos DIN</w:t>
+      </w:r>
+      <w:r>
+        <w:rPr>
+          <w:rStyle w:val="Forte"/>
+          <w:b w:val="0"/>
+        </w:rPr>
+        <w:t>.</w:t>
+      </w:r>
+    </w:p>
+    <w:p>
+      <w:pPr>
+        <w:numPr>
+          <w:ilvl w:val="0"/>
+          <w:numId w:val="21"/>
+        </w:numPr>
+        <w:spacing w:after="0" w:line="240" w:lineRule="auto"/>
+        <w:ind w:left="426"/>
+        <w:jc w:val="both"/>
+        <w:rPr>
+          <w:rStyle w:val="Forte"/>
+          <w:b w:val="0"/>
+        </w:rPr>
+      </w:pPr>
+      <w:r>
+        <w:rPr>
+          <w:rStyle w:val="Forte"/>
+        </w:rPr>
+        <w:t>Uma última dica importante:</w:t>
+      </w:r>
+      <w:r>
+        <w:rPr>
+          <w:rStyle w:val="Forte"/>
+        </w:rPr>
+        <w:t xml:space="preserve"> </w:t>
+      </w:r>
+      <w:r>
+        <w:rPr>
+          <w:rStyle w:val="Forte"/>
+          <w:b w:val="0"/>
+        </w:rPr>
+        <w:t xml:space="preserve">Como </w:t>
+      </w:r>
+      <w:r>
+        <w:rPr>
+          <w:rStyle w:val="Forte"/>
+          <w:b w:val="0"/>
+        </w:rPr>
+        <w:t>temos</w:t>
+      </w:r>
+      <w:r>
+        <w:rPr>
+          <w:rStyle w:val="Forte"/>
+          <w:b w:val="0"/>
+        </w:rPr>
+        <w:t xml:space="preserve"> muitos eletrônicos sensíveis (TV OLED 65" e notebooks), o aterramento deve estar em perfeitas condições para que os </w:t>
+      </w:r>
+      <w:proofErr w:type="spellStart"/>
+      <w:r>
+        <w:rPr>
+          <w:rStyle w:val="Forte"/>
+          <w:b w:val="0"/>
+        </w:rPr>
+        <w:t>DPSs</w:t>
+      </w:r>
+      <w:proofErr w:type="spellEnd"/>
+      <w:r>
+        <w:rPr>
+          <w:rStyle w:val="Forte"/>
+          <w:b w:val="0"/>
+        </w:rPr>
+        <w:t xml:space="preserve"> funcionem corretamente.</w:t>
+      </w:r>
+    </w:p>
+    <w:p>
+      <w:pPr>
+        <w:jc w:val="both"/>
+      </w:pPr>
+    </w:p>
+    <w:p>
+      <w:pPr>
+        <w:jc w:val="both"/>
+        <w:rPr>
+          <w:b/>
+          <w:sz w:val="36"/>
+          <w:szCs w:val="36"/>
+        </w:rPr>
+      </w:pPr>
+      <w:r>
+        <w:rPr>
+          <w:b/>
+          <w:sz w:val="36"/>
+          <w:szCs w:val="36"/>
+        </w:rPr>
+        <w:t>Observação importante:</w:t>
+      </w:r>
+    </w:p>
+    <w:p>
+      <w:pPr>
+        <w:jc w:val="both"/>
+      </w:pPr>
+      <w:r>
+        <w:t xml:space="preserve">Fizemos um exemplo de dimensionamento fora dos cálculos do </w:t>
+      </w:r>
+      <w:proofErr w:type="spellStart"/>
+      <w:r>
+        <w:t>app</w:t>
+      </w:r>
+      <w:proofErr w:type="spellEnd"/>
+      <w:r>
+        <w:t xml:space="preserve"> “Elétrica Residencial” e vimos que é possível termos uma distribuição de carga que faça com que utilizemos vários aparelhos e consigamos utilizar o bifásico sem mudar para o trifásico, mas tenham muita atenção no seguinte:</w:t>
+      </w:r>
+      <w:r>
+        <w:rPr>
+          <w:i/>
+          <w:iCs/>
+        </w:rPr>
+        <w:t xml:space="preserve"> </w:t>
+      </w:r>
+      <w:r>
+        <w:rPr>
+          <w:b/>
+          <w:i/>
+          <w:iCs/>
+        </w:rPr>
+        <w:t>"Dá para usar bifásico se você se policiar para não ligar tudo junto"</w:t>
+      </w:r>
+      <w:r>
+        <w:t>, mas o</w:t>
+      </w:r>
+      <w:r>
+        <w:t xml:space="preserve"> aplicativo diz: </w:t>
+      </w:r>
+      <w:r>
+        <w:rPr>
+          <w:b/>
+          <w:i/>
+          <w:iCs/>
+        </w:rPr>
+        <w:t xml:space="preserve">"Pelas regras da CPFL, com essa potência prevista, somos obrigados a pedir um padrão trifásico para </w:t>
+      </w:r>
+      <w:r>
+        <w:rPr>
+          <w:b/>
+          <w:i/>
+          <w:iCs/>
+        </w:rPr>
+        <w:lastRenderedPageBreak/>
+        <w:t>aprovar o projeto"</w:t>
+      </w:r>
+      <w:r>
+        <w:t>. Ambos estão certos em seus contextos, mas para um projeto real a ser aprovado, a lógica do aplicativo é a mandatória.</w:t>
+      </w:r>
     </w:p>
     <w:sectPr>
       <w:pgSz w:w="11906" w:h="16838" w:code="9"/>
@@ -3080,7 +6040,7 @@
   <w:abstractNum w:abstractNumId="1" w15:restartNumberingAfterBreak="0">
     <w:nsid w:val="05A94DDE"/>
     <w:multiLevelType w:val="hybridMultilevel"/>
-    <w:tmpl w:val="69185904"/>
+    <w:tmpl w:val="3D402D3C"/>
     <w:lvl w:ilvl="0" w:tplc="0409000F">
       <w:start w:val="1"/>
       <w:numFmt w:val="decimal"/>
@@ -3093,16 +6053,16 @@
         <w:rFonts w:hint="default"/>
       </w:rPr>
     </w:lvl>
-    <w:lvl w:ilvl="1" w:tplc="04090003">
-      <w:start w:val="1"/>
-      <w:numFmt w:val="bullet"/>
-      <w:lvlText w:val="o"/>
+    <w:lvl w:ilvl="1" w:tplc="0409000F">
+      <w:start w:val="1"/>
+      <w:numFmt w:val="decimal"/>
+      <w:lvlText w:val="%2."/>
       <w:lvlJc w:val="left"/>
       <w:pPr>
         <w:ind w:left="1440" w:hanging="360"/>
       </w:pPr>
       <w:rPr>
-        <w:rFonts w:ascii="Courier New" w:hAnsi="Courier New" w:cs="Courier New" w:hint="default"/>
+        <w:rFonts w:hint="default"/>
       </w:rPr>
     </w:lvl>
     <w:lvl w:ilvl="2" w:tplc="04090005" w:tentative="1">
@@ -3986,7 +6946,7 @@
   <w:abstractNum w:abstractNumId="8" w15:restartNumberingAfterBreak="0">
     <w:nsid w:val="2A262AF8"/>
     <w:multiLevelType w:val="hybridMultilevel"/>
-    <w:tmpl w:val="8E6C3A82"/>
+    <w:tmpl w:val="F60A8EDA"/>
     <w:lvl w:ilvl="0" w:tplc="04090001">
       <w:start w:val="1"/>
       <w:numFmt w:val="bullet"/>
@@ -4246,6 +7206,119 @@
     </w:lvl>
   </w:abstractNum>
   <w:abstractNum w:abstractNumId="10" w15:restartNumberingAfterBreak="0">
+    <w:nsid w:val="3DED77F6"/>
+    <w:multiLevelType w:val="hybridMultilevel"/>
+    <w:tmpl w:val="D3EEF8CA"/>
+    <w:lvl w:ilvl="0" w:tplc="04090003">
+      <w:start w:val="1"/>
+      <w:numFmt w:val="bullet"/>
+      <w:lvlText w:val="o"/>
+      <w:lvlJc w:val="left"/>
+      <w:pPr>
+        <w:ind w:left="1788" w:hanging="360"/>
+      </w:pPr>
+      <w:rPr>
+        <w:rFonts w:ascii="Courier New" w:hAnsi="Courier New" w:cs="Courier New" w:hint="default"/>
+      </w:rPr>
+    </w:lvl>
+    <w:lvl w:ilvl="1" w:tplc="04090003" w:tentative="1">
+      <w:start w:val="1"/>
+      <w:numFmt w:val="bullet"/>
+      <w:lvlText w:val="o"/>
+      <w:lvlJc w:val="left"/>
+      <w:pPr>
+        <w:ind w:left="2508" w:hanging="360"/>
+      </w:pPr>
+      <w:rPr>
+        <w:rFonts w:ascii="Courier New" w:hAnsi="Courier New" w:cs="Courier New" w:hint="default"/>
+      </w:rPr>
+    </w:lvl>
+    <w:lvl w:ilvl="2" w:tplc="04090005" w:tentative="1">
+      <w:start w:val="1"/>
+      <w:numFmt w:val="bullet"/>
+      <w:lvlText w:val=""/>
+      <w:lvlJc w:val="left"/>
+      <w:pPr>
+        <w:ind w:left="3228" w:hanging="360"/>
+      </w:pPr>
+      <w:rPr>
+        <w:rFonts w:ascii="Wingdings" w:hAnsi="Wingdings" w:hint="default"/>
+      </w:rPr>
+    </w:lvl>
+    <w:lvl w:ilvl="3" w:tplc="04090001" w:tentative="1">
+      <w:start w:val="1"/>
+      <w:numFmt w:val="bullet"/>
+      <w:lvlText w:val=""/>
+      <w:lvlJc w:val="left"/>
+      <w:pPr>
+        <w:ind w:left="3948" w:hanging="360"/>
+      </w:pPr>
+      <w:rPr>
+        <w:rFonts w:ascii="Symbol" w:hAnsi="Symbol" w:hint="default"/>
+      </w:rPr>
+    </w:lvl>
+    <w:lvl w:ilvl="4" w:tplc="04090003" w:tentative="1">
+      <w:start w:val="1"/>
+      <w:numFmt w:val="bullet"/>
+      <w:lvlText w:val="o"/>
+      <w:lvlJc w:val="left"/>
+      <w:pPr>
+        <w:ind w:left="4668" w:hanging="360"/>
+      </w:pPr>
+      <w:rPr>
+        <w:rFonts w:ascii="Courier New" w:hAnsi="Courier New" w:cs="Courier New" w:hint="default"/>
+      </w:rPr>
+    </w:lvl>
+    <w:lvl w:ilvl="5" w:tplc="04090005" w:tentative="1">
+      <w:start w:val="1"/>
+      <w:numFmt w:val="bullet"/>
+      <w:lvlText w:val=""/>
+      <w:lvlJc w:val="left"/>
+      <w:pPr>
+        <w:ind w:left="5388" w:hanging="360"/>
+      </w:pPr>
+      <w:rPr>
+        <w:rFonts w:ascii="Wingdings" w:hAnsi="Wingdings" w:hint="default"/>
+      </w:rPr>
+    </w:lvl>
+    <w:lvl w:ilvl="6" w:tplc="04090001" w:tentative="1">
+      <w:start w:val="1"/>
+      <w:numFmt w:val="bullet"/>
+      <w:lvlText w:val=""/>
+      <w:lvlJc w:val="left"/>
+      <w:pPr>
+        <w:ind w:left="6108" w:hanging="360"/>
+      </w:pPr>
+      <w:rPr>
+        <w:rFonts w:ascii="Symbol" w:hAnsi="Symbol" w:hint="default"/>
+      </w:rPr>
+    </w:lvl>
+    <w:lvl w:ilvl="7" w:tplc="04090003" w:tentative="1">
+      <w:start w:val="1"/>
+      <w:numFmt w:val="bullet"/>
+      <w:lvlText w:val="o"/>
+      <w:lvlJc w:val="left"/>
+      <w:pPr>
+        <w:ind w:left="6828" w:hanging="360"/>
+      </w:pPr>
+      <w:rPr>
+        <w:rFonts w:ascii="Courier New" w:hAnsi="Courier New" w:cs="Courier New" w:hint="default"/>
+      </w:rPr>
+    </w:lvl>
+    <w:lvl w:ilvl="8" w:tplc="04090005" w:tentative="1">
+      <w:start w:val="1"/>
+      <w:numFmt w:val="bullet"/>
+      <w:lvlText w:val=""/>
+      <w:lvlJc w:val="left"/>
+      <w:pPr>
+        <w:ind w:left="7548" w:hanging="360"/>
+      </w:pPr>
+      <w:rPr>
+        <w:rFonts w:ascii="Wingdings" w:hAnsi="Wingdings" w:hint="default"/>
+      </w:rPr>
+    </w:lvl>
+  </w:abstractNum>
+  <w:abstractNum w:abstractNumId="11" w15:restartNumberingAfterBreak="0">
     <w:nsid w:val="453541F4"/>
     <w:multiLevelType w:val="hybridMultilevel"/>
     <w:tmpl w:val="FAFE7DF2"/>
@@ -4358,7 +7431,7 @@
       </w:rPr>
     </w:lvl>
   </w:abstractNum>
-  <w:abstractNum w:abstractNumId="11" w15:restartNumberingAfterBreak="0">
+  <w:abstractNum w:abstractNumId="12" w15:restartNumberingAfterBreak="0">
     <w:nsid w:val="48F35884"/>
     <w:multiLevelType w:val="multilevel"/>
     <w:tmpl w:val="034275CC"/>
@@ -4507,7 +7580,120 @@
       </w:rPr>
     </w:lvl>
   </w:abstractNum>
-  <w:abstractNum w:abstractNumId="12" w15:restartNumberingAfterBreak="0">
+  <w:abstractNum w:abstractNumId="13" w15:restartNumberingAfterBreak="0">
+    <w:nsid w:val="549D572C"/>
+    <w:multiLevelType w:val="hybridMultilevel"/>
+    <w:tmpl w:val="DAD8240C"/>
+    <w:lvl w:ilvl="0" w:tplc="04090003">
+      <w:start w:val="1"/>
+      <w:numFmt w:val="bullet"/>
+      <w:lvlText w:val="o"/>
+      <w:lvlJc w:val="left"/>
+      <w:pPr>
+        <w:ind w:left="1788" w:hanging="360"/>
+      </w:pPr>
+      <w:rPr>
+        <w:rFonts w:ascii="Courier New" w:hAnsi="Courier New" w:cs="Courier New" w:hint="default"/>
+      </w:rPr>
+    </w:lvl>
+    <w:lvl w:ilvl="1" w:tplc="04090003" w:tentative="1">
+      <w:start w:val="1"/>
+      <w:numFmt w:val="bullet"/>
+      <w:lvlText w:val="o"/>
+      <w:lvlJc w:val="left"/>
+      <w:pPr>
+        <w:ind w:left="2508" w:hanging="360"/>
+      </w:pPr>
+      <w:rPr>
+        <w:rFonts w:ascii="Courier New" w:hAnsi="Courier New" w:cs="Courier New" w:hint="default"/>
+      </w:rPr>
+    </w:lvl>
+    <w:lvl w:ilvl="2" w:tplc="04090005" w:tentative="1">
+      <w:start w:val="1"/>
+      <w:numFmt w:val="bullet"/>
+      <w:lvlText w:val=""/>
+      <w:lvlJc w:val="left"/>
+      <w:pPr>
+        <w:ind w:left="3228" w:hanging="360"/>
+      </w:pPr>
+      <w:rPr>
+        <w:rFonts w:ascii="Wingdings" w:hAnsi="Wingdings" w:hint="default"/>
+      </w:rPr>
+    </w:lvl>
+    <w:lvl w:ilvl="3" w:tplc="04090001" w:tentative="1">
+      <w:start w:val="1"/>
+      <w:numFmt w:val="bullet"/>
+      <w:lvlText w:val=""/>
+      <w:lvlJc w:val="left"/>
+      <w:pPr>
+        <w:ind w:left="3948" w:hanging="360"/>
+      </w:pPr>
+      <w:rPr>
+        <w:rFonts w:ascii="Symbol" w:hAnsi="Symbol" w:hint="default"/>
+      </w:rPr>
+    </w:lvl>
+    <w:lvl w:ilvl="4" w:tplc="04090003" w:tentative="1">
+      <w:start w:val="1"/>
+      <w:numFmt w:val="bullet"/>
+      <w:lvlText w:val="o"/>
+      <w:lvlJc w:val="left"/>
+      <w:pPr>
+        <w:ind w:left="4668" w:hanging="360"/>
+      </w:pPr>
+      <w:rPr>
+        <w:rFonts w:ascii="Courier New" w:hAnsi="Courier New" w:cs="Courier New" w:hint="default"/>
+      </w:rPr>
+    </w:lvl>
+    <w:lvl w:ilvl="5" w:tplc="04090005" w:tentative="1">
+      <w:start w:val="1"/>
+      <w:numFmt w:val="bullet"/>
+      <w:lvlText w:val=""/>
+      <w:lvlJc w:val="left"/>
+      <w:pPr>
+        <w:ind w:left="5388" w:hanging="360"/>
+      </w:pPr>
+      <w:rPr>
+        <w:rFonts w:ascii="Wingdings" w:hAnsi="Wingdings" w:hint="default"/>
+      </w:rPr>
+    </w:lvl>
+    <w:lvl w:ilvl="6" w:tplc="04090001" w:tentative="1">
+      <w:start w:val="1"/>
+      <w:numFmt w:val="bullet"/>
+      <w:lvlText w:val=""/>
+      <w:lvlJc w:val="left"/>
+      <w:pPr>
+        <w:ind w:left="6108" w:hanging="360"/>
+      </w:pPr>
+      <w:rPr>
+        <w:rFonts w:ascii="Symbol" w:hAnsi="Symbol" w:hint="default"/>
+      </w:rPr>
+    </w:lvl>
+    <w:lvl w:ilvl="7" w:tplc="04090003" w:tentative="1">
+      <w:start w:val="1"/>
+      <w:numFmt w:val="bullet"/>
+      <w:lvlText w:val="o"/>
+      <w:lvlJc w:val="left"/>
+      <w:pPr>
+        <w:ind w:left="6828" w:hanging="360"/>
+      </w:pPr>
+      <w:rPr>
+        <w:rFonts w:ascii="Courier New" w:hAnsi="Courier New" w:cs="Courier New" w:hint="default"/>
+      </w:rPr>
+    </w:lvl>
+    <w:lvl w:ilvl="8" w:tplc="04090005" w:tentative="1">
+      <w:start w:val="1"/>
+      <w:numFmt w:val="bullet"/>
+      <w:lvlText w:val=""/>
+      <w:lvlJc w:val="left"/>
+      <w:pPr>
+        <w:ind w:left="7548" w:hanging="360"/>
+      </w:pPr>
+      <w:rPr>
+        <w:rFonts w:ascii="Wingdings" w:hAnsi="Wingdings" w:hint="default"/>
+      </w:rPr>
+    </w:lvl>
+  </w:abstractNum>
+  <w:abstractNum w:abstractNumId="14" w15:restartNumberingAfterBreak="0">
     <w:nsid w:val="58CF3B57"/>
     <w:multiLevelType w:val="hybridMultilevel"/>
     <w:tmpl w:val="2CCAADB8"/>
@@ -4620,7 +7806,7 @@
       </w:rPr>
     </w:lvl>
   </w:abstractNum>
-  <w:abstractNum w:abstractNumId="13" w15:restartNumberingAfterBreak="0">
+  <w:abstractNum w:abstractNumId="15" w15:restartNumberingAfterBreak="0">
     <w:nsid w:val="5CFB6106"/>
     <w:multiLevelType w:val="multilevel"/>
     <w:tmpl w:val="D69E02FA"/>
@@ -4769,7 +7955,7 @@
       </w:rPr>
     </w:lvl>
   </w:abstractNum>
-  <w:abstractNum w:abstractNumId="14" w15:restartNumberingAfterBreak="0">
+  <w:abstractNum w:abstractNumId="16" w15:restartNumberingAfterBreak="0">
     <w:nsid w:val="6FF71B3F"/>
     <w:multiLevelType w:val="hybridMultilevel"/>
     <w:tmpl w:val="7310A5C0"/>
@@ -4882,7 +8068,7 @@
       </w:rPr>
     </w:lvl>
   </w:abstractNum>
-  <w:abstractNum w:abstractNumId="15" w15:restartNumberingAfterBreak="0">
+  <w:abstractNum w:abstractNumId="17" w15:restartNumberingAfterBreak="0">
     <w:nsid w:val="764757C2"/>
     <w:multiLevelType w:val="multilevel"/>
     <w:tmpl w:val="D2440BB2"/>
@@ -4995,7 +8181,7 @@
       </w:pPr>
     </w:lvl>
   </w:abstractNum>
-  <w:abstractNum w:abstractNumId="16" w15:restartNumberingAfterBreak="0">
+  <w:abstractNum w:abstractNumId="18" w15:restartNumberingAfterBreak="0">
     <w:nsid w:val="77D16D0C"/>
     <w:multiLevelType w:val="hybridMultilevel"/>
     <w:tmpl w:val="69185904"/>
@@ -5108,7 +8294,156 @@
       </w:rPr>
     </w:lvl>
   </w:abstractNum>
-  <w:abstractNum w:abstractNumId="17" w15:restartNumberingAfterBreak="0">
+  <w:abstractNum w:abstractNumId="19" w15:restartNumberingAfterBreak="0">
+    <w:nsid w:val="780A682C"/>
+    <w:multiLevelType w:val="multilevel"/>
+    <w:tmpl w:val="52585EC6"/>
+    <w:lvl w:ilvl="0">
+      <w:start w:val="1"/>
+      <w:numFmt w:val="bullet"/>
+      <w:lvlText w:val=""/>
+      <w:lvlJc w:val="left"/>
+      <w:pPr>
+        <w:tabs>
+          <w:tab w:val="num" w:pos="2160"/>
+        </w:tabs>
+        <w:ind w:left="2160" w:hanging="360"/>
+      </w:pPr>
+      <w:rPr>
+        <w:rFonts w:ascii="Symbol" w:hAnsi="Symbol" w:hint="default"/>
+        <w:sz w:val="20"/>
+      </w:rPr>
+    </w:lvl>
+    <w:lvl w:ilvl="1" w:tentative="1">
+      <w:start w:val="1"/>
+      <w:numFmt w:val="bullet"/>
+      <w:lvlText w:val="o"/>
+      <w:lvlJc w:val="left"/>
+      <w:pPr>
+        <w:tabs>
+          <w:tab w:val="num" w:pos="2880"/>
+        </w:tabs>
+        <w:ind w:left="2880" w:hanging="360"/>
+      </w:pPr>
+      <w:rPr>
+        <w:rFonts w:ascii="Courier New" w:hAnsi="Courier New" w:hint="default"/>
+        <w:sz w:val="20"/>
+      </w:rPr>
+    </w:lvl>
+    <w:lvl w:ilvl="2" w:tentative="1">
+      <w:start w:val="1"/>
+      <w:numFmt w:val="bullet"/>
+      <w:lvlText w:val=""/>
+      <w:lvlJc w:val="left"/>
+      <w:pPr>
+        <w:tabs>
+          <w:tab w:val="num" w:pos="3600"/>
+        </w:tabs>
+        <w:ind w:left="3600" w:hanging="360"/>
+      </w:pPr>
+      <w:rPr>
+        <w:rFonts w:ascii="Wingdings" w:hAnsi="Wingdings" w:hint="default"/>
+        <w:sz w:val="20"/>
+      </w:rPr>
+    </w:lvl>
+    <w:lvl w:ilvl="3" w:tentative="1">
+      <w:start w:val="1"/>
+      <w:numFmt w:val="bullet"/>
+      <w:lvlText w:val=""/>
+      <w:lvlJc w:val="left"/>
+      <w:pPr>
+        <w:tabs>
+          <w:tab w:val="num" w:pos="4320"/>
+        </w:tabs>
+        <w:ind w:left="4320" w:hanging="360"/>
+      </w:pPr>
+      <w:rPr>
+        <w:rFonts w:ascii="Wingdings" w:hAnsi="Wingdings" w:hint="default"/>
+        <w:sz w:val="20"/>
+      </w:rPr>
+    </w:lvl>
+    <w:lvl w:ilvl="4" w:tentative="1">
+      <w:start w:val="1"/>
+      <w:numFmt w:val="bullet"/>
+      <w:lvlText w:val=""/>
+      <w:lvlJc w:val="left"/>
+      <w:pPr>
+        <w:tabs>
+          <w:tab w:val="num" w:pos="5040"/>
+        </w:tabs>
+        <w:ind w:left="5040" w:hanging="360"/>
+      </w:pPr>
+      <w:rPr>
+        <w:rFonts w:ascii="Wingdings" w:hAnsi="Wingdings" w:hint="default"/>
+        <w:sz w:val="20"/>
+      </w:rPr>
+    </w:lvl>
+    <w:lvl w:ilvl="5" w:tentative="1">
+      <w:start w:val="1"/>
+      <w:numFmt w:val="bullet"/>
+      <w:lvlText w:val=""/>
+      <w:lvlJc w:val="left"/>
+      <w:pPr>
+        <w:tabs>
+          <w:tab w:val="num" w:pos="5760"/>
+        </w:tabs>
+        <w:ind w:left="5760" w:hanging="360"/>
+      </w:pPr>
+      <w:rPr>
+        <w:rFonts w:ascii="Wingdings" w:hAnsi="Wingdings" w:hint="default"/>
+        <w:sz w:val="20"/>
+      </w:rPr>
+    </w:lvl>
+    <w:lvl w:ilvl="6" w:tentative="1">
+      <w:start w:val="1"/>
+      <w:numFmt w:val="bullet"/>
+      <w:lvlText w:val=""/>
+      <w:lvlJc w:val="left"/>
+      <w:pPr>
+        <w:tabs>
+          <w:tab w:val="num" w:pos="6480"/>
+        </w:tabs>
+        <w:ind w:left="6480" w:hanging="360"/>
+      </w:pPr>
+      <w:rPr>
+        <w:rFonts w:ascii="Wingdings" w:hAnsi="Wingdings" w:hint="default"/>
+        <w:sz w:val="20"/>
+      </w:rPr>
+    </w:lvl>
+    <w:lvl w:ilvl="7" w:tentative="1">
+      <w:start w:val="1"/>
+      <w:numFmt w:val="bullet"/>
+      <w:lvlText w:val=""/>
+      <w:lvlJc w:val="left"/>
+      <w:pPr>
+        <w:tabs>
+          <w:tab w:val="num" w:pos="7200"/>
+        </w:tabs>
+        <w:ind w:left="7200" w:hanging="360"/>
+      </w:pPr>
+      <w:rPr>
+        <w:rFonts w:ascii="Wingdings" w:hAnsi="Wingdings" w:hint="default"/>
+        <w:sz w:val="20"/>
+      </w:rPr>
+    </w:lvl>
+    <w:lvl w:ilvl="8" w:tentative="1">
+      <w:start w:val="1"/>
+      <w:numFmt w:val="bullet"/>
+      <w:lvlText w:val=""/>
+      <w:lvlJc w:val="left"/>
+      <w:pPr>
+        <w:tabs>
+          <w:tab w:val="num" w:pos="7920"/>
+        </w:tabs>
+        <w:ind w:left="7920" w:hanging="360"/>
+      </w:pPr>
+      <w:rPr>
+        <w:rFonts w:ascii="Wingdings" w:hAnsi="Wingdings" w:hint="default"/>
+        <w:sz w:val="20"/>
+      </w:rPr>
+    </w:lvl>
+  </w:abstractNum>
+  <w:abstractNum w:abstractNumId="20" w15:restartNumberingAfterBreak="0">
     <w:nsid w:val="7F262DF9"/>
     <w:multiLevelType w:val="multilevel"/>
     <w:tmpl w:val="B8C6FE0A"/>
@@ -5258,10 +8593,10 @@
     </w:lvl>
   </w:abstractNum>
   <w:num w:numId="1">
-    <w:abstractNumId w:val="12"/>
+    <w:abstractNumId w:val="14"/>
   </w:num>
   <w:num w:numId="2">
-    <w:abstractNumId w:val="17"/>
+    <w:abstractNumId w:val="20"/>
   </w:num>
   <w:num w:numId="3">
     <w:abstractNumId w:val="3"/>
@@ -5276,16 +8611,16 @@
     <w:abstractNumId w:val="7"/>
   </w:num>
   <w:num w:numId="7">
-    <w:abstractNumId w:val="13"/>
+    <w:abstractNumId w:val="15"/>
   </w:num>
   <w:num w:numId="8">
     <w:abstractNumId w:val="4"/>
   </w:num>
   <w:num w:numId="9">
-    <w:abstractNumId w:val="15"/>
+    <w:abstractNumId w:val="17"/>
   </w:num>
   <w:num w:numId="10">
-    <w:abstractNumId w:val="16"/>
+    <w:abstractNumId w:val="18"/>
   </w:num>
   <w:num w:numId="11">
     <w:abstractNumId w:val="8"/>
@@ -5294,7 +8629,7 @@
     <w:abstractNumId w:val="6"/>
   </w:num>
   <w:num w:numId="13">
-    <w:abstractNumId w:val="10"/>
+    <w:abstractNumId w:val="11"/>
   </w:num>
   <w:num w:numId="14">
     <w:abstractNumId w:val="0"/>
@@ -5303,13 +8638,22 @@
     <w:abstractNumId w:val="2"/>
   </w:num>
   <w:num w:numId="16">
-    <w:abstractNumId w:val="11"/>
+    <w:abstractNumId w:val="12"/>
   </w:num>
   <w:num w:numId="17">
-    <w:abstractNumId w:val="14"/>
+    <w:abstractNumId w:val="16"/>
   </w:num>
   <w:num w:numId="18">
     <w:abstractNumId w:val="1"/>
+  </w:num>
+  <w:num w:numId="19">
+    <w:abstractNumId w:val="13"/>
+  </w:num>
+  <w:num w:numId="20">
+    <w:abstractNumId w:val="10"/>
+  </w:num>
+  <w:num w:numId="21">
+    <w:abstractNumId w:val="19"/>
   </w:num>
 </w:numbering>
 </file>
@@ -5826,6 +9170,34 @@
       <w:szCs w:val="20"/>
     </w:rPr>
   </w:style>
+  <w:style w:type="character" w:styleId="Forte">
+    <w:name w:val="Strong"/>
+    <w:basedOn w:val="Fontepargpadro"/>
+    <w:uiPriority w:val="22"/>
+    <w:qFormat/>
+    <w:rsid w:val="00341154"/>
+    <w:rPr>
+      <w:b/>
+      <w:bCs/>
+    </w:rPr>
+  </w:style>
+  <w:style w:type="character" w:customStyle="1" w:styleId="t286pc">
+    <w:name w:val="t286pc"/>
+    <w:basedOn w:val="Fontepargpadro"/>
+    <w:rsid w:val="00341154"/>
+  </w:style>
+  <w:style w:type="character" w:styleId="HiperlinkVisitado">
+    <w:name w:val="FollowedHyperlink"/>
+    <w:basedOn w:val="Fontepargpadro"/>
+    <w:uiPriority w:val="99"/>
+    <w:semiHidden/>
+    <w:unhideWhenUsed/>
+    <w:rsid w:val="005805EE"/>
+    <w:rPr>
+      <w:color w:val="954F72" w:themeColor="followedHyperlink"/>
+      <w:u w:val="single"/>
+    </w:rPr>
+  </w:style>
 </w:styles>
 </file>
 

</xml_diff>

<commit_message>
Atualização das distribuidora, agora com maior abrangência. Atualização nos cálculos para suportar estas novas distribuidoras no sistema
</commit_message>
<xml_diff>
--- a/Documentação/Sistema de Cálculo da Elétrica Residencial.docx
+++ b/Documentação/Sistema de Cálculo da Elétrica Residencial.docx
@@ -237,22 +237,20 @@
       <w:pPr>
         <w:spacing w:after="0"/>
       </w:pPr>
-      <w:proofErr w:type="gramStart"/>
-      <w:r>
-        <w:t>visualização</w:t>
-      </w:r>
-      <w:proofErr w:type="gramEnd"/>
-      <w:r>
-        <w:t xml:space="preserve"> de relatórios.</w:t>
+      <w:r>
+        <w:t>visualização de relatórios.</w:t>
       </w:r>
     </w:p>
     <w:p>
       <w:pPr>
         <w:spacing w:after="0"/>
-        <w:rPr>
-          <w:b/>
-        </w:rPr>
-      </w:pPr>
+        <w:jc w:val="both"/>
+        <w:rPr>
+          <w:b/>
+        </w:rPr>
+      </w:pPr>
+      <w:bookmarkStart w:id="0" w:name="_GoBack"/>
+      <w:bookmarkEnd w:id="0"/>
     </w:p>
     <w:p>
       <w:pPr>
@@ -3080,10 +3078,7 @@
         <w:t>Iremos f</w:t>
       </w:r>
       <w:r>
-        <w:t>azer uma l</w:t>
-      </w:r>
-      <w:r>
-        <w:t>ista completa de cômodos e equipamentos</w:t>
+        <w:t>azer uma lista completa de cômodos e equipamentos</w:t>
       </w:r>
       <w:r>
         <w:t xml:space="preserve"> para calcular a carga total de um </w:t>
@@ -3095,10 +3090,7 @@
         <w:t xml:space="preserve"> e verificar</w:t>
       </w:r>
       <w:r>
-        <w:t>:</w:t>
-      </w:r>
-      <w:r>
-        <w:t xml:space="preserve"> </w:t>
+        <w:t xml:space="preserve">: </w:t>
       </w:r>
     </w:p>
     <w:p>
@@ -3111,10 +3103,7 @@
         <w:jc w:val="both"/>
       </w:pPr>
       <w:r>
-        <w:t>Se a soma de tudo o que você tem corre o risco de desarmar o disjuntor de 63A.</w:t>
-      </w:r>
-      <w:r>
-        <w:t xml:space="preserve"> </w:t>
+        <w:t xml:space="preserve">Se a soma de tudo o que você tem corre o risco de desarmar o disjuntor de 63A. </w:t>
       </w:r>
     </w:p>
     <w:p>
@@ -3127,10 +3116,7 @@
         <w:jc w:val="both"/>
       </w:pPr>
       <w:r>
-        <w:t>Quais equipamentos podem funcionar juntos ao mesmo tempo com total segurança.</w:t>
-      </w:r>
-      <w:r>
-        <w:t xml:space="preserve"> </w:t>
+        <w:t xml:space="preserve">Quais equipamentos podem funcionar juntos ao mesmo tempo com total segurança. </w:t>
       </w:r>
     </w:p>
     <w:p>
@@ -3143,13 +3129,7 @@
         <w:jc w:val="both"/>
       </w:pPr>
       <w:r>
-        <w:t>Se haverá necessidade de pedir aumento de carga para a concessionária de energia.</w:t>
-      </w:r>
-      <w:r>
-        <w:t xml:space="preserve"> </w:t>
-      </w:r>
-      <w:r>
-        <w:t xml:space="preserve">Pode listar os principais vilões de consumo (chuveiros, ar-condicionado, </w:t>
+        <w:t xml:space="preserve">Se haverá necessidade de pedir aumento de carga para a concessionária de energia. Pode listar os principais vilões de consumo (chuveiros, ar-condicionado, </w:t>
       </w:r>
       <w:proofErr w:type="spellStart"/>
       <w:r>
@@ -3179,10 +3159,7 @@
         <w:jc w:val="both"/>
       </w:pPr>
       <w:r>
-        <w:t>C</w:t>
-      </w:r>
-      <w:r>
-        <w:t>orredor de entrada de 2,5 X1,5 e uma luminária;</w:t>
+        <w:t>Corredor de entrada de 2,5 X1,5 e uma luminária;</w:t>
       </w:r>
     </w:p>
     <w:p>
@@ -3588,13 +3565,7 @@
         <w:rPr>
           <w:b/>
         </w:rPr>
-        <w:t>C</w:t>
-      </w:r>
-      <w:r>
-        <w:rPr>
-          <w:b/>
-        </w:rPr>
-        <w:t xml:space="preserve">álculo da Demanda Estimada do apartamento. </w:t>
+        <w:t xml:space="preserve">Cálculo da Demanda Estimada do apartamento. </w:t>
       </w:r>
     </w:p>
     <w:p>
@@ -4106,10 +4077,7 @@
         <w:t>A i</w:t>
       </w:r>
       <w:r>
-        <w:t>n</w:t>
-      </w:r>
-      <w:r>
-        <w:t xml:space="preserve">stalação </w:t>
+        <w:t xml:space="preserve">nstalação </w:t>
       </w:r>
       <w:r>
         <w:t xml:space="preserve">está </w:t>
@@ -4176,19 +4144,7 @@
         <w:jc w:val="both"/>
       </w:pPr>
       <w:r>
-        <w:t xml:space="preserve">Como </w:t>
-      </w:r>
-      <w:r>
-        <w:t>é</w:t>
-      </w:r>
-      <w:r>
-        <w:t xml:space="preserve"> utiliza</w:t>
-      </w:r>
-      <w:r>
-        <w:t>do</w:t>
-      </w:r>
-      <w:r>
-        <w:t xml:space="preserve"> apenas disjuntores bifásicos, todos devem ser do tipo </w:t>
+        <w:t xml:space="preserve">Como é utilizado apenas disjuntores bifásicos, todos devem ser do tipo </w:t>
       </w:r>
       <w:r>
         <w:rPr>
@@ -5643,21 +5599,7 @@
           <w:rStyle w:val="Forte"/>
           <w:b w:val="0"/>
         </w:rPr>
-        <w:t xml:space="preserve">Utilize um </w:t>
-      </w:r>
-      <w:r>
-        <w:rPr>
-          <w:rStyle w:val="Forte"/>
-          <w:b w:val="0"/>
-        </w:rPr>
-        <w:t>barramento pente bifásico de 63A</w:t>
-      </w:r>
-      <w:r>
-        <w:rPr>
-          <w:rStyle w:val="Forte"/>
-          <w:b w:val="0"/>
-        </w:rPr>
-        <w:t xml:space="preserve"> para interconectar os disjuntores. Isso elimina o uso de "jumpers" (pontes de fios), que são pontos comuns de aquecimento e falhas.</w:t>
+        <w:t>Utilize um barramento pente bifásico de 63A para interconectar os disjuntores. Isso elimina o uso de "jumpers" (pontes de fios), que são pontos comuns de aquecimento e falhas.</w:t>
       </w:r>
     </w:p>
     <w:p>
@@ -5735,37 +5677,7 @@
           <w:rStyle w:val="Forte"/>
           <w:b w:val="0"/>
         </w:rPr>
-        <w:t>):</w:t>
-      </w:r>
-      <w:r>
-        <w:rPr>
-          <w:rStyle w:val="Forte"/>
-          <w:b w:val="0"/>
-        </w:rPr>
-        <w:t xml:space="preserve"> Para acomodar todos esses disjuntores bifásicos, DR e DPS, você precisará</w:t>
-      </w:r>
-      <w:bookmarkStart w:id="0" w:name="_GoBack"/>
-      <w:bookmarkEnd w:id="0"/>
-      <w:r>
-        <w:rPr>
-          <w:rStyle w:val="Forte"/>
-          <w:b w:val="0"/>
-        </w:rPr>
-        <w:t xml:space="preserve"> de um quadro com capacidade para pelo menos </w:t>
-      </w:r>
-      <w:r>
-        <w:rPr>
-          <w:rStyle w:val="Forte"/>
-          <w:b w:val="0"/>
-        </w:rPr>
-        <w:t>18 a 24 módulos DIN</w:t>
-      </w:r>
-      <w:r>
-        <w:rPr>
-          <w:rStyle w:val="Forte"/>
-          <w:b w:val="0"/>
-        </w:rPr>
-        <w:t>.</w:t>
+        <w:t>): Para acomodar todos esses disjuntores bifásicos, DR e DPS, você precisará de um quadro com capacidade para pelo menos 18 a 24 módulos DIN.</w:t>
       </w:r>
     </w:p>
     <w:p>
@@ -5886,10 +5798,7 @@
         <w:t>"Dá para usar bifásico se você se policiar para não ligar tudo junto"</w:t>
       </w:r>
       <w:r>
-        <w:t>, mas o</w:t>
-      </w:r>
-      <w:r>
-        <w:t xml:space="preserve"> aplicativo diz: </w:t>
+        <w:t xml:space="preserve">, mas o aplicativo diz: </w:t>
       </w:r>
       <w:r>
         <w:rPr>

</xml_diff>

<commit_message>
Atualizado cores na lista das distribuidoras
</commit_message>
<xml_diff>
--- a/Documentação/Sistema de Cálculo da Elétrica Residencial.docx
+++ b/Documentação/Sistema de Cálculo da Elétrica Residencial.docx
@@ -232,25 +232,20 @@
       <w:r>
         <w:t>O aplicativo é dividido em três abas principais para inserção de dados e painéis para</w:t>
       </w:r>
+      <w:r>
+        <w:t xml:space="preserve"> </w:t>
+      </w:r>
+      <w:r>
+        <w:t>visualização de relatórios.</w:t>
+      </w:r>
     </w:p>
     <w:p>
       <w:pPr>
         <w:spacing w:after="0"/>
-      </w:pPr>
-      <w:r>
-        <w:t>visualização de relatórios.</w:t>
-      </w:r>
-    </w:p>
-    <w:p>
-      <w:pPr>
-        <w:spacing w:after="0"/>
-        <w:jc w:val="both"/>
-        <w:rPr>
-          <w:b/>
-        </w:rPr>
-      </w:pPr>
-      <w:bookmarkStart w:id="0" w:name="_GoBack"/>
-      <w:bookmarkEnd w:id="0"/>
+        <w:rPr>
+          <w:b/>
+        </w:rPr>
+      </w:pPr>
     </w:p>
     <w:p>
       <w:pPr>
@@ -283,7 +278,13 @@
         <w:jc w:val="both"/>
       </w:pPr>
       <w:r>
-        <w:t>Esta é a aba inicial onde você define as configurações base da residência. Nela, você escolherá:</w:t>
+        <w:t xml:space="preserve">Esta é a aba inicial onde você define as configurações base da residência. </w:t>
+      </w:r>
+      <w:r>
+        <w:t>Com estas escolhas junto com as escolhas das outras abas serão feitos os cálculos</w:t>
+      </w:r>
+      <w:r>
+        <w:t>:</w:t>
       </w:r>
     </w:p>
     <w:p>
@@ -351,7 +352,10 @@
         <w:jc w:val="both"/>
       </w:pPr>
       <w:r>
-        <w:t>Distribuidora de Energia: A concessionária local (CPFL, Enel, Neoenergia, EDP).</w:t>
+        <w:t xml:space="preserve">Distribuidora de Energia: </w:t>
+      </w:r>
+      <w:r>
+        <w:t xml:space="preserve">Várias distribuidoras muito utilizadas no país. </w:t>
       </w:r>
     </w:p>
     <w:p>
@@ -362,18 +366,11 @@
         <w:jc w:val="center"/>
       </w:pPr>
       <w:r>
-        <w:rPr>
-          <w:b/>
-          <w:noProof/>
-          <w:sz w:val="28"/>
-          <w:szCs w:val="28"/>
-          <w:lang w:val="en-US"/>
-        </w:rPr>
         <w:drawing>
-          <wp:inline distT="0" distB="0" distL="0" distR="0" wp14:anchorId="7F050FCB" wp14:editId="003BECD0">
-            <wp:extent cx="976185" cy="1628775"/>
-            <wp:effectExtent l="0" t="0" r="0" b="0"/>
-            <wp:docPr id="2" name="Imagem 2"/>
+          <wp:inline distT="0" distB="0" distL="0" distR="0" wp14:anchorId="5C0C9466" wp14:editId="646C2D6F">
+            <wp:extent cx="1062535" cy="1924050"/>
+            <wp:effectExtent l="0" t="0" r="4445" b="0"/>
+            <wp:docPr id="9" name="Imagem 9"/>
             <wp:cNvGraphicFramePr>
               <a:graphicFrameLocks xmlns:a="http://schemas.openxmlformats.org/drawingml/2006/main" noChangeAspect="1"/>
             </wp:cNvGraphicFramePr>
@@ -393,7 +390,47 @@
                   <pic:spPr>
                     <a:xfrm>
                       <a:off x="0" y="0"/>
-                      <a:ext cx="1022950" cy="1706803"/>
+                      <a:ext cx="1076352" cy="1949071"/>
+                    </a:xfrm>
+                    <a:prstGeom prst="rect">
+                      <a:avLst/>
+                    </a:prstGeom>
+                  </pic:spPr>
+                </pic:pic>
+              </a:graphicData>
+            </a:graphic>
+          </wp:inline>
+        </w:drawing>
+      </w:r>
+      <w:r>
+        <w:t xml:space="preserve">    </w:t>
+      </w:r>
+      <w:r>
+        <w:drawing>
+          <wp:inline distT="0" distB="0" distL="0" distR="0" wp14:anchorId="1D0DC9AE" wp14:editId="6625267B">
+            <wp:extent cx="1039314" cy="1914525"/>
+            <wp:effectExtent l="0" t="0" r="8890" b="0"/>
+            <wp:docPr id="10" name="Imagem 10"/>
+            <wp:cNvGraphicFramePr>
+              <a:graphicFrameLocks xmlns:a="http://schemas.openxmlformats.org/drawingml/2006/main" noChangeAspect="1"/>
+            </wp:cNvGraphicFramePr>
+            <a:graphic xmlns:a="http://schemas.openxmlformats.org/drawingml/2006/main">
+              <a:graphicData uri="http://schemas.openxmlformats.org/drawingml/2006/picture">
+                <pic:pic xmlns:pic="http://schemas.openxmlformats.org/drawingml/2006/picture">
+                  <pic:nvPicPr>
+                    <pic:cNvPr id="1" name=""/>
+                    <pic:cNvPicPr/>
+                  </pic:nvPicPr>
+                  <pic:blipFill>
+                    <a:blip r:embed="rId8"/>
+                    <a:stretch>
+                      <a:fillRect/>
+                    </a:stretch>
+                  </pic:blipFill>
+                  <pic:spPr>
+                    <a:xfrm>
+                      <a:off x="0" y="0"/>
+                      <a:ext cx="1056086" cy="1945421"/>
                     </a:xfrm>
                     <a:prstGeom prst="rect">
                       <a:avLst/>
@@ -585,7 +622,7 @@
                     <pic:cNvPicPr/>
                   </pic:nvPicPr>
                   <pic:blipFill>
-                    <a:blip r:embed="rId8"/>
+                    <a:blip r:embed="rId9"/>
                     <a:stretch>
                       <a:fillRect/>
                     </a:stretch>
@@ -615,115 +652,6 @@
             <wp:extent cx="1325167" cy="1400175"/>
             <wp:effectExtent l="0" t="0" r="8890" b="0"/>
             <wp:docPr id="15" name="Imagem 15"/>
-            <wp:cNvGraphicFramePr>
-              <a:graphicFrameLocks xmlns:a="http://schemas.openxmlformats.org/drawingml/2006/main" noChangeAspect="1"/>
-            </wp:cNvGraphicFramePr>
-            <a:graphic xmlns:a="http://schemas.openxmlformats.org/drawingml/2006/main">
-              <a:graphicData uri="http://schemas.openxmlformats.org/drawingml/2006/picture">
-                <pic:pic xmlns:pic="http://schemas.openxmlformats.org/drawingml/2006/picture">
-                  <pic:nvPicPr>
-                    <pic:cNvPr id="1" name=""/>
-                    <pic:cNvPicPr/>
-                  </pic:nvPicPr>
-                  <pic:blipFill>
-                    <a:blip r:embed="rId9"/>
-                    <a:stretch>
-                      <a:fillRect/>
-                    </a:stretch>
-                  </pic:blipFill>
-                  <pic:spPr>
-                    <a:xfrm>
-                      <a:off x="0" y="0"/>
-                      <a:ext cx="1364576" cy="1441814"/>
-                    </a:xfrm>
-                    <a:prstGeom prst="rect">
-                      <a:avLst/>
-                    </a:prstGeom>
-                  </pic:spPr>
-                </pic:pic>
-              </a:graphicData>
-            </a:graphic>
-          </wp:inline>
-        </w:drawing>
-      </w:r>
-    </w:p>
-    <w:p>
-      <w:pPr>
-        <w:pStyle w:val="PargrafodaLista"/>
-        <w:numPr>
-          <w:ilvl w:val="0"/>
-          <w:numId w:val="11"/>
-        </w:numPr>
-        <w:spacing w:after="0"/>
-        <w:jc w:val="both"/>
-      </w:pPr>
-      <w:r>
-        <w:t>Insira as Dimensões do Ambiente (Área em m2 e Perímetro em m). Dica: Caso tenha dúvidas sobre essas medidas, clique no botão "Dica de Cálculo" para encontrar informações de como calcular.</w:t>
-      </w:r>
-    </w:p>
-    <w:p>
-      <w:pPr>
-        <w:pStyle w:val="PargrafodaLista"/>
-        <w:numPr>
-          <w:ilvl w:val="0"/>
-          <w:numId w:val="11"/>
-        </w:numPr>
-        <w:spacing w:after="0"/>
-        <w:jc w:val="both"/>
-      </w:pPr>
-      <w:r>
-        <w:t xml:space="preserve">Clique em </w:t>
-      </w:r>
-      <w:r>
-        <w:rPr>
-          <w:b/>
-        </w:rPr>
-        <w:t>Dimensionar</w:t>
-      </w:r>
-      <w:r>
-        <w:t>. O aplicativo calculará a quantidade mínima de tomadas exigida por norma e os dados elétricos necessários para o Quadro Geral.</w:t>
-      </w:r>
-    </w:p>
-    <w:p>
-      <w:pPr>
-        <w:pStyle w:val="PargrafodaLista"/>
-        <w:numPr>
-          <w:ilvl w:val="0"/>
-          <w:numId w:val="11"/>
-        </w:numPr>
-        <w:spacing w:after="0"/>
-        <w:jc w:val="both"/>
-      </w:pPr>
-      <w:r>
-        <w:t xml:space="preserve">O botão </w:t>
-      </w:r>
-      <w:r>
-        <w:rPr>
-          <w:b/>
-        </w:rPr>
-        <w:t>Adicionar Cômodo</w:t>
-      </w:r>
-      <w:r>
-        <w:t xml:space="preserve"> ficará verde. Clique nele para armazenar as informações para o Quadro Geral.</w:t>
-      </w:r>
-    </w:p>
-    <w:p>
-      <w:pPr>
-        <w:pStyle w:val="PargrafodaLista"/>
-        <w:spacing w:after="0"/>
-        <w:ind w:right="-711"/>
-        <w:jc w:val="center"/>
-      </w:pPr>
-      <w:r>
-        <w:rPr>
-          <w:noProof/>
-          <w:lang w:val="en-US"/>
-        </w:rPr>
-        <w:drawing>
-          <wp:inline distT="0" distB="0" distL="0" distR="0" wp14:anchorId="4F3B0C8A" wp14:editId="275CDA02">
-            <wp:extent cx="1045319" cy="1790700"/>
-            <wp:effectExtent l="0" t="0" r="2540" b="0"/>
-            <wp:docPr id="22" name="Imagem 22"/>
             <wp:cNvGraphicFramePr>
               <a:graphicFrameLocks xmlns:a="http://schemas.openxmlformats.org/drawingml/2006/main" noChangeAspect="1"/>
             </wp:cNvGraphicFramePr>
@@ -743,6 +671,115 @@
                   <pic:spPr>
                     <a:xfrm>
                       <a:off x="0" y="0"/>
+                      <a:ext cx="1364576" cy="1441814"/>
+                    </a:xfrm>
+                    <a:prstGeom prst="rect">
+                      <a:avLst/>
+                    </a:prstGeom>
+                  </pic:spPr>
+                </pic:pic>
+              </a:graphicData>
+            </a:graphic>
+          </wp:inline>
+        </w:drawing>
+      </w:r>
+    </w:p>
+    <w:p>
+      <w:pPr>
+        <w:pStyle w:val="PargrafodaLista"/>
+        <w:numPr>
+          <w:ilvl w:val="0"/>
+          <w:numId w:val="11"/>
+        </w:numPr>
+        <w:spacing w:after="0"/>
+        <w:jc w:val="both"/>
+      </w:pPr>
+      <w:r>
+        <w:t>Insira as Dimensões do Ambiente (Área em m2 e Perímetro em m). Dica: Caso tenha dúvidas sobre essas medidas, clique no botão "Dica de Cálculo" para encontrar informações de como calcular.</w:t>
+      </w:r>
+    </w:p>
+    <w:p>
+      <w:pPr>
+        <w:pStyle w:val="PargrafodaLista"/>
+        <w:numPr>
+          <w:ilvl w:val="0"/>
+          <w:numId w:val="11"/>
+        </w:numPr>
+        <w:spacing w:after="0"/>
+        <w:jc w:val="both"/>
+      </w:pPr>
+      <w:r>
+        <w:t xml:space="preserve">Clique em </w:t>
+      </w:r>
+      <w:r>
+        <w:rPr>
+          <w:b/>
+        </w:rPr>
+        <w:t>Dimensionar</w:t>
+      </w:r>
+      <w:r>
+        <w:t>. O aplicativo calculará a quantidade mínima de tomadas exigida por norma e os dados elétricos necessários para o Quadro Geral.</w:t>
+      </w:r>
+    </w:p>
+    <w:p>
+      <w:pPr>
+        <w:pStyle w:val="PargrafodaLista"/>
+        <w:numPr>
+          <w:ilvl w:val="0"/>
+          <w:numId w:val="11"/>
+        </w:numPr>
+        <w:spacing w:after="0"/>
+        <w:jc w:val="both"/>
+      </w:pPr>
+      <w:r>
+        <w:t xml:space="preserve">O botão </w:t>
+      </w:r>
+      <w:r>
+        <w:rPr>
+          <w:b/>
+        </w:rPr>
+        <w:t>Adicionar Cômodo</w:t>
+      </w:r>
+      <w:r>
+        <w:t xml:space="preserve"> ficará verde. Clique nele para armazenar as informações para o Quadro Geral.</w:t>
+      </w:r>
+    </w:p>
+    <w:p>
+      <w:pPr>
+        <w:pStyle w:val="PargrafodaLista"/>
+        <w:spacing w:after="0"/>
+        <w:ind w:right="-711"/>
+        <w:jc w:val="center"/>
+      </w:pPr>
+      <w:r>
+        <w:rPr>
+          <w:noProof/>
+          <w:lang w:val="en-US"/>
+        </w:rPr>
+        <w:drawing>
+          <wp:inline distT="0" distB="0" distL="0" distR="0" wp14:anchorId="4F3B0C8A" wp14:editId="275CDA02">
+            <wp:extent cx="1045319" cy="1790700"/>
+            <wp:effectExtent l="0" t="0" r="2540" b="0"/>
+            <wp:docPr id="22" name="Imagem 22"/>
+            <wp:cNvGraphicFramePr>
+              <a:graphicFrameLocks xmlns:a="http://schemas.openxmlformats.org/drawingml/2006/main" noChangeAspect="1"/>
+            </wp:cNvGraphicFramePr>
+            <a:graphic xmlns:a="http://schemas.openxmlformats.org/drawingml/2006/main">
+              <a:graphicData uri="http://schemas.openxmlformats.org/drawingml/2006/picture">
+                <pic:pic xmlns:pic="http://schemas.openxmlformats.org/drawingml/2006/picture">
+                  <pic:nvPicPr>
+                    <pic:cNvPr id="1" name=""/>
+                    <pic:cNvPicPr/>
+                  </pic:nvPicPr>
+                  <pic:blipFill>
+                    <a:blip r:embed="rId11"/>
+                    <a:stretch>
+                      <a:fillRect/>
+                    </a:stretch>
+                  </pic:blipFill>
+                  <pic:spPr>
+                    <a:xfrm>
+                      <a:off x="0" y="0"/>
                       <a:ext cx="1068912" cy="1831117"/>
                     </a:xfrm>
                     <a:prstGeom prst="rect">
@@ -819,7 +856,7 @@
                     <pic:cNvPicPr/>
                   </pic:nvPicPr>
                   <pic:blipFill>
-                    <a:blip r:embed="rId11"/>
+                    <a:blip r:embed="rId12"/>
                     <a:stretch>
                       <a:fillRect/>
                     </a:stretch>
@@ -1007,7 +1044,7 @@
                     <pic:cNvPicPr/>
                   </pic:nvPicPr>
                   <pic:blipFill>
-                    <a:blip r:embed="rId12"/>
+                    <a:blip r:embed="rId13"/>
                     <a:stretch>
                       <a:fillRect/>
                     </a:stretch>
@@ -1040,91 +1077,6 @@
             <wp:extent cx="1914100" cy="1752600"/>
             <wp:effectExtent l="0" t="0" r="0" b="0"/>
             <wp:docPr id="25" name="Imagem 25"/>
-            <wp:cNvGraphicFramePr>
-              <a:graphicFrameLocks xmlns:a="http://schemas.openxmlformats.org/drawingml/2006/main" noChangeAspect="1"/>
-            </wp:cNvGraphicFramePr>
-            <a:graphic xmlns:a="http://schemas.openxmlformats.org/drawingml/2006/main">
-              <a:graphicData uri="http://schemas.openxmlformats.org/drawingml/2006/picture">
-                <pic:pic xmlns:pic="http://schemas.openxmlformats.org/drawingml/2006/picture">
-                  <pic:nvPicPr>
-                    <pic:cNvPr id="1" name=""/>
-                    <pic:cNvPicPr/>
-                  </pic:nvPicPr>
-                  <pic:blipFill>
-                    <a:blip r:embed="rId13"/>
-                    <a:stretch>
-                      <a:fillRect/>
-                    </a:stretch>
-                  </pic:blipFill>
-                  <pic:spPr>
-                    <a:xfrm>
-                      <a:off x="0" y="0"/>
-                      <a:ext cx="1992092" cy="1824011"/>
-                    </a:xfrm>
-                    <a:prstGeom prst="rect">
-                      <a:avLst/>
-                    </a:prstGeom>
-                  </pic:spPr>
-                </pic:pic>
-              </a:graphicData>
-            </a:graphic>
-          </wp:inline>
-        </w:drawing>
-      </w:r>
-    </w:p>
-    <w:p>
-      <w:pPr>
-        <w:pStyle w:val="PargrafodaLista"/>
-        <w:spacing w:after="0"/>
-        <w:ind w:left="360"/>
-        <w:jc w:val="center"/>
-      </w:pPr>
-    </w:p>
-    <w:p>
-      <w:pPr>
-        <w:pStyle w:val="PargrafodaLista"/>
-        <w:numPr>
-          <w:ilvl w:val="0"/>
-          <w:numId w:val="11"/>
-        </w:numPr>
-        <w:spacing w:after="0"/>
-        <w:jc w:val="both"/>
-      </w:pPr>
-      <w:r>
-        <w:t>A Potência (Watts) será preenchida automaticamente (podendo ser editada). Clique em Dimensionar para obter os dados elétricos (Corrente, Cabo Ideal e Disjuntor).</w:t>
-      </w:r>
-    </w:p>
-    <w:p>
-      <w:pPr>
-        <w:pStyle w:val="PargrafodaLista"/>
-        <w:numPr>
-          <w:ilvl w:val="0"/>
-          <w:numId w:val="11"/>
-        </w:numPr>
-        <w:spacing w:after="0"/>
-        <w:jc w:val="both"/>
-      </w:pPr>
-      <w:r>
-        <w:t>O botão Adicionar TUE ficará verde. Clique nele para armazenar as informações. Caso tenha que colocar dois equipamentos iguais, clique em dimensionar e adicionar novamente.</w:t>
-      </w:r>
-    </w:p>
-    <w:p>
-      <w:pPr>
-        <w:pStyle w:val="PargrafodaLista"/>
-        <w:spacing w:after="0"/>
-        <w:ind w:left="360"/>
-        <w:jc w:val="center"/>
-      </w:pPr>
-      <w:r>
-        <w:rPr>
-          <w:noProof/>
-          <w:lang w:val="en-US"/>
-        </w:rPr>
-        <w:drawing>
-          <wp:inline distT="0" distB="0" distL="0" distR="0" wp14:anchorId="6C7D84EF" wp14:editId="2661A94E">
-            <wp:extent cx="2096235" cy="3600450"/>
-            <wp:effectExtent l="0" t="0" r="0" b="0"/>
-            <wp:docPr id="27" name="Imagem 27"/>
             <wp:cNvGraphicFramePr>
               <a:graphicFrameLocks xmlns:a="http://schemas.openxmlformats.org/drawingml/2006/main" noChangeAspect="1"/>
             </wp:cNvGraphicFramePr>
@@ -1144,7 +1096,7 @@
                   <pic:spPr>
                     <a:xfrm>
                       <a:off x="0" y="0"/>
-                      <a:ext cx="2157143" cy="3705064"/>
+                      <a:ext cx="1992092" cy="1824011"/>
                     </a:xfrm>
                     <a:prstGeom prst="rect">
                       <a:avLst/>
@@ -1156,19 +1108,60 @@
           </wp:inline>
         </w:drawing>
       </w:r>
-      <w:r>
-        <w:t xml:space="preserve">       </w:t>
-      </w:r>
+    </w:p>
+    <w:p>
+      <w:pPr>
+        <w:pStyle w:val="PargrafodaLista"/>
+        <w:spacing w:after="0"/>
+        <w:ind w:left="360"/>
+        <w:jc w:val="center"/>
+      </w:pPr>
+    </w:p>
+    <w:p>
+      <w:pPr>
+        <w:pStyle w:val="PargrafodaLista"/>
+        <w:numPr>
+          <w:ilvl w:val="0"/>
+          <w:numId w:val="11"/>
+        </w:numPr>
+        <w:spacing w:after="0"/>
+        <w:jc w:val="both"/>
+      </w:pPr>
+      <w:r>
+        <w:t>A Potência (Watts) será preenchida automaticamente (podendo ser editada). Clique em Dimensionar para obter os dados elétricos (Corrente, Cabo Ideal e Disjuntor).</w:t>
+      </w:r>
+    </w:p>
+    <w:p>
+      <w:pPr>
+        <w:pStyle w:val="PargrafodaLista"/>
+        <w:numPr>
+          <w:ilvl w:val="0"/>
+          <w:numId w:val="11"/>
+        </w:numPr>
+        <w:spacing w:after="0"/>
+        <w:jc w:val="both"/>
+      </w:pPr>
+      <w:r>
+        <w:t>O botão Adicionar TUE ficará verde. Clique nele para armazenar as informações. Caso tenha que colocar dois equipamentos iguais, clique em dimensionar e adicionar novamente.</w:t>
+      </w:r>
+    </w:p>
+    <w:p>
+      <w:pPr>
+        <w:pStyle w:val="PargrafodaLista"/>
+        <w:spacing w:after="0"/>
+        <w:ind w:left="360"/>
+        <w:jc w:val="center"/>
+      </w:pPr>
       <w:r>
         <w:rPr>
           <w:noProof/>
           <w:lang w:val="en-US"/>
         </w:rPr>
         <w:drawing>
-          <wp:inline distT="0" distB="0" distL="0" distR="0" wp14:anchorId="0BA8DF25" wp14:editId="68853EB1">
-            <wp:extent cx="2112042" cy="3589875"/>
-            <wp:effectExtent l="0" t="0" r="2540" b="0"/>
-            <wp:docPr id="28" name="Imagem 28"/>
+          <wp:inline distT="0" distB="0" distL="0" distR="0" wp14:anchorId="6C7D84EF" wp14:editId="2661A94E">
+            <wp:extent cx="2096235" cy="3600450"/>
+            <wp:effectExtent l="0" t="0" r="0" b="0"/>
+            <wp:docPr id="27" name="Imagem 27"/>
             <wp:cNvGraphicFramePr>
               <a:graphicFrameLocks xmlns:a="http://schemas.openxmlformats.org/drawingml/2006/main" noChangeAspect="1"/>
             </wp:cNvGraphicFramePr>
@@ -1188,7 +1181,7 @@
                   <pic:spPr>
                     <a:xfrm>
                       <a:off x="0" y="0"/>
-                      <a:ext cx="2269518" cy="3857539"/>
+                      <a:ext cx="2157143" cy="3705064"/>
                     </a:xfrm>
                     <a:prstGeom prst="rect">
                       <a:avLst/>
@@ -1200,63 +1193,19 @@
           </wp:inline>
         </w:drawing>
       </w:r>
-    </w:p>
-    <w:p>
-      <w:pPr>
-        <w:spacing w:after="0"/>
-        <w:jc w:val="both"/>
-      </w:pPr>
-    </w:p>
-    <w:p>
-      <w:pPr>
-        <w:pStyle w:val="PargrafodaLista"/>
-        <w:numPr>
-          <w:ilvl w:val="0"/>
-          <w:numId w:val="10"/>
-        </w:numPr>
-        <w:spacing w:after="0"/>
-        <w:jc w:val="both"/>
-        <w:rPr>
-          <w:b/>
-        </w:rPr>
-      </w:pPr>
-      <w:r>
-        <w:rPr>
-          <w:b/>
-        </w:rPr>
-        <w:lastRenderedPageBreak/>
-        <w:t>Aba Quadro Geral (Relatório e Dimensionamento)</w:t>
-      </w:r>
-    </w:p>
-    <w:p>
-      <w:pPr>
-        <w:pStyle w:val="PargrafodaLista"/>
-        <w:spacing w:after="0"/>
-        <w:ind w:left="360"/>
-        <w:jc w:val="both"/>
-      </w:pPr>
-      <w:r>
-        <w:t xml:space="preserve">Esta aba é o demonstrativo de todos os Cômodos e Dispositivos inseridos na composição da residência. </w:t>
-      </w:r>
-    </w:p>
-    <w:p>
-      <w:pPr>
-        <w:pStyle w:val="PargrafodaLista"/>
-        <w:spacing w:after="0"/>
-        <w:ind w:left="360"/>
-        <w:jc w:val="center"/>
-      </w:pPr>
-      <w:r>
-        <w:rPr>
-          <w:b/>
+      <w:r>
+        <w:t xml:space="preserve">       </w:t>
+      </w:r>
+      <w:r>
+        <w:rPr>
           <w:noProof/>
           <w:lang w:val="en-US"/>
         </w:rPr>
         <w:drawing>
-          <wp:inline distT="0" distB="0" distL="0" distR="0" wp14:anchorId="2E9231C0" wp14:editId="398B6ED6">
-            <wp:extent cx="1311349" cy="2200275"/>
-            <wp:effectExtent l="0" t="0" r="3175" b="0"/>
-            <wp:docPr id="29" name="Imagem 29"/>
+          <wp:inline distT="0" distB="0" distL="0" distR="0" wp14:anchorId="0BA8DF25" wp14:editId="68853EB1">
+            <wp:extent cx="2112042" cy="3589875"/>
+            <wp:effectExtent l="0" t="0" r="2540" b="0"/>
+            <wp:docPr id="28" name="Imagem 28"/>
             <wp:cNvGraphicFramePr>
               <a:graphicFrameLocks xmlns:a="http://schemas.openxmlformats.org/drawingml/2006/main" noChangeAspect="1"/>
             </wp:cNvGraphicFramePr>
@@ -1276,7 +1225,7 @@
                   <pic:spPr>
                     <a:xfrm>
                       <a:off x="0" y="0"/>
-                      <a:ext cx="1319062" cy="2213217"/>
+                      <a:ext cx="2269518" cy="3857539"/>
                     </a:xfrm>
                     <a:prstGeom prst="rect">
                       <a:avLst/>
@@ -1291,93 +1240,60 @@
     </w:p>
     <w:p>
       <w:pPr>
+        <w:spacing w:after="0"/>
+        <w:jc w:val="both"/>
+      </w:pPr>
+    </w:p>
+    <w:p>
+      <w:pPr>
+        <w:pStyle w:val="PargrafodaLista"/>
+        <w:numPr>
+          <w:ilvl w:val="0"/>
+          <w:numId w:val="10"/>
+        </w:numPr>
+        <w:spacing w:after="0"/>
+        <w:jc w:val="both"/>
+        <w:rPr>
+          <w:b/>
+        </w:rPr>
+      </w:pPr>
+      <w:r>
+        <w:rPr>
+          <w:b/>
+        </w:rPr>
+        <w:lastRenderedPageBreak/>
+        <w:t>Aba Quadro Geral (Relatório e Dimensionamento)</w:t>
+      </w:r>
+    </w:p>
+    <w:p>
+      <w:pPr>
         <w:pStyle w:val="PargrafodaLista"/>
         <w:spacing w:after="0"/>
         <w:ind w:left="360"/>
         <w:jc w:val="both"/>
       </w:pPr>
       <w:r>
-        <w:t>Caso queira refazer algo, basta clicar no "</w:t>
-      </w:r>
-      <w:r>
-        <w:rPr>
-          <w:color w:val="FF0000"/>
-        </w:rPr>
-        <w:t>X</w:t>
-      </w:r>
-      <w:r>
-        <w:t>" para eliminar e voltar na aba correta.</w:t>
-      </w:r>
-    </w:p>
-    <w:p>
-      <w:pPr>
-        <w:pStyle w:val="PargrafodaLista"/>
-        <w:numPr>
-          <w:ilvl w:val="0"/>
-          <w:numId w:val="11"/>
-        </w:numPr>
+        <w:t xml:space="preserve">Esta aba é o demonstrativo de todos os Cômodos e Dispositivos inseridos na composição da residência. </w:t>
+      </w:r>
+    </w:p>
+    <w:p>
+      <w:pPr>
+        <w:pStyle w:val="PargrafodaLista"/>
         <w:spacing w:after="0"/>
-        <w:jc w:val="both"/>
-      </w:pPr>
-      <w:r>
-        <w:t>Reserva Futura: Logo abaixo de "Potência Bruta Alvo (Watts/VA)", há o botão Adicionar +30% de Reserva Futura. Utilize-o para garantir folga caso queira aumentar os equipamentos no futuro.</w:t>
-      </w:r>
-    </w:p>
-    <w:p>
-      <w:pPr>
-        <w:pStyle w:val="PargrafodaLista"/>
-        <w:numPr>
-          <w:ilvl w:val="0"/>
-          <w:numId w:val="11"/>
-        </w:numPr>
-        <w:spacing w:after="0"/>
-        <w:jc w:val="both"/>
-      </w:pPr>
-      <w:r>
-        <w:t>Dimensionamento do Alimentador: Para calcular a queda de tensão, insira a distância dos fios e clique em Dimensionar Alimentação.</w:t>
-      </w:r>
-    </w:p>
-    <w:p>
-      <w:pPr>
-        <w:pStyle w:val="PargrafodaLista"/>
-        <w:numPr>
-          <w:ilvl w:val="1"/>
-          <w:numId w:val="11"/>
-        </w:numPr>
-        <w:spacing w:after="0"/>
-        <w:ind w:right="-2"/>
-        <w:jc w:val="both"/>
-        <w:rPr>
-          <w:noProof/>
-        </w:rPr>
-      </w:pPr>
-      <w:r>
-        <w:rPr>
-          <w:noProof/>
-        </w:rPr>
-        <w:t>Para Apartamentos: Há apenas um campo de medição (Medidor/Condomínio até o QDC interno).</w:t>
-      </w:r>
-    </w:p>
-    <w:p>
-      <w:pPr>
-        <w:pStyle w:val="PargrafodaLista"/>
-        <w:spacing w:after="0"/>
-        <w:ind w:left="714"/>
+        <w:ind w:left="360"/>
         <w:jc w:val="center"/>
-        <w:rPr>
-          <w:b/>
-        </w:rPr>
-      </w:pPr>
-      <w:r>
-        <w:rPr>
+      </w:pPr>
+      <w:r>
+        <w:rPr>
+          <w:b/>
           <w:noProof/>
           <w:lang w:val="en-US"/>
         </w:rPr>
         <w:drawing>
-          <wp:inline distT="0" distB="0" distL="0" distR="0" wp14:anchorId="5080BDF5" wp14:editId="76044408">
-            <wp:extent cx="1067052" cy="866775"/>
-            <wp:effectExtent l="0" t="0" r="0" b="0"/>
-            <wp:docPr id="33" name="Imagem 33"/>
+          <wp:inline distT="0" distB="0" distL="0" distR="0" wp14:anchorId="2E9231C0" wp14:editId="398B6ED6">
+            <wp:extent cx="1311349" cy="2200275"/>
+            <wp:effectExtent l="0" t="0" r="3175" b="0"/>
+            <wp:docPr id="29" name="Imagem 29"/>
             <wp:cNvGraphicFramePr>
               <a:graphicFrameLocks xmlns:a="http://schemas.openxmlformats.org/drawingml/2006/main" noChangeAspect="1"/>
             </wp:cNvGraphicFramePr>
@@ -1397,7 +1313,7 @@
                   <pic:spPr>
                     <a:xfrm>
                       <a:off x="0" y="0"/>
-                      <a:ext cx="1098313" cy="892169"/>
+                      <a:ext cx="1319062" cy="2213217"/>
                     </a:xfrm>
                     <a:prstGeom prst="rect">
                       <a:avLst/>
@@ -1409,11 +1325,53 @@
           </wp:inline>
         </w:drawing>
       </w:r>
-      <w:r>
-        <w:rPr>
-          <w:b/>
-        </w:rPr>
-        <w:t xml:space="preserve">   </w:t>
+    </w:p>
+    <w:p>
+      <w:pPr>
+        <w:pStyle w:val="PargrafodaLista"/>
+        <w:spacing w:after="0"/>
+        <w:ind w:left="360"/>
+        <w:jc w:val="both"/>
+      </w:pPr>
+      <w:r>
+        <w:t>Caso queira refazer algo, basta clicar no "</w:t>
+      </w:r>
+      <w:r>
+        <w:rPr>
+          <w:color w:val="FF0000"/>
+        </w:rPr>
+        <w:t>X</w:t>
+      </w:r>
+      <w:r>
+        <w:t>" para eliminar e voltar na aba correta.</w:t>
+      </w:r>
+    </w:p>
+    <w:p>
+      <w:pPr>
+        <w:pStyle w:val="PargrafodaLista"/>
+        <w:numPr>
+          <w:ilvl w:val="0"/>
+          <w:numId w:val="11"/>
+        </w:numPr>
+        <w:spacing w:after="0"/>
+        <w:jc w:val="both"/>
+      </w:pPr>
+      <w:r>
+        <w:t>Reserva Futura: Logo abaixo de "Potência Bruta Alvo (Watts/VA)", há o botão Adicionar +30% de Reserva Futura. Utilize-o para garantir folga caso queira aumentar os equipamentos no futuro.</w:t>
+      </w:r>
+    </w:p>
+    <w:p>
+      <w:pPr>
+        <w:pStyle w:val="PargrafodaLista"/>
+        <w:numPr>
+          <w:ilvl w:val="0"/>
+          <w:numId w:val="11"/>
+        </w:numPr>
+        <w:spacing w:after="0"/>
+        <w:jc w:val="both"/>
+      </w:pPr>
+      <w:r>
+        <w:t>Dimensionamento do Alimentador: Para calcular a queda de tensão, insira a distância dos fios e clique em Dimensionar Alimentação.</w:t>
       </w:r>
     </w:p>
     <w:p>
@@ -1434,29 +1392,17 @@
         <w:rPr>
           <w:noProof/>
         </w:rPr>
-        <w:t>Para Casas: Há duas medições (do Poste da Rua até o Medidor, e do Medidor até o</w:t>
-      </w:r>
-      <w:r>
-        <w:rPr>
-          <w:noProof/>
-        </w:rPr>
-        <w:t xml:space="preserve"> </w:t>
-      </w:r>
-      <w:r>
-        <w:rPr>
-          <w:noProof/>
-        </w:rPr>
-        <w:t>QDC interno).</w:t>
+        <w:t>Para Apartamentos: Há apenas um campo de medição (Medidor/Condomínio até o QDC interno).</w:t>
       </w:r>
     </w:p>
     <w:p>
       <w:pPr>
         <w:pStyle w:val="PargrafodaLista"/>
         <w:spacing w:after="0"/>
-        <w:ind w:left="709" w:right="-2"/>
+        <w:ind w:left="714"/>
         <w:jc w:val="center"/>
         <w:rPr>
-          <w:noProof/>
+          <w:b/>
         </w:rPr>
       </w:pPr>
       <w:r>
@@ -1465,10 +1411,10 @@
           <w:lang w:val="en-US"/>
         </w:rPr>
         <w:drawing>
-          <wp:inline distT="0" distB="0" distL="0" distR="0" wp14:anchorId="4643FA12" wp14:editId="38DD64D3">
-            <wp:extent cx="1086838" cy="885825"/>
+          <wp:inline distT="0" distB="0" distL="0" distR="0" wp14:anchorId="5080BDF5" wp14:editId="76044408">
+            <wp:extent cx="1067052" cy="866775"/>
             <wp:effectExtent l="0" t="0" r="0" b="0"/>
-            <wp:docPr id="34" name="Imagem 34"/>
+            <wp:docPr id="33" name="Imagem 33"/>
             <wp:cNvGraphicFramePr>
               <a:graphicFrameLocks xmlns:a="http://schemas.openxmlformats.org/drawingml/2006/main" noChangeAspect="1"/>
             </wp:cNvGraphicFramePr>
@@ -1488,7 +1434,7 @@
                   <pic:spPr>
                     <a:xfrm>
                       <a:off x="0" y="0"/>
-                      <a:ext cx="1115782" cy="909416"/>
+                      <a:ext cx="1098313" cy="892169"/>
                     </a:xfrm>
                     <a:prstGeom prst="rect">
                       <a:avLst/>
@@ -1500,49 +1446,66 @@
           </wp:inline>
         </w:drawing>
       </w:r>
-    </w:p>
-    <w:p>
-      <w:pPr>
-        <w:pStyle w:val="PargrafodaLista"/>
+      <w:r>
+        <w:rPr>
+          <w:b/>
+        </w:rPr>
+        <w:t xml:space="preserve">   </w:t>
+      </w:r>
+    </w:p>
+    <w:p>
+      <w:pPr>
+        <w:pStyle w:val="PargrafodaLista"/>
+        <w:numPr>
+          <w:ilvl w:val="1"/>
+          <w:numId w:val="11"/>
+        </w:numPr>
         <w:spacing w:after="0"/>
-        <w:ind w:left="993" w:right="-2"/>
+        <w:ind w:right="-2"/>
+        <w:jc w:val="both"/>
+        <w:rPr>
+          <w:noProof/>
+        </w:rPr>
+      </w:pPr>
+      <w:r>
+        <w:rPr>
+          <w:noProof/>
+        </w:rPr>
+        <w:t>Para Casas: Há duas medições (do Poste da Rua até o Medidor, e do Medidor até o</w:t>
+      </w:r>
+      <w:r>
+        <w:rPr>
+          <w:noProof/>
+        </w:rPr>
+        <w:t xml:space="preserve"> </w:t>
+      </w:r>
+      <w:r>
+        <w:rPr>
+          <w:noProof/>
+        </w:rPr>
+        <w:t>QDC interno).</w:t>
+      </w:r>
+    </w:p>
+    <w:p>
+      <w:pPr>
+        <w:pStyle w:val="PargrafodaLista"/>
+        <w:spacing w:after="0"/>
+        <w:ind w:left="709" w:right="-2"/>
         <w:jc w:val="center"/>
         <w:rPr>
           <w:noProof/>
         </w:rPr>
       </w:pPr>
-    </w:p>
-    <w:p>
-      <w:pPr>
-        <w:pStyle w:val="PargrafodaLista"/>
-        <w:spacing w:after="0"/>
-        <w:ind w:left="360"/>
-        <w:jc w:val="both"/>
-      </w:pPr>
-      <w:r>
-        <w:t>Após dimensionar, o aplicativo exibirá os cartões verde e azul com os resultados finais:</w:t>
-      </w:r>
-    </w:p>
-    <w:p>
-      <w:pPr>
-        <w:pStyle w:val="PargrafodaLista"/>
-        <w:ind w:left="284"/>
-        <w:jc w:val="center"/>
-        <w:rPr>
-          <w:noProof/>
-        </w:rPr>
-      </w:pPr>
-      <w:r>
-        <w:rPr>
-          <w:b/>
+      <w:r>
+        <w:rPr>
           <w:noProof/>
           <w:lang w:val="en-US"/>
         </w:rPr>
         <w:drawing>
-          <wp:inline distT="0" distB="0" distL="0" distR="0" wp14:anchorId="2CE40AC3" wp14:editId="437D9D00">
-            <wp:extent cx="1081405" cy="1803332"/>
-            <wp:effectExtent l="0" t="0" r="4445" b="6985"/>
-            <wp:docPr id="30" name="Imagem 30"/>
+          <wp:inline distT="0" distB="0" distL="0" distR="0" wp14:anchorId="4643FA12" wp14:editId="38DD64D3">
+            <wp:extent cx="1086838" cy="885825"/>
+            <wp:effectExtent l="0" t="0" r="0" b="0"/>
+            <wp:docPr id="34" name="Imagem 34"/>
             <wp:cNvGraphicFramePr>
               <a:graphicFrameLocks xmlns:a="http://schemas.openxmlformats.org/drawingml/2006/main" noChangeAspect="1"/>
             </wp:cNvGraphicFramePr>
@@ -1562,7 +1525,7 @@
                   <pic:spPr>
                     <a:xfrm>
                       <a:off x="0" y="0"/>
-                      <a:ext cx="1140757" cy="1902307"/>
+                      <a:ext cx="1115782" cy="909416"/>
                     </a:xfrm>
                     <a:prstGeom prst="rect">
                       <a:avLst/>
@@ -1578,32 +1541,45 @@
     <w:p>
       <w:pPr>
         <w:pStyle w:val="PargrafodaLista"/>
-        <w:numPr>
-          <w:ilvl w:val="0"/>
-          <w:numId w:val="11"/>
-        </w:numPr>
         <w:spacing w:after="0"/>
-        <w:jc w:val="both"/>
-      </w:pPr>
-      <w:r>
-        <w:lastRenderedPageBreak/>
-        <w:t>Gerar Memorial em PDF: Ao clicar neste botão, abrirá uma página onde será criado um "Memorial Descritivo Elétrico" com todas as informações e cálculos realizados.</w:t>
-      </w:r>
-    </w:p>
-    <w:p>
-      <w:pPr>
+        <w:ind w:left="993" w:right="-2"/>
         <w:jc w:val="center"/>
-      </w:pPr>
-      <w:r>
-        <w:rPr>
+        <w:rPr>
+          <w:noProof/>
+        </w:rPr>
+      </w:pPr>
+    </w:p>
+    <w:p>
+      <w:pPr>
+        <w:pStyle w:val="PargrafodaLista"/>
+        <w:spacing w:after="0"/>
+        <w:ind w:left="360"/>
+        <w:jc w:val="both"/>
+      </w:pPr>
+      <w:r>
+        <w:t>Após dimensionar, o aplicativo exibirá os cartões verde e azul com os resultados finais:</w:t>
+      </w:r>
+    </w:p>
+    <w:p>
+      <w:pPr>
+        <w:pStyle w:val="PargrafodaLista"/>
+        <w:ind w:left="284"/>
+        <w:jc w:val="center"/>
+        <w:rPr>
+          <w:noProof/>
+        </w:rPr>
+      </w:pPr>
+      <w:r>
+        <w:rPr>
+          <w:b/>
           <w:noProof/>
           <w:lang w:val="en-US"/>
         </w:rPr>
         <w:drawing>
-          <wp:inline distT="0" distB="0" distL="0" distR="0" wp14:anchorId="68C393D9" wp14:editId="320BDBDA">
-            <wp:extent cx="993607" cy="2219325"/>
-            <wp:effectExtent l="0" t="0" r="0" b="0"/>
-            <wp:docPr id="36" name="Imagem 36"/>
+          <wp:inline distT="0" distB="0" distL="0" distR="0" wp14:anchorId="2CE40AC3" wp14:editId="437D9D00">
+            <wp:extent cx="1081405" cy="1803332"/>
+            <wp:effectExtent l="0" t="0" r="4445" b="6985"/>
+            <wp:docPr id="30" name="Imagem 30"/>
             <wp:cNvGraphicFramePr>
               <a:graphicFrameLocks xmlns:a="http://schemas.openxmlformats.org/drawingml/2006/main" noChangeAspect="1"/>
             </wp:cNvGraphicFramePr>
@@ -1623,7 +1599,7 @@
                   <pic:spPr>
                     <a:xfrm>
                       <a:off x="0" y="0"/>
-                      <a:ext cx="1037044" cy="2316347"/>
+                      <a:ext cx="1140757" cy="1902307"/>
                     </a:xfrm>
                     <a:prstGeom prst="rect">
                       <a:avLst/>
@@ -1647,37 +1623,24 @@
         <w:jc w:val="both"/>
       </w:pPr>
       <w:r>
-        <w:t xml:space="preserve">Enviar Resumo por WhatsApp: Este botão permite compartilhar uma mensagem </w:t>
-      </w:r>
-      <w:proofErr w:type="spellStart"/>
-      <w:r>
-        <w:t>detexto</w:t>
-      </w:r>
-      <w:proofErr w:type="spellEnd"/>
-      <w:r>
-        <w:t xml:space="preserve"> padronizada com os cálculos efetuados para os seus contatos.</w:t>
+        <w:lastRenderedPageBreak/>
+        <w:t>Gerar Memorial em PDF: Ao clicar neste botão, abrirá uma página onde será criado um "Memorial Descritivo Elétrico" com todas as informações e cálculos realizados.</w:t>
       </w:r>
     </w:p>
     <w:p>
       <w:pPr>
         <w:jc w:val="center"/>
       </w:pPr>
-      <w:r>
-        <w:rPr>
-          <w:noProof/>
-        </w:rPr>
-        <w:t xml:space="preserve"> </w:t>
-      </w:r>
       <w:r>
         <w:rPr>
           <w:noProof/>
           <w:lang w:val="en-US"/>
         </w:rPr>
         <w:drawing>
-          <wp:inline distT="0" distB="0" distL="0" distR="0" wp14:anchorId="0BFE02E1" wp14:editId="2AC12C8F">
-            <wp:extent cx="906537" cy="1552575"/>
-            <wp:effectExtent l="0" t="0" r="8255" b="0"/>
-            <wp:docPr id="13" name="Imagem 13"/>
+          <wp:inline distT="0" distB="0" distL="0" distR="0" wp14:anchorId="68C393D9" wp14:editId="320BDBDA">
+            <wp:extent cx="993607" cy="2219325"/>
+            <wp:effectExtent l="0" t="0" r="0" b="0"/>
+            <wp:docPr id="36" name="Imagem 36"/>
             <wp:cNvGraphicFramePr>
               <a:graphicFrameLocks xmlns:a="http://schemas.openxmlformats.org/drawingml/2006/main" noChangeAspect="1"/>
             </wp:cNvGraphicFramePr>
@@ -1697,7 +1660,7 @@
                   <pic:spPr>
                     <a:xfrm>
                       <a:off x="0" y="0"/>
-                      <a:ext cx="936846" cy="1604484"/>
+                      <a:ext cx="1037044" cy="2316347"/>
                     </a:xfrm>
                     <a:prstGeom prst="rect">
                       <a:avLst/>
@@ -1709,8 +1672,38 @@
           </wp:inline>
         </w:drawing>
       </w:r>
-      <w:r>
-        <w:t xml:space="preserve">      </w:t>
+    </w:p>
+    <w:p>
+      <w:pPr>
+        <w:pStyle w:val="PargrafodaLista"/>
+        <w:numPr>
+          <w:ilvl w:val="0"/>
+          <w:numId w:val="11"/>
+        </w:numPr>
+        <w:spacing w:after="0"/>
+        <w:jc w:val="both"/>
+      </w:pPr>
+      <w:r>
+        <w:t xml:space="preserve">Enviar Resumo por WhatsApp: Este botão permite compartilhar uma mensagem </w:t>
+      </w:r>
+      <w:proofErr w:type="spellStart"/>
+      <w:r>
+        <w:t>detexto</w:t>
+      </w:r>
+      <w:proofErr w:type="spellEnd"/>
+      <w:r>
+        <w:t xml:space="preserve"> padronizada com os cálculos efetuados para os seus contatos.</w:t>
+      </w:r>
+    </w:p>
+    <w:p>
+      <w:pPr>
+        <w:jc w:val="center"/>
+      </w:pPr>
+      <w:r>
+        <w:rPr>
+          <w:noProof/>
+        </w:rPr>
+        <w:t xml:space="preserve"> </w:t>
       </w:r>
       <w:r>
         <w:rPr>
@@ -1718,10 +1711,10 @@
           <w:lang w:val="en-US"/>
         </w:rPr>
         <w:drawing>
-          <wp:inline distT="0" distB="0" distL="0" distR="0" wp14:anchorId="4FD733FA" wp14:editId="0DF1E959">
-            <wp:extent cx="2085975" cy="1565612"/>
-            <wp:effectExtent l="0" t="0" r="0" b="0"/>
-            <wp:docPr id="14" name="Imagem 14"/>
+          <wp:inline distT="0" distB="0" distL="0" distR="0" wp14:anchorId="0BFE02E1" wp14:editId="2AC12C8F">
+            <wp:extent cx="906537" cy="1552575"/>
+            <wp:effectExtent l="0" t="0" r="8255" b="0"/>
+            <wp:docPr id="13" name="Imagem 13"/>
             <wp:cNvGraphicFramePr>
               <a:graphicFrameLocks xmlns:a="http://schemas.openxmlformats.org/drawingml/2006/main" noChangeAspect="1"/>
             </wp:cNvGraphicFramePr>
@@ -1741,7 +1734,7 @@
                   <pic:spPr>
                     <a:xfrm>
                       <a:off x="0" y="0"/>
-                      <a:ext cx="2117803" cy="1589500"/>
+                      <a:ext cx="936846" cy="1604484"/>
                     </a:xfrm>
                     <a:prstGeom prst="rect">
                       <a:avLst/>
@@ -1753,637 +1746,19 @@
           </wp:inline>
         </w:drawing>
       </w:r>
-    </w:p>
-    <w:p>
-      <w:pPr>
-        <w:jc w:val="center"/>
-      </w:pPr>
-    </w:p>
-    <w:p>
-      <w:pPr>
-        <w:spacing w:before="240"/>
-        <w:jc w:val="both"/>
-        <w:rPr>
-          <w:b/>
-          <w:sz w:val="36"/>
-          <w:szCs w:val="36"/>
-        </w:rPr>
-      </w:pPr>
-      <w:r>
-        <w:rPr>
-          <w:b/>
-          <w:sz w:val="36"/>
-          <w:szCs w:val="36"/>
-        </w:rPr>
-        <w:t xml:space="preserve">Parte 3: Perguntas Frequentes (FAQ) </w:t>
-      </w:r>
-    </w:p>
-    <w:p>
-      <w:pPr>
-        <w:pStyle w:val="PargrafodaLista"/>
-        <w:numPr>
-          <w:ilvl w:val="0"/>
-          <w:numId w:val="11"/>
-        </w:numPr>
-        <w:spacing w:after="0"/>
-        <w:jc w:val="both"/>
-        <w:rPr>
-          <w:b/>
-        </w:rPr>
-      </w:pPr>
-      <w:r>
-        <w:rPr>
-          <w:b/>
-        </w:rPr>
-        <w:t>Pode colocar uma calculadora para fazer o cálculo do perímetro e da área sem sair do app?</w:t>
-      </w:r>
-    </w:p>
-    <w:p>
-      <w:pPr>
-        <w:spacing w:after="0"/>
-        <w:ind w:left="1066"/>
-        <w:jc w:val="both"/>
-      </w:pPr>
-      <w:r>
-        <w:t>R.: É algo para ser analisado e se possível colocar em futura versão.</w:t>
-      </w:r>
-    </w:p>
-    <w:p>
-      <w:pPr>
-        <w:pStyle w:val="PargrafodaLista"/>
-        <w:numPr>
-          <w:ilvl w:val="0"/>
-          <w:numId w:val="11"/>
-        </w:numPr>
-        <w:spacing w:after="0"/>
-        <w:jc w:val="both"/>
-        <w:rPr>
-          <w:b/>
-        </w:rPr>
-      </w:pPr>
-      <w:r>
-        <w:rPr>
-          <w:b/>
-        </w:rPr>
-        <w:t>Pode fazer o cálculo de um cômodo só?</w:t>
-      </w:r>
-    </w:p>
-    <w:p>
-      <w:pPr>
-        <w:ind w:left="1068"/>
-        <w:jc w:val="both"/>
-      </w:pPr>
-      <w:r>
-        <w:t xml:space="preserve">R: Sim pode ser feito, mas não esqueçam que em uma residência para que tudo esteja em conformidade o certo é fazer o cálculo de tudo. Exemplo: se eu trocar um chuveiro de 5800W por um de 7800W, o disjuntor não será o mesmo. Isso vai influenciar no quadro geral. </w:t>
-      </w:r>
-    </w:p>
-    <w:p>
-      <w:pPr>
-        <w:pStyle w:val="PargrafodaLista"/>
-        <w:numPr>
-          <w:ilvl w:val="0"/>
-          <w:numId w:val="11"/>
-        </w:numPr>
-        <w:spacing w:after="0"/>
-        <w:jc w:val="both"/>
-        <w:rPr>
-          <w:b/>
-        </w:rPr>
-      </w:pPr>
-      <w:r>
-        <w:rPr>
-          <w:b/>
-        </w:rPr>
-        <w:t>A quantidade de tomadas que aparece é o que a somos obrigados a colocar?</w:t>
-      </w:r>
-    </w:p>
-    <w:p>
-      <w:pPr>
-        <w:ind w:left="1068"/>
-        <w:jc w:val="both"/>
-      </w:pPr>
-      <w:r>
-        <w:t xml:space="preserve">R.: </w:t>
-      </w:r>
-      <w:r>
-        <w:t>A quantidade que o app mostra é a quantidade mínima de tomadas a serem colocadas conforme a norma NBR 5410.</w:t>
-      </w:r>
-    </w:p>
-    <w:p>
-      <w:pPr>
-        <w:ind w:left="1068"/>
-        <w:jc w:val="both"/>
-      </w:pPr>
-    </w:p>
-    <w:p>
-      <w:pPr>
-        <w:spacing w:before="240"/>
-        <w:jc w:val="both"/>
-        <w:rPr>
-          <w:b/>
-          <w:sz w:val="36"/>
-          <w:szCs w:val="36"/>
-        </w:rPr>
-      </w:pPr>
-      <w:r>
-        <w:rPr>
-          <w:b/>
-          <w:sz w:val="36"/>
-          <w:szCs w:val="36"/>
-        </w:rPr>
-        <w:lastRenderedPageBreak/>
-        <w:t xml:space="preserve">Parte </w:t>
-      </w:r>
-      <w:r>
-        <w:rPr>
-          <w:b/>
-          <w:sz w:val="36"/>
-          <w:szCs w:val="36"/>
-        </w:rPr>
-        <w:t>4</w:t>
-      </w:r>
-      <w:r>
-        <w:rPr>
-          <w:b/>
-          <w:sz w:val="36"/>
-          <w:szCs w:val="36"/>
-        </w:rPr>
-        <w:t>: Notas Técnicas e Normativas</w:t>
-      </w:r>
-    </w:p>
-    <w:p>
-      <w:pPr>
-        <w:pStyle w:val="PargrafodaLista"/>
-        <w:numPr>
-          <w:ilvl w:val="0"/>
-          <w:numId w:val="12"/>
-        </w:numPr>
-        <w:spacing w:before="160" w:after="0"/>
-        <w:ind w:left="357" w:hanging="357"/>
-        <w:jc w:val="both"/>
-        <w:rPr>
-          <w:b/>
-          <w:sz w:val="32"/>
-          <w:szCs w:val="32"/>
-        </w:rPr>
-      </w:pPr>
-      <w:r>
-        <w:rPr>
-          <w:b/>
-          <w:sz w:val="32"/>
-          <w:szCs w:val="32"/>
-        </w:rPr>
-        <w:t>Normas das instalações elétricas residenciais</w:t>
-      </w:r>
-    </w:p>
-    <w:p>
-      <w:pPr>
-        <w:pStyle w:val="PargrafodaLista"/>
-        <w:spacing w:after="0"/>
-        <w:ind w:left="360"/>
-        <w:jc w:val="both"/>
-      </w:pPr>
-      <w:r>
-        <w:t>O Perímetro é a soma de todos os lados (paredes) do cômodo, medido em metros lineares (m). No contexto da norma NBR 5410, enquanto a Área determina a potência da iluminação, o Perímetro é o dado fundamental para definir a quantidade mínima de tomadas de uso geral (</w:t>
-      </w:r>
-      <w:proofErr w:type="spellStart"/>
-      <w:r>
-        <w:t>TUGs</w:t>
-      </w:r>
-      <w:proofErr w:type="spellEnd"/>
-      <w:r>
-        <w:t xml:space="preserve">) por segurança, evitando o uso de benjamins e extensões. </w:t>
-      </w:r>
-    </w:p>
-    <w:p>
-      <w:pPr>
-        <w:pStyle w:val="PargrafodaLista"/>
-        <w:numPr>
-          <w:ilvl w:val="0"/>
-          <w:numId w:val="11"/>
-        </w:numPr>
-        <w:jc w:val="both"/>
-        <w:rPr>
-          <w:rFonts w:eastAsia="Times New Roman"/>
-          <w:bCs/>
-        </w:rPr>
-      </w:pPr>
-      <w:r>
-        <w:rPr>
-          <w:rFonts w:eastAsia="Times New Roman"/>
-          <w:bCs/>
-        </w:rPr>
-        <w:t>Salas e Quartos (Cômodos Sociais): Exige no mínimo 1 tomada a cada 5 metros ou fração de perímetro. (Ex</w:t>
-      </w:r>
-      <w:r>
-        <w:rPr>
-          <w:rFonts w:eastAsia="Times New Roman"/>
-          <w:bCs/>
-        </w:rPr>
-        <w:t>.</w:t>
-      </w:r>
-      <w:r>
-        <w:rPr>
-          <w:rFonts w:eastAsia="Times New Roman"/>
-          <w:bCs/>
-        </w:rPr>
-        <w:t>: Quarto com 14 m de perímetro = 14 / 5 = 2.8. Arredondando para cima, o app calcula 3 tomadas).</w:t>
-      </w:r>
-    </w:p>
-    <w:p>
-      <w:pPr>
-        <w:pStyle w:val="PargrafodaLista"/>
-        <w:numPr>
-          <w:ilvl w:val="0"/>
-          <w:numId w:val="11"/>
-        </w:numPr>
-        <w:jc w:val="both"/>
-        <w:rPr>
-          <w:rFonts w:eastAsia="Times New Roman"/>
-          <w:bCs/>
-        </w:rPr>
-      </w:pPr>
-      <w:r>
-        <w:rPr>
-          <w:rFonts w:eastAsia="Times New Roman"/>
-          <w:bCs/>
-        </w:rPr>
-        <w:t>Cozinhas e Áreas de Serviço: A norma é mais rígida e exige 1 tomada a cada 3,5 metros ou fração de perímetro.</w:t>
-      </w:r>
-    </w:p>
-    <w:p>
-      <w:pPr>
-        <w:pStyle w:val="PargrafodaLista"/>
-        <w:numPr>
-          <w:ilvl w:val="0"/>
-          <w:numId w:val="12"/>
-        </w:numPr>
-        <w:spacing w:before="160" w:after="0"/>
-        <w:ind w:left="357" w:hanging="357"/>
-        <w:jc w:val="both"/>
-        <w:rPr>
-          <w:b/>
-          <w:sz w:val="32"/>
-          <w:szCs w:val="32"/>
-        </w:rPr>
-      </w:pPr>
-      <w:r>
-        <w:rPr>
-          <w:b/>
-          <w:sz w:val="32"/>
-          <w:szCs w:val="32"/>
-        </w:rPr>
-        <w:t xml:space="preserve">Nem sempre 220V </w:t>
-      </w:r>
-      <w:r>
-        <w:rPr>
-          <w:b/>
-          <w:sz w:val="32"/>
-          <w:szCs w:val="32"/>
-        </w:rPr>
-        <w:t>significa bifásico</w:t>
-      </w:r>
-      <w:r>
-        <w:rPr>
-          <w:b/>
-          <w:sz w:val="32"/>
-          <w:szCs w:val="32"/>
-        </w:rPr>
-        <w:t xml:space="preserve"> (O Motivo Técnico)</w:t>
-      </w:r>
-    </w:p>
-    <w:p>
-      <w:pPr>
-        <w:pStyle w:val="PargrafodaLista"/>
-        <w:spacing w:after="0"/>
-        <w:ind w:left="360"/>
-        <w:jc w:val="both"/>
-      </w:pPr>
-      <w:r>
-        <w:t>O Brasil divide-se em dois grandes blocos de distribuição:</w:t>
-      </w:r>
-    </w:p>
-    <w:p>
-      <w:pPr>
-        <w:pStyle w:val="PargrafodaLista"/>
-        <w:numPr>
-          <w:ilvl w:val="0"/>
-          <w:numId w:val="11"/>
-        </w:numPr>
-        <w:jc w:val="both"/>
-        <w:rPr>
-          <w:rFonts w:eastAsia="Times New Roman"/>
-          <w:bCs/>
-        </w:rPr>
-      </w:pPr>
-      <w:r>
-        <w:rPr>
-          <w:rFonts w:eastAsia="Times New Roman"/>
-          <w:bCs/>
-        </w:rPr>
-        <w:t>Sistema 380V/220V (Nordeste, Sul, partes do Centro-Oeste/Sudeste): A fase já tem</w:t>
-      </w:r>
-      <w:r>
-        <w:rPr>
-          <w:rFonts w:eastAsia="Times New Roman"/>
-          <w:bCs/>
-        </w:rPr>
-        <w:t xml:space="preserve"> </w:t>
-      </w:r>
-      <w:r>
-        <w:rPr>
-          <w:rFonts w:eastAsia="Times New Roman"/>
-          <w:bCs/>
-        </w:rPr>
-        <w:t>220V. Portanto, Fase + Neutro = 220V (Monofásico).</w:t>
-      </w:r>
-    </w:p>
-    <w:p>
-      <w:pPr>
-        <w:pStyle w:val="PargrafodaLista"/>
-        <w:numPr>
-          <w:ilvl w:val="0"/>
-          <w:numId w:val="11"/>
-        </w:numPr>
-        <w:jc w:val="both"/>
-        <w:rPr>
-          <w:rFonts w:eastAsia="Times New Roman"/>
-          <w:bCs/>
-        </w:rPr>
-      </w:pPr>
-      <w:r>
-        <w:rPr>
-          <w:rFonts w:eastAsia="Times New Roman"/>
-          <w:bCs/>
-        </w:rPr>
-        <w:t xml:space="preserve">Sistema 220V/127V (Sudeste, Norte, </w:t>
-      </w:r>
-      <w:proofErr w:type="spellStart"/>
-      <w:r>
-        <w:rPr>
-          <w:rFonts w:eastAsia="Times New Roman"/>
-          <w:bCs/>
-        </w:rPr>
-        <w:t>ex</w:t>
-      </w:r>
-      <w:proofErr w:type="spellEnd"/>
-      <w:r>
-        <w:rPr>
-          <w:rFonts w:eastAsia="Times New Roman"/>
-          <w:bCs/>
-        </w:rPr>
-        <w:t>: CPFL, Enel SP): A fase tem 127V.</w:t>
-      </w:r>
-      <w:r>
-        <w:rPr>
-          <w:rFonts w:eastAsia="Times New Roman"/>
-          <w:bCs/>
-        </w:rPr>
-        <w:t xml:space="preserve"> </w:t>
-      </w:r>
-      <w:r>
-        <w:rPr>
-          <w:rFonts w:eastAsia="Times New Roman"/>
-          <w:bCs/>
-        </w:rPr>
-        <w:t>Para obter 220V, o padrão precisa puxar duas fases: Fase + Fase = 220V (Bifásico).</w:t>
-      </w:r>
-    </w:p>
-    <w:p>
-      <w:pPr>
-        <w:pStyle w:val="PargrafodaLista"/>
-        <w:numPr>
-          <w:ilvl w:val="0"/>
-          <w:numId w:val="12"/>
-        </w:numPr>
-        <w:spacing w:before="160" w:after="0"/>
-        <w:ind w:left="357" w:hanging="357"/>
-        <w:jc w:val="both"/>
-        <w:rPr>
-          <w:b/>
-          <w:sz w:val="32"/>
-          <w:szCs w:val="32"/>
-        </w:rPr>
-      </w:pPr>
-      <w:r>
-        <w:rPr>
-          <w:b/>
-          <w:sz w:val="32"/>
-          <w:szCs w:val="32"/>
-        </w:rPr>
-        <w:t>Diferença entre Prédio e Casa</w:t>
-      </w:r>
-    </w:p>
-    <w:p>
-      <w:pPr>
-        <w:pStyle w:val="PargrafodaLista"/>
-        <w:spacing w:after="0"/>
-        <w:ind w:left="360"/>
-        <w:jc w:val="both"/>
-      </w:pPr>
-      <w:r>
-        <w:t>O motor de cálculo atua como um "fiscal da concessionária" muito rigoroso para ligações no poste da rua. Para uma casa, se a carga passa de 25 kW (</w:t>
-      </w:r>
-      <w:proofErr w:type="spellStart"/>
-      <w:r>
-        <w:t>ex</w:t>
-      </w:r>
-      <w:proofErr w:type="spellEnd"/>
-      <w:r>
-        <w:t>: 28.148 VA), a distribuidora corta o bifásico e obriga a colocar o trifásico para não desequilibrar a rua (sugerindo cabos de 25 mm2 e Disjuntor de 80 A).</w:t>
-      </w:r>
-    </w:p>
-    <w:p>
-      <w:pPr>
-        <w:pStyle w:val="PargrafodaLista"/>
-        <w:spacing w:after="0"/>
-        <w:ind w:left="360"/>
-        <w:jc w:val="both"/>
-      </w:pPr>
-      <w:r>
-        <w:t>No entanto, no apartamento a realidade é outra devido a dois conceitos:</w:t>
-      </w:r>
-    </w:p>
-    <w:p>
-      <w:pPr>
-        <w:pStyle w:val="PargrafodaLista"/>
-        <w:numPr>
-          <w:ilvl w:val="0"/>
-          <w:numId w:val="11"/>
-        </w:numPr>
-        <w:jc w:val="both"/>
-        <w:rPr>
-          <w:rFonts w:eastAsia="Times New Roman"/>
-          <w:bCs/>
-        </w:rPr>
-      </w:pPr>
-      <w:r>
-        <w:rPr>
-          <w:rFonts w:eastAsia="Times New Roman"/>
-          <w:bCs/>
-        </w:rPr>
-        <w:t>A Regra do Prédio: O prédio recebe energia Trifásica pesada. O engenheiro distribui as três fases alternadamente pelos andares (</w:t>
-      </w:r>
-      <w:proofErr w:type="spellStart"/>
-      <w:r>
-        <w:rPr>
-          <w:rFonts w:eastAsia="Times New Roman"/>
-          <w:bCs/>
-        </w:rPr>
-        <w:t>ex</w:t>
-      </w:r>
-      <w:proofErr w:type="spellEnd"/>
-      <w:r>
-        <w:rPr>
-          <w:rFonts w:eastAsia="Times New Roman"/>
-          <w:bCs/>
-        </w:rPr>
-        <w:t>: Apto 11 recebe Fases A e B). Por isso, mesmo que a carga passe dos 25 kW, o projeto interno permite manter a unidade como bifásica, pois o equilíbrio é feito no conjunto do prédio.</w:t>
-      </w:r>
-    </w:p>
-    <w:p>
-      <w:pPr>
-        <w:pStyle w:val="PargrafodaLista"/>
-        <w:numPr>
-          <w:ilvl w:val="0"/>
-          <w:numId w:val="11"/>
-        </w:numPr>
-        <w:jc w:val="both"/>
-        <w:rPr>
-          <w:rFonts w:eastAsia="Times New Roman"/>
-          <w:bCs/>
-        </w:rPr>
-      </w:pPr>
-      <w:r>
-        <w:rPr>
-          <w:rFonts w:eastAsia="Times New Roman"/>
-          <w:bCs/>
-        </w:rPr>
-        <w:t xml:space="preserve">O Fator de Simultaneidade Real e a Seletividade: Um disjuntor Bifásico de 70A a </w:t>
-      </w:r>
-      <w:r>
-        <w:rPr>
-          <w:rFonts w:eastAsia="Times New Roman"/>
-          <w:bCs/>
-        </w:rPr>
-        <w:t>22</w:t>
-      </w:r>
-      <w:r>
-        <w:rPr>
-          <w:rFonts w:eastAsia="Times New Roman"/>
-          <w:bCs/>
-        </w:rPr>
-        <w:t>0V suporta 15.400 VA. A demanda diária raramente atinge a carga total instalada (ninguém liga todos os chuveiros e ares-condicionados no mesmo segundo). Por isso o disjuntor de 70A e o cabo de 10 mm2 funcionam perfeitamente na prática, pois a corrente de uso costuma flutuar entre 30A e 50A. Além disso, o disjuntor do medidor (70A) é maior que o interno (63A) por Seletividade, garantindo que o</w:t>
-      </w:r>
-      <w:r>
-        <w:rPr>
-          <w:rFonts w:eastAsia="Times New Roman"/>
-          <w:bCs/>
-        </w:rPr>
-        <w:t xml:space="preserve"> </w:t>
-      </w:r>
-      <w:r>
-        <w:rPr>
-          <w:rFonts w:eastAsia="Times New Roman"/>
-          <w:bCs/>
-        </w:rPr>
-        <w:t>desarme aconteça dentro de casa em caso de pico extremo.</w:t>
-      </w:r>
-    </w:p>
-    <w:p>
-      <w:pPr>
-        <w:pStyle w:val="PargrafodaLista"/>
-        <w:spacing w:before="160" w:after="0"/>
-        <w:ind w:left="360"/>
-        <w:jc w:val="both"/>
-      </w:pPr>
-    </w:p>
-    <w:p>
-      <w:pPr>
-        <w:spacing w:before="240"/>
-        <w:jc w:val="both"/>
-        <w:rPr>
-          <w:b/>
-          <w:sz w:val="36"/>
-          <w:szCs w:val="36"/>
-        </w:rPr>
-      </w:pPr>
-    </w:p>
-    <w:p>
-      <w:pPr>
-        <w:spacing w:before="240"/>
-        <w:jc w:val="both"/>
-        <w:rPr>
-          <w:b/>
-          <w:sz w:val="36"/>
-          <w:szCs w:val="36"/>
-        </w:rPr>
-      </w:pPr>
-    </w:p>
-    <w:p>
-      <w:pPr>
-        <w:spacing w:before="240"/>
-        <w:jc w:val="both"/>
-        <w:rPr>
-          <w:b/>
-          <w:sz w:val="36"/>
-          <w:szCs w:val="36"/>
-        </w:rPr>
-      </w:pPr>
-      <w:r>
-        <w:rPr>
-          <w:b/>
-          <w:sz w:val="36"/>
-          <w:szCs w:val="36"/>
-        </w:rPr>
-        <w:lastRenderedPageBreak/>
-        <w:t xml:space="preserve">Parte </w:t>
-      </w:r>
-      <w:r>
-        <w:rPr>
-          <w:b/>
-          <w:sz w:val="36"/>
-          <w:szCs w:val="36"/>
-        </w:rPr>
-        <w:t>5</w:t>
-      </w:r>
-      <w:r>
-        <w:rPr>
-          <w:b/>
-          <w:sz w:val="36"/>
-          <w:szCs w:val="36"/>
-        </w:rPr>
-        <w:t>: Aba Guia Prático (Soluções de Campo)</w:t>
-      </w:r>
-    </w:p>
-    <w:p>
-      <w:pPr>
-        <w:pStyle w:val="PargrafodaLista"/>
-        <w:spacing w:after="0"/>
-        <w:ind w:left="360"/>
-        <w:jc w:val="both"/>
-      </w:pPr>
-      <w:r>
-        <w:t>Esta nova aba foi desenvolvida para ser o "canivete suíço" do eletricista no dia a dia da obra, oferecendo consultas rápidas, alertas de segurança e referências visuais de montagem.</w:t>
-      </w:r>
-    </w:p>
-    <w:p>
-      <w:pPr>
-        <w:pStyle w:val="PargrafodaLista"/>
-        <w:spacing w:after="0"/>
-        <w:ind w:left="360"/>
-        <w:jc w:val="center"/>
-      </w:pPr>
+      <w:r>
+        <w:t xml:space="preserve">      </w:t>
+      </w:r>
       <w:r>
         <w:rPr>
           <w:noProof/>
           <w:lang w:val="en-US"/>
         </w:rPr>
         <w:drawing>
-          <wp:inline distT="0" distB="0" distL="0" distR="0" wp14:anchorId="46032CB9" wp14:editId="475C3827">
-            <wp:extent cx="1457184" cy="2524125"/>
+          <wp:inline distT="0" distB="0" distL="0" distR="0" wp14:anchorId="4FD733FA" wp14:editId="0DF1E959">
+            <wp:extent cx="2085975" cy="1565612"/>
             <wp:effectExtent l="0" t="0" r="0" b="0"/>
-            <wp:docPr id="3" name="Imagem 3"/>
+            <wp:docPr id="14" name="Imagem 14"/>
             <wp:cNvGraphicFramePr>
               <a:graphicFrameLocks xmlns:a="http://schemas.openxmlformats.org/drawingml/2006/main" noChangeAspect="1"/>
             </wp:cNvGraphicFramePr>
@@ -2403,7 +1778,7 @@
                   <pic:spPr>
                     <a:xfrm>
                       <a:off x="0" y="0"/>
-                      <a:ext cx="1469718" cy="2545837"/>
+                      <a:ext cx="2117803" cy="1589500"/>
                     </a:xfrm>
                     <a:prstGeom prst="rect">
                       <a:avLst/>
@@ -2415,46 +1790,29 @@
           </wp:inline>
         </w:drawing>
       </w:r>
-      <w:r>
-        <w:t xml:space="preserve">    </w:t>
-      </w:r>
-    </w:p>
-    <w:p>
-      <w:pPr>
-        <w:pStyle w:val="PargrafodaLista"/>
-        <w:numPr>
-          <w:ilvl w:val="0"/>
-          <w:numId w:val="18"/>
-        </w:numPr>
-        <w:spacing w:after="0"/>
-        <w:jc w:val="both"/>
-      </w:pPr>
-      <w:r>
-        <w:rPr>
-          <w:b/>
-        </w:rPr>
-        <w:t>Dimensionamento Inteligente (Recomendação Base)</w:t>
-      </w:r>
-      <w:r>
-        <w:t xml:space="preserve"> </w:t>
-      </w:r>
-    </w:p>
-    <w:p>
-      <w:pPr>
-        <w:pStyle w:val="PargrafodaLista"/>
-        <w:spacing w:after="0"/>
-        <w:jc w:val="both"/>
-      </w:pPr>
-      <w:r>
-        <w:t xml:space="preserve">Ao preencher os dados do seu projeto nas abas Cômodos e </w:t>
-      </w:r>
-      <w:proofErr w:type="spellStart"/>
-      <w:r>
-        <w:t>TUEs</w:t>
-      </w:r>
-      <w:proofErr w:type="spellEnd"/>
-      <w:r>
-        <w:t>, a aba Guia Prático calcula automaticamente uma recomendação de segurança contendo:</w:t>
+    </w:p>
+    <w:p>
+      <w:pPr>
+        <w:jc w:val="center"/>
+      </w:pPr>
+    </w:p>
+    <w:p>
+      <w:pPr>
+        <w:spacing w:before="240"/>
+        <w:jc w:val="both"/>
+        <w:rPr>
+          <w:b/>
+          <w:sz w:val="36"/>
+          <w:szCs w:val="36"/>
+        </w:rPr>
+      </w:pPr>
+      <w:r>
+        <w:rPr>
+          <w:b/>
+          <w:sz w:val="36"/>
+          <w:szCs w:val="36"/>
+        </w:rPr>
+        <w:t xml:space="preserve">Parte 3: Perguntas Frequentes (FAQ) </w:t>
       </w:r>
     </w:p>
     <w:p>
@@ -2464,26 +1822,27 @@
           <w:ilvl w:val="0"/>
           <w:numId w:val="11"/>
         </w:numPr>
-        <w:jc w:val="both"/>
-        <w:rPr>
-          <w:rFonts w:eastAsia="Times New Roman"/>
-          <w:bCs/>
-        </w:rPr>
-      </w:pPr>
-      <w:r>
-        <w:rPr>
-          <w:rFonts w:eastAsia="Times New Roman"/>
-          <w:b/>
-          <w:bCs/>
-        </w:rPr>
-        <w:t>Disjuntor Geral:</w:t>
-      </w:r>
-      <w:r>
-        <w:rPr>
-          <w:rFonts w:eastAsia="Times New Roman"/>
-          <w:bCs/>
-        </w:rPr>
-        <w:t xml:space="preserve"> A amperagem base para a proteção do circuito.</w:t>
+        <w:spacing w:after="0"/>
+        <w:jc w:val="both"/>
+        <w:rPr>
+          <w:b/>
+        </w:rPr>
+      </w:pPr>
+      <w:r>
+        <w:rPr>
+          <w:b/>
+        </w:rPr>
+        <w:t>Pode colocar uma calculadora para fazer o cálculo do perímetro e da área sem sair do app?</w:t>
+      </w:r>
+    </w:p>
+    <w:p>
+      <w:pPr>
+        <w:spacing w:after="0"/>
+        <w:ind w:left="1066"/>
+        <w:jc w:val="both"/>
+      </w:pPr>
+      <w:r>
+        <w:t>R.: É algo para ser analisado e se possível colocar em futura versão.</w:t>
       </w:r>
     </w:p>
     <w:p>
@@ -2493,34 +1852,26 @@
           <w:ilvl w:val="0"/>
           <w:numId w:val="11"/>
         </w:numPr>
-        <w:jc w:val="both"/>
-        <w:rPr>
-          <w:rFonts w:eastAsia="Times New Roman"/>
-          <w:bCs/>
-        </w:rPr>
-      </w:pPr>
-      <w:r>
-        <w:rPr>
-          <w:rFonts w:eastAsia="Times New Roman"/>
-          <w:b/>
-          <w:bCs/>
-        </w:rPr>
-        <w:t>IDR recomendado</w:t>
-      </w:r>
-      <w:r>
-        <w:rPr>
-          <w:rFonts w:eastAsia="Times New Roman"/>
-          <w:b/>
-          <w:bCs/>
-        </w:rPr>
-        <w:t>:</w:t>
-      </w:r>
-      <w:r>
-        <w:rPr>
-          <w:rFonts w:eastAsia="Times New Roman"/>
-          <w:bCs/>
-        </w:rPr>
-        <w:t xml:space="preserve"> A corrente nominal mínima que o Interruptor Diferencial Residual deve ter para suportar a carga da casa sem desarmar.</w:t>
+        <w:spacing w:after="0"/>
+        <w:jc w:val="both"/>
+        <w:rPr>
+          <w:b/>
+        </w:rPr>
+      </w:pPr>
+      <w:r>
+        <w:rPr>
+          <w:b/>
+        </w:rPr>
+        <w:t>Pode fazer o cálculo de um cômodo só?</w:t>
+      </w:r>
+    </w:p>
+    <w:p>
+      <w:pPr>
+        <w:ind w:left="1068"/>
+        <w:jc w:val="both"/>
+      </w:pPr>
+      <w:r>
+        <w:t xml:space="preserve">R: Sim pode ser feito, mas não esqueçam que em uma residência para que tudo esteja em conformidade o certo é fazer o cálculo de tudo. Exemplo: se eu trocar um chuveiro de 5800W por um de 7800W, o disjuntor não será o mesmo. Isso vai influenciar no quadro geral. </w:t>
       </w:r>
     </w:p>
     <w:p>
@@ -2530,48 +1881,115 @@
           <w:ilvl w:val="0"/>
           <w:numId w:val="11"/>
         </w:numPr>
-        <w:jc w:val="both"/>
-        <w:rPr>
-          <w:rFonts w:eastAsia="Times New Roman"/>
-          <w:bCs/>
-        </w:rPr>
-      </w:pPr>
-      <w:r>
-        <w:rPr>
-          <w:rFonts w:eastAsia="Times New Roman"/>
-          <w:b/>
-          <w:bCs/>
-        </w:rPr>
-        <w:t>DPS recomendado</w:t>
-      </w:r>
-      <w:r>
-        <w:rPr>
-          <w:rFonts w:eastAsia="Times New Roman"/>
-          <w:b/>
-          <w:bCs/>
-        </w:rPr>
-        <w:t>:</w:t>
-      </w:r>
-      <w:r>
-        <w:rPr>
-          <w:rFonts w:eastAsia="Times New Roman"/>
-          <w:bCs/>
-        </w:rPr>
-        <w:t xml:space="preserve"> A classe e a voltagem ideal do Dispositivo de Proteção contra Surtos (Ex</w:t>
-      </w:r>
-      <w:r>
-        <w:rPr>
-          <w:rFonts w:eastAsia="Times New Roman"/>
-          <w:bCs/>
-        </w:rPr>
-        <w:t>.</w:t>
-      </w:r>
-      <w:r>
-        <w:rPr>
-          <w:rFonts w:eastAsia="Times New Roman"/>
-          <w:bCs/>
-        </w:rPr>
-        <w:t>: 175V para redes 127V, ou 275V para redes 220V).</w:t>
+        <w:spacing w:after="0"/>
+        <w:jc w:val="both"/>
+        <w:rPr>
+          <w:b/>
+        </w:rPr>
+      </w:pPr>
+      <w:r>
+        <w:rPr>
+          <w:b/>
+        </w:rPr>
+        <w:t>A quantidade de tomadas que aparece é o que a somos obrigados a colocar?</w:t>
+      </w:r>
+    </w:p>
+    <w:p>
+      <w:pPr>
+        <w:ind w:left="1068"/>
+        <w:jc w:val="both"/>
+      </w:pPr>
+      <w:r>
+        <w:t xml:space="preserve">R.: </w:t>
+      </w:r>
+      <w:r>
+        <w:t>A quantidade que o app mostra é a quantidade mínima de tomadas a serem colocadas conforme a norma NBR 5410.</w:t>
+      </w:r>
+    </w:p>
+    <w:p>
+      <w:pPr>
+        <w:ind w:left="1068"/>
+        <w:jc w:val="both"/>
+      </w:pPr>
+    </w:p>
+    <w:p>
+      <w:pPr>
+        <w:spacing w:before="240"/>
+        <w:jc w:val="both"/>
+        <w:rPr>
+          <w:b/>
+          <w:sz w:val="36"/>
+          <w:szCs w:val="36"/>
+        </w:rPr>
+      </w:pPr>
+      <w:r>
+        <w:rPr>
+          <w:b/>
+          <w:sz w:val="36"/>
+          <w:szCs w:val="36"/>
+        </w:rPr>
+        <w:lastRenderedPageBreak/>
+        <w:t xml:space="preserve">Parte </w:t>
+      </w:r>
+      <w:r>
+        <w:rPr>
+          <w:b/>
+          <w:sz w:val="36"/>
+          <w:szCs w:val="36"/>
+        </w:rPr>
+        <w:t>4</w:t>
+      </w:r>
+      <w:r>
+        <w:rPr>
+          <w:b/>
+          <w:sz w:val="36"/>
+          <w:szCs w:val="36"/>
+        </w:rPr>
+        <w:t>: Notas Técnicas e Normativas</w:t>
+      </w:r>
+    </w:p>
+    <w:p>
+      <w:pPr>
+        <w:pStyle w:val="PargrafodaLista"/>
+        <w:numPr>
+          <w:ilvl w:val="0"/>
+          <w:numId w:val="12"/>
+        </w:numPr>
+        <w:spacing w:before="160" w:after="0"/>
+        <w:ind w:left="357" w:hanging="357"/>
+        <w:jc w:val="both"/>
+        <w:rPr>
+          <w:b/>
+          <w:sz w:val="32"/>
+          <w:szCs w:val="32"/>
+        </w:rPr>
+      </w:pPr>
+      <w:r>
+        <w:rPr>
+          <w:b/>
+          <w:sz w:val="32"/>
+          <w:szCs w:val="32"/>
+        </w:rPr>
+        <w:t>Normas das instalações elétricas residenciais</w:t>
+      </w:r>
+    </w:p>
+    <w:p>
+      <w:pPr>
+        <w:pStyle w:val="PargrafodaLista"/>
+        <w:spacing w:after="0"/>
+        <w:ind w:left="360"/>
+        <w:jc w:val="both"/>
+      </w:pPr>
+      <w:r>
+        <w:t>O Perímetro é a soma de todos os lados (paredes) do cômodo, medido em metros lineares (m). No contexto da norma NBR 5410, enquanto a Área determina a potência da iluminação, o Perímetro é o dado fundamental para definir a quantidade mínima de tomadas de uso geral (</w:t>
+      </w:r>
+      <w:proofErr w:type="spellStart"/>
+      <w:r>
+        <w:t>TUGs</w:t>
+      </w:r>
+      <w:proofErr w:type="spellEnd"/>
+      <w:r>
+        <w:t xml:space="preserve">) por segurança, evitando o uso de benjamins e extensões. </w:t>
       </w:r>
     </w:p>
     <w:p>
@@ -2590,27 +2008,408 @@
       <w:r>
         <w:rPr>
           <w:rFonts w:eastAsia="Times New Roman"/>
-          <w:b/>
           <w:bCs/>
         </w:rPr>
-        <w:t>Nota:</w:t>
+        <w:t>Salas e Quartos (Cômodos Sociais): Exige no mínimo 1 tomada a cada 5 metros ou fração de perímetro. (Ex</w:t>
       </w:r>
       <w:r>
         <w:rPr>
           <w:rFonts w:eastAsia="Times New Roman"/>
           <w:bCs/>
         </w:rPr>
-        <w:t xml:space="preserve"> Esta seção só exibirá os resultados se você tiver adicionado ambientes e equipamentos nas abas anteriores.</w:t>
-      </w:r>
-    </w:p>
-    <w:p>
-      <w:pPr>
-        <w:ind w:left="708"/>
-        <w:jc w:val="center"/>
+        <w:t>.</w:t>
+      </w:r>
+      <w:r>
         <w:rPr>
           <w:rFonts w:eastAsia="Times New Roman"/>
           <w:bCs/>
         </w:rPr>
+        <w:t>: Quarto com 14 m de perímetro = 14 / 5 = 2.8. Arredondando para cima, o app calcula 3 tomadas).</w:t>
+      </w:r>
+    </w:p>
+    <w:p>
+      <w:pPr>
+        <w:pStyle w:val="PargrafodaLista"/>
+        <w:numPr>
+          <w:ilvl w:val="0"/>
+          <w:numId w:val="11"/>
+        </w:numPr>
+        <w:jc w:val="both"/>
+        <w:rPr>
+          <w:rFonts w:eastAsia="Times New Roman"/>
+          <w:bCs/>
+        </w:rPr>
+      </w:pPr>
+      <w:r>
+        <w:rPr>
+          <w:rFonts w:eastAsia="Times New Roman"/>
+          <w:bCs/>
+        </w:rPr>
+        <w:t>Cozinhas e Áreas de Serviço: A norma é mais rígida e exige 1 tomada a cada 3,5 metros ou fração de perímetro.</w:t>
+      </w:r>
+    </w:p>
+    <w:p>
+      <w:pPr>
+        <w:pStyle w:val="PargrafodaLista"/>
+        <w:numPr>
+          <w:ilvl w:val="0"/>
+          <w:numId w:val="12"/>
+        </w:numPr>
+        <w:spacing w:before="160" w:after="0"/>
+        <w:ind w:left="357" w:hanging="357"/>
+        <w:jc w:val="both"/>
+        <w:rPr>
+          <w:b/>
+          <w:sz w:val="32"/>
+          <w:szCs w:val="32"/>
+        </w:rPr>
+      </w:pPr>
+      <w:r>
+        <w:rPr>
+          <w:b/>
+          <w:sz w:val="32"/>
+          <w:szCs w:val="32"/>
+        </w:rPr>
+        <w:t xml:space="preserve">Nem sempre 220V </w:t>
+      </w:r>
+      <w:r>
+        <w:rPr>
+          <w:b/>
+          <w:sz w:val="32"/>
+          <w:szCs w:val="32"/>
+        </w:rPr>
+        <w:t>significa bifásico</w:t>
+      </w:r>
+      <w:r>
+        <w:rPr>
+          <w:b/>
+          <w:sz w:val="32"/>
+          <w:szCs w:val="32"/>
+        </w:rPr>
+        <w:t xml:space="preserve"> (O Motivo Técnico)</w:t>
+      </w:r>
+    </w:p>
+    <w:p>
+      <w:pPr>
+        <w:pStyle w:val="PargrafodaLista"/>
+        <w:spacing w:after="0"/>
+        <w:ind w:left="360"/>
+        <w:jc w:val="both"/>
+      </w:pPr>
+      <w:r>
+        <w:t>O Brasil divide-se em dois grandes blocos de distribuição:</w:t>
+      </w:r>
+    </w:p>
+    <w:p>
+      <w:pPr>
+        <w:pStyle w:val="PargrafodaLista"/>
+        <w:numPr>
+          <w:ilvl w:val="0"/>
+          <w:numId w:val="11"/>
+        </w:numPr>
+        <w:jc w:val="both"/>
+        <w:rPr>
+          <w:rFonts w:eastAsia="Times New Roman"/>
+          <w:bCs/>
+        </w:rPr>
+      </w:pPr>
+      <w:r>
+        <w:rPr>
+          <w:rFonts w:eastAsia="Times New Roman"/>
+          <w:bCs/>
+        </w:rPr>
+        <w:t>Sistema 380V/220V (Nordeste, Sul, partes do Centro-Oeste/Sudeste): A fase já tem</w:t>
+      </w:r>
+      <w:r>
+        <w:rPr>
+          <w:rFonts w:eastAsia="Times New Roman"/>
+          <w:bCs/>
+        </w:rPr>
+        <w:t xml:space="preserve"> </w:t>
+      </w:r>
+      <w:r>
+        <w:rPr>
+          <w:rFonts w:eastAsia="Times New Roman"/>
+          <w:bCs/>
+        </w:rPr>
+        <w:t>220V. Portanto, Fase + Neutro = 220V (Monofásico).</w:t>
+      </w:r>
+    </w:p>
+    <w:p>
+      <w:pPr>
+        <w:pStyle w:val="PargrafodaLista"/>
+        <w:numPr>
+          <w:ilvl w:val="0"/>
+          <w:numId w:val="11"/>
+        </w:numPr>
+        <w:jc w:val="both"/>
+        <w:rPr>
+          <w:rFonts w:eastAsia="Times New Roman"/>
+          <w:bCs/>
+        </w:rPr>
+      </w:pPr>
+      <w:r>
+        <w:rPr>
+          <w:rFonts w:eastAsia="Times New Roman"/>
+          <w:bCs/>
+        </w:rPr>
+        <w:t xml:space="preserve">Sistema 220V/127V (Sudeste, Norte, </w:t>
+      </w:r>
+      <w:proofErr w:type="spellStart"/>
+      <w:r>
+        <w:rPr>
+          <w:rFonts w:eastAsia="Times New Roman"/>
+          <w:bCs/>
+        </w:rPr>
+        <w:t>ex</w:t>
+      </w:r>
+      <w:proofErr w:type="spellEnd"/>
+      <w:r>
+        <w:rPr>
+          <w:rFonts w:eastAsia="Times New Roman"/>
+          <w:bCs/>
+        </w:rPr>
+        <w:t>: CPFL, Enel SP): A fase tem 127V.</w:t>
+      </w:r>
+      <w:r>
+        <w:rPr>
+          <w:rFonts w:eastAsia="Times New Roman"/>
+          <w:bCs/>
+        </w:rPr>
+        <w:t xml:space="preserve"> </w:t>
+      </w:r>
+      <w:r>
+        <w:rPr>
+          <w:rFonts w:eastAsia="Times New Roman"/>
+          <w:bCs/>
+        </w:rPr>
+        <w:t>Para obter 220V, o padrão precisa puxar duas fases: Fase + Fase = 220V (Bifásico).</w:t>
+      </w:r>
+    </w:p>
+    <w:p>
+      <w:pPr>
+        <w:pStyle w:val="PargrafodaLista"/>
+        <w:numPr>
+          <w:ilvl w:val="0"/>
+          <w:numId w:val="12"/>
+        </w:numPr>
+        <w:spacing w:before="160" w:after="0"/>
+        <w:ind w:left="357" w:hanging="357"/>
+        <w:jc w:val="both"/>
+        <w:rPr>
+          <w:b/>
+          <w:sz w:val="32"/>
+          <w:szCs w:val="32"/>
+        </w:rPr>
+      </w:pPr>
+      <w:r>
+        <w:rPr>
+          <w:b/>
+          <w:sz w:val="32"/>
+          <w:szCs w:val="32"/>
+        </w:rPr>
+        <w:t>Diferença entre Prédio e Casa</w:t>
+      </w:r>
+    </w:p>
+    <w:p>
+      <w:pPr>
+        <w:pStyle w:val="PargrafodaLista"/>
+        <w:spacing w:after="0"/>
+        <w:ind w:left="360"/>
+        <w:jc w:val="both"/>
+      </w:pPr>
+      <w:r>
+        <w:t>O motor de cálculo atua como um "fiscal da concessionária" muito rigoroso para ligações no poste da rua. Para uma casa, se a carga passa de 25 kW (</w:t>
+      </w:r>
+      <w:proofErr w:type="spellStart"/>
+      <w:r>
+        <w:t>ex</w:t>
+      </w:r>
+      <w:proofErr w:type="spellEnd"/>
+      <w:r>
+        <w:t>: 28.148 VA), a distribuidora corta o bifásico e obriga a colocar o trifásico para não desequilibrar a rua (sugerindo cabos de 25 mm2 e Disjuntor de 80 A).</w:t>
+      </w:r>
+    </w:p>
+    <w:p>
+      <w:pPr>
+        <w:pStyle w:val="PargrafodaLista"/>
+        <w:spacing w:after="0"/>
+        <w:ind w:left="360"/>
+        <w:jc w:val="both"/>
+      </w:pPr>
+      <w:r>
+        <w:t>No entanto, no apartamento a realidade é outra devido a dois conceitos:</w:t>
+      </w:r>
+    </w:p>
+    <w:p>
+      <w:pPr>
+        <w:pStyle w:val="PargrafodaLista"/>
+        <w:numPr>
+          <w:ilvl w:val="0"/>
+          <w:numId w:val="11"/>
+        </w:numPr>
+        <w:jc w:val="both"/>
+        <w:rPr>
+          <w:rFonts w:eastAsia="Times New Roman"/>
+          <w:bCs/>
+        </w:rPr>
+      </w:pPr>
+      <w:r>
+        <w:rPr>
+          <w:rFonts w:eastAsia="Times New Roman"/>
+          <w:bCs/>
+        </w:rPr>
+        <w:t>A Regra do Prédio: O prédio recebe energia Trifásica pesada. O engenheiro distribui as três fases alternadamente pelos andares (</w:t>
+      </w:r>
+      <w:proofErr w:type="spellStart"/>
+      <w:r>
+        <w:rPr>
+          <w:rFonts w:eastAsia="Times New Roman"/>
+          <w:bCs/>
+        </w:rPr>
+        <w:t>ex</w:t>
+      </w:r>
+      <w:proofErr w:type="spellEnd"/>
+      <w:r>
+        <w:rPr>
+          <w:rFonts w:eastAsia="Times New Roman"/>
+          <w:bCs/>
+        </w:rPr>
+        <w:t>: Apto 11 recebe Fases A e B). Por isso, mesmo que a carga passe dos 25 kW, o projeto interno permite manter a unidade como bifásica, pois o equilíbrio é feito no conjunto do prédio.</w:t>
+      </w:r>
+    </w:p>
+    <w:p>
+      <w:pPr>
+        <w:pStyle w:val="PargrafodaLista"/>
+        <w:numPr>
+          <w:ilvl w:val="0"/>
+          <w:numId w:val="11"/>
+        </w:numPr>
+        <w:jc w:val="both"/>
+        <w:rPr>
+          <w:rFonts w:eastAsia="Times New Roman"/>
+          <w:bCs/>
+        </w:rPr>
+      </w:pPr>
+      <w:r>
+        <w:rPr>
+          <w:rFonts w:eastAsia="Times New Roman"/>
+          <w:bCs/>
+        </w:rPr>
+        <w:t xml:space="preserve">O Fator de Simultaneidade Real e a Seletividade: Um disjuntor Bifásico de 70A a </w:t>
+      </w:r>
+      <w:r>
+        <w:rPr>
+          <w:rFonts w:eastAsia="Times New Roman"/>
+          <w:bCs/>
+        </w:rPr>
+        <w:t>22</w:t>
+      </w:r>
+      <w:r>
+        <w:rPr>
+          <w:rFonts w:eastAsia="Times New Roman"/>
+          <w:bCs/>
+        </w:rPr>
+        <w:t>0V suporta 15.400 VA. A demanda diária raramente atinge a carga total instalada (ninguém liga todos os chuveiros e ares-condicionados no mesmo segundo). Por isso o disjuntor de 70A e o cabo de 10 mm2 funcionam perfeitamente na prática, pois a corrente de uso costuma flutuar entre 30A e 50A. Além disso, o disjuntor do medidor (70A) é maior que o interno (63A) por Seletividade, garantindo que o</w:t>
+      </w:r>
+      <w:r>
+        <w:rPr>
+          <w:rFonts w:eastAsia="Times New Roman"/>
+          <w:bCs/>
+        </w:rPr>
+        <w:t xml:space="preserve"> </w:t>
+      </w:r>
+      <w:r>
+        <w:rPr>
+          <w:rFonts w:eastAsia="Times New Roman"/>
+          <w:bCs/>
+        </w:rPr>
+        <w:t>desarme aconteça dentro de casa em caso de pico extremo.</w:t>
+      </w:r>
+    </w:p>
+    <w:p>
+      <w:pPr>
+        <w:pStyle w:val="PargrafodaLista"/>
+        <w:spacing w:before="160" w:after="0"/>
+        <w:ind w:left="360"/>
+        <w:jc w:val="both"/>
+      </w:pPr>
+    </w:p>
+    <w:p>
+      <w:pPr>
+        <w:spacing w:before="240"/>
+        <w:jc w:val="both"/>
+        <w:rPr>
+          <w:b/>
+          <w:sz w:val="36"/>
+          <w:szCs w:val="36"/>
+        </w:rPr>
+      </w:pPr>
+    </w:p>
+    <w:p>
+      <w:pPr>
+        <w:spacing w:before="240"/>
+        <w:jc w:val="both"/>
+        <w:rPr>
+          <w:b/>
+          <w:sz w:val="36"/>
+          <w:szCs w:val="36"/>
+        </w:rPr>
+      </w:pPr>
+    </w:p>
+    <w:p>
+      <w:pPr>
+        <w:spacing w:before="240"/>
+        <w:jc w:val="both"/>
+        <w:rPr>
+          <w:b/>
+          <w:sz w:val="36"/>
+          <w:szCs w:val="36"/>
+        </w:rPr>
+      </w:pPr>
+      <w:r>
+        <w:rPr>
+          <w:b/>
+          <w:sz w:val="36"/>
+          <w:szCs w:val="36"/>
+        </w:rPr>
+        <w:lastRenderedPageBreak/>
+        <w:t xml:space="preserve">Parte </w:t>
+      </w:r>
+      <w:r>
+        <w:rPr>
+          <w:b/>
+          <w:sz w:val="36"/>
+          <w:szCs w:val="36"/>
+        </w:rPr>
+        <w:t>5</w:t>
+      </w:r>
+      <w:r>
+        <w:rPr>
+          <w:b/>
+          <w:sz w:val="36"/>
+          <w:szCs w:val="36"/>
+        </w:rPr>
+        <w:t>: Aba Guia Prático (Soluções de Campo)</w:t>
+      </w:r>
+    </w:p>
+    <w:p>
+      <w:pPr>
+        <w:pStyle w:val="PargrafodaLista"/>
+        <w:spacing w:after="0"/>
+        <w:ind w:left="360"/>
+        <w:jc w:val="both"/>
+      </w:pPr>
+      <w:r>
+        <w:t>Esta nova aba foi desenvolvida para ser o "canivete suíço" do eletricista no dia a dia da obra, oferecendo consultas rápidas, alertas de segurança e referências visuais de montagem.</w:t>
+      </w:r>
+    </w:p>
+    <w:p>
+      <w:pPr>
+        <w:pStyle w:val="PargrafodaLista"/>
+        <w:spacing w:after="0"/>
+        <w:ind w:left="360"/>
+        <w:jc w:val="center"/>
       </w:pPr>
       <w:r>
         <w:rPr>
@@ -2618,10 +2417,10 @@
           <w:lang w:val="en-US"/>
         </w:rPr>
         <w:drawing>
-          <wp:inline distT="0" distB="0" distL="0" distR="0" wp14:anchorId="5D59D218" wp14:editId="59DDD150">
-            <wp:extent cx="1497226" cy="2543175"/>
-            <wp:effectExtent l="0" t="0" r="8255" b="0"/>
-            <wp:docPr id="4" name="Imagem 4"/>
+          <wp:inline distT="0" distB="0" distL="0" distR="0" wp14:anchorId="46032CB9" wp14:editId="475C3827">
+            <wp:extent cx="1457184" cy="2524125"/>
+            <wp:effectExtent l="0" t="0" r="0" b="0"/>
+            <wp:docPr id="3" name="Imagem 3"/>
             <wp:cNvGraphicFramePr>
               <a:graphicFrameLocks xmlns:a="http://schemas.openxmlformats.org/drawingml/2006/main" noChangeAspect="1"/>
             </wp:cNvGraphicFramePr>
@@ -2641,7 +2440,7 @@
                   <pic:spPr>
                     <a:xfrm>
                       <a:off x="0" y="0"/>
-                      <a:ext cx="1509890" cy="2564687"/>
+                      <a:ext cx="1469718" cy="2545837"/>
                     </a:xfrm>
                     <a:prstGeom prst="rect">
                       <a:avLst/>
@@ -2653,6 +2452,9 @@
           </wp:inline>
         </w:drawing>
       </w:r>
+      <w:r>
+        <w:t xml:space="preserve">    </w:t>
+      </w:r>
     </w:p>
     <w:p>
       <w:pPr>
@@ -2668,7 +2470,10 @@
         <w:rPr>
           <w:b/>
         </w:rPr>
-        <w:t>Manuais Visuais e Situações do Dia a Dia</w:t>
+        <w:t>Dimensionamento Inteligente (Recomendação Base)</w:t>
+      </w:r>
+      <w:r>
+        <w:t xml:space="preserve"> </w:t>
       </w:r>
     </w:p>
     <w:p>
@@ -2678,7 +2483,15 @@
         <w:jc w:val="both"/>
       </w:pPr>
       <w:r>
-        <w:t>O guia traz quatro módulos de consulta rápida para resolver dúvidas comuns e elevar o padrão do seu serviço:</w:t>
+        <w:t xml:space="preserve">Ao preencher os dados do seu projeto nas abas Cômodos e </w:t>
+      </w:r>
+      <w:proofErr w:type="spellStart"/>
+      <w:r>
+        <w:t>TUEs</w:t>
+      </w:r>
+      <w:proofErr w:type="spellEnd"/>
+      <w:r>
+        <w:t>, a aba Guia Prático calcula automaticamente uma recomendação de segurança contendo:</w:t>
       </w:r>
     </w:p>
     <w:p>
@@ -2689,25 +2502,152 @@
           <w:numId w:val="11"/>
         </w:numPr>
         <w:jc w:val="both"/>
-      </w:pPr>
-      <w:r>
         <w:rPr>
           <w:rFonts w:eastAsia="Times New Roman"/>
-          <w:b/>
           <w:bCs/>
         </w:rPr>
-        <w:lastRenderedPageBreak/>
-        <w:t xml:space="preserve">IDR em instalações sem Fio Terra: </w:t>
-      </w:r>
-      <w:r>
-        <w:t>Um alerta didático que quebra o mito de que o IDR precisa de aterramento para funcionar, mostrando como ele protege vidas mesmo em casas antigas.</w:t>
-      </w:r>
-    </w:p>
-    <w:p>
-      <w:pPr>
-        <w:pStyle w:val="PargrafodaLista"/>
-        <w:ind w:left="1068"/>
+      </w:pPr>
+      <w:r>
+        <w:rPr>
+          <w:rFonts w:eastAsia="Times New Roman"/>
+          <w:b/>
+          <w:bCs/>
+        </w:rPr>
+        <w:t>Disjuntor Geral:</w:t>
+      </w:r>
+      <w:r>
+        <w:rPr>
+          <w:rFonts w:eastAsia="Times New Roman"/>
+          <w:bCs/>
+        </w:rPr>
+        <w:t xml:space="preserve"> A amperagem base para a proteção do circuito.</w:t>
+      </w:r>
+    </w:p>
+    <w:p>
+      <w:pPr>
+        <w:pStyle w:val="PargrafodaLista"/>
+        <w:numPr>
+          <w:ilvl w:val="0"/>
+          <w:numId w:val="11"/>
+        </w:numPr>
+        <w:jc w:val="both"/>
+        <w:rPr>
+          <w:rFonts w:eastAsia="Times New Roman"/>
+          <w:bCs/>
+        </w:rPr>
+      </w:pPr>
+      <w:r>
+        <w:rPr>
+          <w:rFonts w:eastAsia="Times New Roman"/>
+          <w:b/>
+          <w:bCs/>
+        </w:rPr>
+        <w:t>IDR recomendado</w:t>
+      </w:r>
+      <w:r>
+        <w:rPr>
+          <w:rFonts w:eastAsia="Times New Roman"/>
+          <w:b/>
+          <w:bCs/>
+        </w:rPr>
+        <w:t>:</w:t>
+      </w:r>
+      <w:r>
+        <w:rPr>
+          <w:rFonts w:eastAsia="Times New Roman"/>
+          <w:bCs/>
+        </w:rPr>
+        <w:t xml:space="preserve"> A corrente nominal mínima que o Interruptor Diferencial Residual deve ter para suportar a carga da casa sem desarmar.</w:t>
+      </w:r>
+    </w:p>
+    <w:p>
+      <w:pPr>
+        <w:pStyle w:val="PargrafodaLista"/>
+        <w:numPr>
+          <w:ilvl w:val="0"/>
+          <w:numId w:val="11"/>
+        </w:numPr>
+        <w:jc w:val="both"/>
+        <w:rPr>
+          <w:rFonts w:eastAsia="Times New Roman"/>
+          <w:bCs/>
+        </w:rPr>
+      </w:pPr>
+      <w:r>
+        <w:rPr>
+          <w:rFonts w:eastAsia="Times New Roman"/>
+          <w:b/>
+          <w:bCs/>
+        </w:rPr>
+        <w:t>DPS recomendado</w:t>
+      </w:r>
+      <w:r>
+        <w:rPr>
+          <w:rFonts w:eastAsia="Times New Roman"/>
+          <w:b/>
+          <w:bCs/>
+        </w:rPr>
+        <w:t>:</w:t>
+      </w:r>
+      <w:r>
+        <w:rPr>
+          <w:rFonts w:eastAsia="Times New Roman"/>
+          <w:bCs/>
+        </w:rPr>
+        <w:t xml:space="preserve"> A classe e a voltagem ideal do Dispositivo de Proteção contra Surtos (Ex</w:t>
+      </w:r>
+      <w:r>
+        <w:rPr>
+          <w:rFonts w:eastAsia="Times New Roman"/>
+          <w:bCs/>
+        </w:rPr>
+        <w:t>.</w:t>
+      </w:r>
+      <w:r>
+        <w:rPr>
+          <w:rFonts w:eastAsia="Times New Roman"/>
+          <w:bCs/>
+        </w:rPr>
+        <w:t>: 175V para redes 127V, ou 275V para redes 220V).</w:t>
+      </w:r>
+    </w:p>
+    <w:p>
+      <w:pPr>
+        <w:pStyle w:val="PargrafodaLista"/>
+        <w:numPr>
+          <w:ilvl w:val="0"/>
+          <w:numId w:val="11"/>
+        </w:numPr>
+        <w:jc w:val="both"/>
+        <w:rPr>
+          <w:rFonts w:eastAsia="Times New Roman"/>
+          <w:bCs/>
+        </w:rPr>
+      </w:pPr>
+      <w:r>
+        <w:rPr>
+          <w:rFonts w:eastAsia="Times New Roman"/>
+          <w:b/>
+          <w:bCs/>
+        </w:rPr>
+        <w:t>Nota:</w:t>
+      </w:r>
+      <w:r>
+        <w:rPr>
+          <w:rFonts w:eastAsia="Times New Roman"/>
+          <w:bCs/>
+        </w:rPr>
+        <w:t xml:space="preserve"> Esta seção só exibirá os resultados se você tiver adicionado ambientes e equipamentos nas abas anteriores.</w:t>
+      </w:r>
+    </w:p>
+    <w:p>
+      <w:pPr>
+        <w:ind w:left="708"/>
         <w:jc w:val="center"/>
+        <w:rPr>
+          <w:rFonts w:eastAsia="Times New Roman"/>
+          <w:bCs/>
+        </w:rPr>
       </w:pPr>
       <w:r>
         <w:rPr>
@@ -2715,10 +2655,10 @@
           <w:lang w:val="en-US"/>
         </w:rPr>
         <w:drawing>
-          <wp:inline distT="0" distB="0" distL="0" distR="0" wp14:anchorId="798B512E" wp14:editId="197AD056">
-            <wp:extent cx="1328920" cy="2238375"/>
-            <wp:effectExtent l="0" t="0" r="5080" b="0"/>
-            <wp:docPr id="5" name="Imagem 5"/>
+          <wp:inline distT="0" distB="0" distL="0" distR="0" wp14:anchorId="5D59D218" wp14:editId="59DDD150">
+            <wp:extent cx="1497226" cy="2543175"/>
+            <wp:effectExtent l="0" t="0" r="8255" b="0"/>
+            <wp:docPr id="4" name="Imagem 4"/>
             <wp:cNvGraphicFramePr>
               <a:graphicFrameLocks xmlns:a="http://schemas.openxmlformats.org/drawingml/2006/main" noChangeAspect="1"/>
             </wp:cNvGraphicFramePr>
@@ -2738,7 +2678,7 @@
                   <pic:spPr>
                     <a:xfrm>
                       <a:off x="0" y="0"/>
-                      <a:ext cx="1360310" cy="2291247"/>
+                      <a:ext cx="1509890" cy="2564687"/>
                     </a:xfrm>
                     <a:prstGeom prst="rect">
                       <a:avLst/>
@@ -2756,6 +2696,33 @@
         <w:pStyle w:val="PargrafodaLista"/>
         <w:numPr>
           <w:ilvl w:val="0"/>
+          <w:numId w:val="18"/>
+        </w:numPr>
+        <w:spacing w:after="0"/>
+        <w:jc w:val="both"/>
+      </w:pPr>
+      <w:r>
+        <w:rPr>
+          <w:b/>
+        </w:rPr>
+        <w:t>Manuais Visuais e Situações do Dia a Dia</w:t>
+      </w:r>
+    </w:p>
+    <w:p>
+      <w:pPr>
+        <w:pStyle w:val="PargrafodaLista"/>
+        <w:spacing w:after="0"/>
+        <w:jc w:val="both"/>
+      </w:pPr>
+      <w:r>
+        <w:t>O guia traz quatro módulos de consulta rápida para resolver dúvidas comuns e elevar o padrão do seu serviço:</w:t>
+      </w:r>
+    </w:p>
+    <w:p>
+      <w:pPr>
+        <w:pStyle w:val="PargrafodaLista"/>
+        <w:numPr>
+          <w:ilvl w:val="0"/>
           <w:numId w:val="11"/>
         </w:numPr>
         <w:jc w:val="both"/>
@@ -2766,10 +2733,11 @@
           <w:b/>
           <w:bCs/>
         </w:rPr>
-        <w:t xml:space="preserve">DPS sem Aterramento (Alerta Crítico): </w:t>
-      </w:r>
-      <w:r>
-        <w:t>Documentação técnica mostrando o risco de instalar um DPS sem conectar ao barramento de terra, o que inutiliza o componente e gera risco de incêndio.</w:t>
+        <w:lastRenderedPageBreak/>
+        <w:t xml:space="preserve">IDR em instalações sem Fio Terra: </w:t>
+      </w:r>
+      <w:r>
+        <w:t>Um alerta didático que quebra o mito de que o IDR precisa de aterramento para funcionar, mostrando como ele protege vidas mesmo em casas antigas.</w:t>
       </w:r>
     </w:p>
     <w:p>
@@ -2784,10 +2752,10 @@
           <w:lang w:val="en-US"/>
         </w:rPr>
         <w:drawing>
-          <wp:inline distT="0" distB="0" distL="0" distR="0" wp14:anchorId="4128AA8F" wp14:editId="10988791">
-            <wp:extent cx="1333594" cy="2257425"/>
-            <wp:effectExtent l="0" t="0" r="0" b="0"/>
-            <wp:docPr id="6" name="Imagem 6"/>
+          <wp:inline distT="0" distB="0" distL="0" distR="0" wp14:anchorId="798B512E" wp14:editId="197AD056">
+            <wp:extent cx="1328920" cy="2238375"/>
+            <wp:effectExtent l="0" t="0" r="5080" b="0"/>
+            <wp:docPr id="5" name="Imagem 5"/>
             <wp:cNvGraphicFramePr>
               <a:graphicFrameLocks xmlns:a="http://schemas.openxmlformats.org/drawingml/2006/main" noChangeAspect="1"/>
             </wp:cNvGraphicFramePr>
@@ -2807,7 +2775,7 @@
                   <pic:spPr>
                     <a:xfrm>
                       <a:off x="0" y="0"/>
-                      <a:ext cx="1344536" cy="2275947"/>
+                      <a:ext cx="1360310" cy="2291247"/>
                     </a:xfrm>
                     <a:prstGeom prst="rect">
                       <a:avLst/>
@@ -2829,26 +2797,16 @@
         </w:numPr>
         <w:jc w:val="both"/>
       </w:pPr>
-      <w:proofErr w:type="spellStart"/>
       <w:r>
         <w:rPr>
           <w:rFonts w:eastAsia="Times New Roman"/>
           <w:b/>
           <w:bCs/>
         </w:rPr>
-        <w:t>Retrofit</w:t>
-      </w:r>
-      <w:proofErr w:type="spellEnd"/>
-      <w:r>
-        <w:rPr>
-          <w:rFonts w:eastAsia="Times New Roman"/>
-          <w:b/>
-          <w:bCs/>
-        </w:rPr>
-        <w:t xml:space="preserve"> (Modernizando Quadro de Madeira): </w:t>
-      </w:r>
-      <w:r>
-        <w:t>Um passo a passo prático de como substituir quadros antigos de embutir usando caixas de sobrepor e espuma expansiva (PU corta-fogo), sem precisar quebrar a parede do cliente.</w:t>
+        <w:t xml:space="preserve">DPS sem Aterramento (Alerta Crítico): </w:t>
+      </w:r>
+      <w:r>
+        <w:t>Documentação técnica mostrando o risco de instalar um DPS sem conectar ao barramento de terra, o que inutiliza o componente e gera risco de incêndio.</w:t>
       </w:r>
     </w:p>
     <w:p>
@@ -2863,10 +2821,10 @@
           <w:lang w:val="en-US"/>
         </w:rPr>
         <w:drawing>
-          <wp:inline distT="0" distB="0" distL="0" distR="0" wp14:anchorId="4BA81A7D" wp14:editId="0F04069B">
-            <wp:extent cx="1400175" cy="2356962"/>
-            <wp:effectExtent l="0" t="0" r="0" b="5715"/>
-            <wp:docPr id="7" name="Imagem 7"/>
+          <wp:inline distT="0" distB="0" distL="0" distR="0" wp14:anchorId="4128AA8F" wp14:editId="10988791">
+            <wp:extent cx="1333594" cy="2257425"/>
+            <wp:effectExtent l="0" t="0" r="0" b="0"/>
+            <wp:docPr id="6" name="Imagem 6"/>
             <wp:cNvGraphicFramePr>
               <a:graphicFrameLocks xmlns:a="http://schemas.openxmlformats.org/drawingml/2006/main" noChangeAspect="1"/>
             </wp:cNvGraphicFramePr>
@@ -2886,7 +2844,7 @@
                   <pic:spPr>
                     <a:xfrm>
                       <a:off x="0" y="0"/>
-                      <a:ext cx="1415504" cy="2382766"/>
+                      <a:ext cx="1344536" cy="2275947"/>
                     </a:xfrm>
                     <a:prstGeom prst="rect">
                       <a:avLst/>
@@ -2908,20 +2866,26 @@
         </w:numPr>
         <w:jc w:val="both"/>
       </w:pPr>
+      <w:proofErr w:type="spellStart"/>
       <w:r>
         <w:rPr>
           <w:rFonts w:eastAsia="Times New Roman"/>
           <w:b/>
           <w:bCs/>
         </w:rPr>
-        <w:lastRenderedPageBreak/>
-        <w:t xml:space="preserve">Galeria de Quadros (Padrões de Montagem): </w:t>
-      </w:r>
-      <w:r>
-        <w:t>Um banco de imagens integrado ao aplicativo com exemplos de Quadros de Distribuição bem montados, detalhando o uso</w:t>
-      </w:r>
-      <w:r>
-        <w:t xml:space="preserve"> de barramentos tipo pente, terminais ilhós e separação de circuitos para você usar de inspiração.</w:t>
+        <w:t>Retrofit</w:t>
+      </w:r>
+      <w:proofErr w:type="spellEnd"/>
+      <w:r>
+        <w:rPr>
+          <w:rFonts w:eastAsia="Times New Roman"/>
+          <w:b/>
+          <w:bCs/>
+        </w:rPr>
+        <w:t xml:space="preserve"> (Modernizando Quadro de Madeira): </w:t>
+      </w:r>
+      <w:r>
+        <w:t>Um passo a passo prático de como substituir quadros antigos de embutir usando caixas de sobrepor e espuma expansiva (PU corta-fogo), sem precisar quebrar a parede do cliente.</w:t>
       </w:r>
     </w:p>
     <w:p>
@@ -2936,10 +2900,10 @@
           <w:lang w:val="en-US"/>
         </w:rPr>
         <w:drawing>
-          <wp:inline distT="0" distB="0" distL="0" distR="0" wp14:anchorId="7863969D" wp14:editId="5A8D18BC">
-            <wp:extent cx="1410557" cy="2390775"/>
-            <wp:effectExtent l="0" t="0" r="0" b="0"/>
-            <wp:docPr id="8" name="Imagem 8"/>
+          <wp:inline distT="0" distB="0" distL="0" distR="0" wp14:anchorId="4BA81A7D" wp14:editId="0F04069B">
+            <wp:extent cx="1400175" cy="2356962"/>
+            <wp:effectExtent l="0" t="0" r="0" b="5715"/>
+            <wp:docPr id="7" name="Imagem 7"/>
             <wp:cNvGraphicFramePr>
               <a:graphicFrameLocks xmlns:a="http://schemas.openxmlformats.org/drawingml/2006/main" noChangeAspect="1"/>
             </wp:cNvGraphicFramePr>
@@ -2959,6 +2923,79 @@
                   <pic:spPr>
                     <a:xfrm>
                       <a:off x="0" y="0"/>
+                      <a:ext cx="1415504" cy="2382766"/>
+                    </a:xfrm>
+                    <a:prstGeom prst="rect">
+                      <a:avLst/>
+                    </a:prstGeom>
+                  </pic:spPr>
+                </pic:pic>
+              </a:graphicData>
+            </a:graphic>
+          </wp:inline>
+        </w:drawing>
+      </w:r>
+    </w:p>
+    <w:p>
+      <w:pPr>
+        <w:pStyle w:val="PargrafodaLista"/>
+        <w:numPr>
+          <w:ilvl w:val="0"/>
+          <w:numId w:val="11"/>
+        </w:numPr>
+        <w:jc w:val="both"/>
+      </w:pPr>
+      <w:r>
+        <w:rPr>
+          <w:rFonts w:eastAsia="Times New Roman"/>
+          <w:b/>
+          <w:bCs/>
+        </w:rPr>
+        <w:lastRenderedPageBreak/>
+        <w:t xml:space="preserve">Galeria de Quadros (Padrões de Montagem): </w:t>
+      </w:r>
+      <w:r>
+        <w:t>Um banco de imagens integrado ao aplicativo com exemplos de Quadros de Distribuição bem montados, detalhando o uso</w:t>
+      </w:r>
+      <w:r>
+        <w:t xml:space="preserve"> de barramentos tipo pente, terminais ilhós e separação de circuitos para você usar de inspiração.</w:t>
+      </w:r>
+    </w:p>
+    <w:p>
+      <w:pPr>
+        <w:pStyle w:val="PargrafodaLista"/>
+        <w:ind w:left="1068"/>
+        <w:jc w:val="center"/>
+      </w:pPr>
+      <w:r>
+        <w:rPr>
+          <w:noProof/>
+          <w:lang w:val="en-US"/>
+        </w:rPr>
+        <w:drawing>
+          <wp:inline distT="0" distB="0" distL="0" distR="0" wp14:anchorId="7863969D" wp14:editId="5A8D18BC">
+            <wp:extent cx="1410557" cy="2390775"/>
+            <wp:effectExtent l="0" t="0" r="0" b="0"/>
+            <wp:docPr id="8" name="Imagem 8"/>
+            <wp:cNvGraphicFramePr>
+              <a:graphicFrameLocks xmlns:a="http://schemas.openxmlformats.org/drawingml/2006/main" noChangeAspect="1"/>
+            </wp:cNvGraphicFramePr>
+            <a:graphic xmlns:a="http://schemas.openxmlformats.org/drawingml/2006/main">
+              <a:graphicData uri="http://schemas.openxmlformats.org/drawingml/2006/picture">
+                <pic:pic xmlns:pic="http://schemas.openxmlformats.org/drawingml/2006/picture">
+                  <pic:nvPicPr>
+                    <pic:cNvPr id="1" name=""/>
+                    <pic:cNvPicPr/>
+                  </pic:nvPicPr>
+                  <pic:blipFill>
+                    <a:blip r:embed="rId29"/>
+                    <a:stretch>
+                      <a:fillRect/>
+                    </a:stretch>
+                  </pic:blipFill>
+                  <pic:spPr>
+                    <a:xfrm>
+                      <a:off x="0" y="0"/>
                       <a:ext cx="1421076" cy="2408603"/>
                     </a:xfrm>
                     <a:prstGeom prst="rect">
@@ -4177,10 +4214,10 @@
         <w:tblLook w:val="04A0" w:firstRow="1" w:lastRow="0" w:firstColumn="1" w:lastColumn="0" w:noHBand="0" w:noVBand="1"/>
       </w:tblPr>
       <w:tblGrid>
-        <w:gridCol w:w="2012"/>
-        <w:gridCol w:w="2570"/>
-        <w:gridCol w:w="1904"/>
-        <w:gridCol w:w="2164"/>
+        <w:gridCol w:w="1920"/>
+        <w:gridCol w:w="2451"/>
+        <w:gridCol w:w="1816"/>
+        <w:gridCol w:w="2064"/>
       </w:tblGrid>
       <w:tr>
         <w:trPr>
@@ -4201,16 +4238,16 @@
               <w:rPr>
                 <w:b/>
                 <w:bCs/>
-                <w:sz w:val="21"/>
-                <w:szCs w:val="21"/>
+                <w:sz w:val="20"/>
+                <w:szCs w:val="20"/>
               </w:rPr>
             </w:pPr>
             <w:r>
               <w:rPr>
                 <w:b/>
                 <w:bCs/>
-                <w:sz w:val="21"/>
-                <w:szCs w:val="21"/>
+                <w:sz w:val="20"/>
+                <w:szCs w:val="20"/>
               </w:rPr>
               <w:lastRenderedPageBreak/>
               <w:t>Circuito / Ambiente</w:t>
@@ -4232,16 +4269,16 @@
               <w:rPr>
                 <w:b/>
                 <w:bCs/>
-                <w:sz w:val="21"/>
-                <w:szCs w:val="21"/>
+                <w:sz w:val="20"/>
+                <w:szCs w:val="20"/>
               </w:rPr>
             </w:pPr>
             <w:r>
               <w:rPr>
                 <w:b/>
                 <w:bCs/>
-                <w:sz w:val="21"/>
-                <w:szCs w:val="21"/>
+                <w:sz w:val="20"/>
+                <w:szCs w:val="20"/>
               </w:rPr>
               <w:t>Equipamento</w:t>
             </w:r>
@@ -4262,16 +4299,16 @@
               <w:rPr>
                 <w:b/>
                 <w:bCs/>
-                <w:sz w:val="21"/>
-                <w:szCs w:val="21"/>
+                <w:sz w:val="20"/>
+                <w:szCs w:val="20"/>
               </w:rPr>
             </w:pPr>
             <w:r>
               <w:rPr>
                 <w:b/>
                 <w:bCs/>
-                <w:sz w:val="21"/>
-                <w:szCs w:val="21"/>
+                <w:sz w:val="20"/>
+                <w:szCs w:val="20"/>
               </w:rPr>
               <w:t>Disjuntor (Bipolar)</w:t>
             </w:r>
@@ -4292,16 +4329,16 @@
               <w:rPr>
                 <w:b/>
                 <w:bCs/>
-                <w:sz w:val="21"/>
-                <w:szCs w:val="21"/>
+                <w:sz w:val="20"/>
+                <w:szCs w:val="20"/>
               </w:rPr>
             </w:pPr>
             <w:r>
               <w:rPr>
                 <w:b/>
                 <w:bCs/>
-                <w:sz w:val="21"/>
-                <w:szCs w:val="21"/>
+                <w:sz w:val="20"/>
+                <w:szCs w:val="20"/>
               </w:rPr>
               <w:t>Cabo (Bitola Mínima)</w:t>
             </w:r>
@@ -4325,15 +4362,15 @@
             <w:pPr>
               <w:jc w:val="center"/>
               <w:rPr>
-                <w:sz w:val="21"/>
-                <w:szCs w:val="21"/>
+                <w:sz w:val="20"/>
+                <w:szCs w:val="20"/>
               </w:rPr>
             </w:pPr>
             <w:r>
               <w:rPr>
                 <w:rStyle w:val="Forte"/>
-                <w:sz w:val="21"/>
-                <w:szCs w:val="21"/>
+                <w:sz w:val="20"/>
+                <w:szCs w:val="20"/>
               </w:rPr>
               <w:t>Geral Apartamento</w:t>
             </w:r>
@@ -4352,14 +4389,14 @@
             <w:pPr>
               <w:jc w:val="center"/>
               <w:rPr>
-                <w:sz w:val="21"/>
-                <w:szCs w:val="21"/>
+                <w:sz w:val="20"/>
+                <w:szCs w:val="20"/>
               </w:rPr>
             </w:pPr>
             <w:r>
               <w:rPr>
-                <w:sz w:val="21"/>
-                <w:szCs w:val="21"/>
+                <w:sz w:val="20"/>
+                <w:szCs w:val="20"/>
               </w:rPr>
               <w:t>Entrada Principal</w:t>
             </w:r>
@@ -4379,16 +4416,16 @@
               <w:jc w:val="center"/>
               <w:rPr>
                 <w:b/>
-                <w:sz w:val="21"/>
-                <w:szCs w:val="21"/>
+                <w:sz w:val="20"/>
+                <w:szCs w:val="20"/>
               </w:rPr>
             </w:pPr>
             <w:r>
               <w:rPr>
                 <w:rStyle w:val="Forte"/>
                 <w:b w:val="0"/>
-                <w:sz w:val="21"/>
-                <w:szCs w:val="21"/>
+                <w:sz w:val="20"/>
+                <w:szCs w:val="20"/>
               </w:rPr>
               <w:t>63A</w:t>
             </w:r>
@@ -4408,16 +4445,16 @@
               <w:jc w:val="center"/>
               <w:rPr>
                 <w:b/>
-                <w:sz w:val="21"/>
-                <w:szCs w:val="21"/>
+                <w:sz w:val="20"/>
+                <w:szCs w:val="20"/>
               </w:rPr>
             </w:pPr>
             <w:r>
               <w:rPr>
                 <w:rStyle w:val="Forte"/>
                 <w:b w:val="0"/>
-                <w:sz w:val="21"/>
-                <w:szCs w:val="21"/>
+                <w:sz w:val="20"/>
+                <w:szCs w:val="20"/>
               </w:rPr>
               <w:t>16 mm²</w:t>
             </w:r>
@@ -4441,15 +4478,15 @@
             <w:pPr>
               <w:jc w:val="center"/>
               <w:rPr>
-                <w:sz w:val="21"/>
-                <w:szCs w:val="21"/>
+                <w:sz w:val="20"/>
+                <w:szCs w:val="20"/>
               </w:rPr>
             </w:pPr>
             <w:r>
               <w:rPr>
                 <w:rStyle w:val="Forte"/>
-                <w:sz w:val="21"/>
-                <w:szCs w:val="21"/>
+                <w:sz w:val="20"/>
+                <w:szCs w:val="20"/>
               </w:rPr>
               <w:t>Banheiro Suíte</w:t>
             </w:r>
@@ -4468,14 +4505,14 @@
             <w:pPr>
               <w:jc w:val="center"/>
               <w:rPr>
-                <w:sz w:val="21"/>
-                <w:szCs w:val="21"/>
+                <w:sz w:val="20"/>
+                <w:szCs w:val="20"/>
               </w:rPr>
             </w:pPr>
             <w:r>
               <w:rPr>
-                <w:sz w:val="21"/>
-                <w:szCs w:val="21"/>
+                <w:sz w:val="20"/>
+                <w:szCs w:val="20"/>
               </w:rPr>
               <w:t>Chuveiro (5800W)</w:t>
             </w:r>
@@ -4494,14 +4531,14 @@
             <w:pPr>
               <w:jc w:val="center"/>
               <w:rPr>
-                <w:sz w:val="21"/>
-                <w:szCs w:val="21"/>
+                <w:sz w:val="20"/>
+                <w:szCs w:val="20"/>
               </w:rPr>
             </w:pPr>
             <w:r>
               <w:rPr>
-                <w:sz w:val="21"/>
-                <w:szCs w:val="21"/>
+                <w:sz w:val="20"/>
+                <w:szCs w:val="20"/>
               </w:rPr>
               <w:t>32A</w:t>
             </w:r>
@@ -4520,14 +4557,14 @@
             <w:pPr>
               <w:jc w:val="center"/>
               <w:rPr>
-                <w:sz w:val="21"/>
-                <w:szCs w:val="21"/>
+                <w:sz w:val="20"/>
+                <w:szCs w:val="20"/>
               </w:rPr>
             </w:pPr>
             <w:r>
               <w:rPr>
-                <w:sz w:val="21"/>
-                <w:szCs w:val="21"/>
+                <w:sz w:val="20"/>
+                <w:szCs w:val="20"/>
               </w:rPr>
               <w:t>4 mm²</w:t>
             </w:r>
@@ -4551,15 +4588,15 @@
             <w:pPr>
               <w:jc w:val="center"/>
               <w:rPr>
-                <w:sz w:val="21"/>
-                <w:szCs w:val="21"/>
+                <w:sz w:val="20"/>
+                <w:szCs w:val="20"/>
               </w:rPr>
             </w:pPr>
             <w:r>
               <w:rPr>
                 <w:rStyle w:val="Forte"/>
-                <w:sz w:val="21"/>
-                <w:szCs w:val="21"/>
+                <w:sz w:val="20"/>
+                <w:szCs w:val="20"/>
               </w:rPr>
               <w:t>Banheiro Social</w:t>
             </w:r>
@@ -4578,14 +4615,14 @@
             <w:pPr>
               <w:jc w:val="center"/>
               <w:rPr>
-                <w:sz w:val="21"/>
-                <w:szCs w:val="21"/>
+                <w:sz w:val="20"/>
+                <w:szCs w:val="20"/>
               </w:rPr>
             </w:pPr>
             <w:r>
               <w:rPr>
-                <w:sz w:val="21"/>
-                <w:szCs w:val="21"/>
+                <w:sz w:val="20"/>
+                <w:szCs w:val="20"/>
               </w:rPr>
               <w:t>Chuveiro (5800W)</w:t>
             </w:r>
@@ -4604,14 +4641,14 @@
             <w:pPr>
               <w:jc w:val="center"/>
               <w:rPr>
-                <w:sz w:val="21"/>
-                <w:szCs w:val="21"/>
+                <w:sz w:val="20"/>
+                <w:szCs w:val="20"/>
               </w:rPr>
             </w:pPr>
             <w:r>
               <w:rPr>
-                <w:sz w:val="21"/>
-                <w:szCs w:val="21"/>
+                <w:sz w:val="20"/>
+                <w:szCs w:val="20"/>
               </w:rPr>
               <w:t>32A</w:t>
             </w:r>
@@ -4630,14 +4667,14 @@
             <w:pPr>
               <w:jc w:val="center"/>
               <w:rPr>
-                <w:sz w:val="21"/>
-                <w:szCs w:val="21"/>
+                <w:sz w:val="20"/>
+                <w:szCs w:val="20"/>
               </w:rPr>
             </w:pPr>
             <w:r>
               <w:rPr>
-                <w:sz w:val="21"/>
-                <w:szCs w:val="21"/>
+                <w:sz w:val="20"/>
+                <w:szCs w:val="20"/>
               </w:rPr>
               <w:t>4 mm²</w:t>
             </w:r>
@@ -4661,15 +4698,15 @@
             <w:pPr>
               <w:jc w:val="center"/>
               <w:rPr>
-                <w:sz w:val="21"/>
-                <w:szCs w:val="21"/>
+                <w:sz w:val="20"/>
+                <w:szCs w:val="20"/>
               </w:rPr>
             </w:pPr>
             <w:r>
               <w:rPr>
                 <w:rStyle w:val="Forte"/>
-                <w:sz w:val="21"/>
-                <w:szCs w:val="21"/>
+                <w:sz w:val="20"/>
+                <w:szCs w:val="20"/>
               </w:rPr>
               <w:t>Sala de Estar</w:t>
             </w:r>
@@ -4688,30 +4725,30 @@
             <w:pPr>
               <w:jc w:val="center"/>
               <w:rPr>
-                <w:sz w:val="21"/>
-                <w:szCs w:val="21"/>
+                <w:sz w:val="20"/>
+                <w:szCs w:val="20"/>
               </w:rPr>
             </w:pPr>
             <w:r>
               <w:rPr>
-                <w:sz w:val="21"/>
-                <w:szCs w:val="21"/>
+                <w:sz w:val="20"/>
+                <w:szCs w:val="20"/>
               </w:rPr>
               <w:t xml:space="preserve">Ar Cond. (30.000 </w:t>
             </w:r>
             <w:proofErr w:type="spellStart"/>
             <w:r>
               <w:rPr>
-                <w:sz w:val="21"/>
-                <w:szCs w:val="21"/>
+                <w:sz w:val="20"/>
+                <w:szCs w:val="20"/>
               </w:rPr>
               <w:t>BTUs</w:t>
             </w:r>
             <w:proofErr w:type="spellEnd"/>
             <w:r>
               <w:rPr>
-                <w:sz w:val="21"/>
-                <w:szCs w:val="21"/>
+                <w:sz w:val="20"/>
+                <w:szCs w:val="20"/>
               </w:rPr>
               <w:t>)</w:t>
             </w:r>
@@ -4731,16 +4768,16 @@
               <w:jc w:val="center"/>
               <w:rPr>
                 <w:b/>
-                <w:sz w:val="21"/>
-                <w:szCs w:val="21"/>
+                <w:sz w:val="20"/>
+                <w:szCs w:val="20"/>
               </w:rPr>
             </w:pPr>
             <w:r>
               <w:rPr>
                 <w:rStyle w:val="Forte"/>
                 <w:b w:val="0"/>
-                <w:sz w:val="21"/>
-                <w:szCs w:val="21"/>
+                <w:sz w:val="20"/>
+                <w:szCs w:val="20"/>
               </w:rPr>
               <w:t>25A</w:t>
             </w:r>
@@ -4760,16 +4797,16 @@
               <w:jc w:val="center"/>
               <w:rPr>
                 <w:b/>
-                <w:sz w:val="21"/>
-                <w:szCs w:val="21"/>
+                <w:sz w:val="20"/>
+                <w:szCs w:val="20"/>
               </w:rPr>
             </w:pPr>
             <w:r>
               <w:rPr>
                 <w:rStyle w:val="Forte"/>
                 <w:b w:val="0"/>
-                <w:sz w:val="21"/>
-                <w:szCs w:val="21"/>
+                <w:sz w:val="20"/>
+                <w:szCs w:val="20"/>
               </w:rPr>
               <w:t>6 mm²</w:t>
             </w:r>
@@ -4793,15 +4830,15 @@
             <w:pPr>
               <w:jc w:val="center"/>
               <w:rPr>
-                <w:sz w:val="21"/>
-                <w:szCs w:val="21"/>
+                <w:sz w:val="20"/>
+                <w:szCs w:val="20"/>
               </w:rPr>
             </w:pPr>
             <w:r>
               <w:rPr>
                 <w:rStyle w:val="Forte"/>
-                <w:sz w:val="21"/>
-                <w:szCs w:val="21"/>
+                <w:sz w:val="20"/>
+                <w:szCs w:val="20"/>
               </w:rPr>
               <w:t>Cozinha (Pesado)</w:t>
             </w:r>
@@ -4820,14 +4857,14 @@
             <w:pPr>
               <w:jc w:val="center"/>
               <w:rPr>
-                <w:sz w:val="21"/>
-                <w:szCs w:val="21"/>
+                <w:sz w:val="20"/>
+                <w:szCs w:val="20"/>
               </w:rPr>
             </w:pPr>
             <w:r>
               <w:rPr>
-                <w:sz w:val="21"/>
-                <w:szCs w:val="21"/>
+                <w:sz w:val="20"/>
+                <w:szCs w:val="20"/>
               </w:rPr>
               <w:t>Forno Elétrico / Lava-louça</w:t>
             </w:r>
@@ -4846,14 +4883,14 @@
             <w:pPr>
               <w:jc w:val="center"/>
               <w:rPr>
-                <w:sz w:val="21"/>
-                <w:szCs w:val="21"/>
+                <w:sz w:val="20"/>
+                <w:szCs w:val="20"/>
               </w:rPr>
             </w:pPr>
             <w:r>
               <w:rPr>
-                <w:sz w:val="21"/>
-                <w:szCs w:val="21"/>
+                <w:sz w:val="20"/>
+                <w:szCs w:val="20"/>
               </w:rPr>
               <w:t>25A</w:t>
             </w:r>
@@ -4872,14 +4909,14 @@
             <w:pPr>
               <w:jc w:val="center"/>
               <w:rPr>
-                <w:sz w:val="21"/>
-                <w:szCs w:val="21"/>
+                <w:sz w:val="20"/>
+                <w:szCs w:val="20"/>
               </w:rPr>
             </w:pPr>
             <w:r>
               <w:rPr>
-                <w:sz w:val="21"/>
-                <w:szCs w:val="21"/>
+                <w:sz w:val="20"/>
+                <w:szCs w:val="20"/>
               </w:rPr>
               <w:t>4 mm²</w:t>
             </w:r>
@@ -4903,15 +4940,15 @@
             <w:pPr>
               <w:jc w:val="center"/>
               <w:rPr>
-                <w:sz w:val="21"/>
-                <w:szCs w:val="21"/>
+                <w:sz w:val="20"/>
+                <w:szCs w:val="20"/>
               </w:rPr>
             </w:pPr>
             <w:r>
               <w:rPr>
                 <w:rStyle w:val="Forte"/>
-                <w:sz w:val="21"/>
-                <w:szCs w:val="21"/>
+                <w:sz w:val="20"/>
+                <w:szCs w:val="20"/>
               </w:rPr>
               <w:t>Cozinha (Tomadas)</w:t>
             </w:r>
@@ -4930,30 +4967,30 @@
             <w:pPr>
               <w:jc w:val="center"/>
               <w:rPr>
-                <w:sz w:val="21"/>
-                <w:szCs w:val="21"/>
+                <w:sz w:val="20"/>
+                <w:szCs w:val="20"/>
               </w:rPr>
             </w:pPr>
             <w:r>
               <w:rPr>
-                <w:sz w:val="21"/>
-                <w:szCs w:val="21"/>
+                <w:sz w:val="20"/>
+                <w:szCs w:val="20"/>
               </w:rPr>
               <w:t xml:space="preserve">Air </w:t>
             </w:r>
             <w:proofErr w:type="spellStart"/>
             <w:r>
               <w:rPr>
-                <w:sz w:val="21"/>
-                <w:szCs w:val="21"/>
+                <w:sz w:val="20"/>
+                <w:szCs w:val="20"/>
               </w:rPr>
               <w:t>Fryer</w:t>
             </w:r>
             <w:proofErr w:type="spellEnd"/>
             <w:r>
               <w:rPr>
-                <w:sz w:val="21"/>
-                <w:szCs w:val="21"/>
+                <w:sz w:val="20"/>
+                <w:szCs w:val="20"/>
               </w:rPr>
               <w:t xml:space="preserve"> / Micro-ondas</w:t>
             </w:r>
@@ -4972,14 +5009,14 @@
             <w:pPr>
               <w:jc w:val="center"/>
               <w:rPr>
-                <w:sz w:val="21"/>
-                <w:szCs w:val="21"/>
+                <w:sz w:val="20"/>
+                <w:szCs w:val="20"/>
               </w:rPr>
             </w:pPr>
             <w:r>
               <w:rPr>
-                <w:sz w:val="21"/>
-                <w:szCs w:val="21"/>
+                <w:sz w:val="20"/>
+                <w:szCs w:val="20"/>
               </w:rPr>
               <w:t>20A</w:t>
             </w:r>
@@ -4998,14 +5035,14 @@
             <w:pPr>
               <w:jc w:val="center"/>
               <w:rPr>
-                <w:sz w:val="21"/>
-                <w:szCs w:val="21"/>
+                <w:sz w:val="20"/>
+                <w:szCs w:val="20"/>
               </w:rPr>
             </w:pPr>
             <w:r>
               <w:rPr>
-                <w:sz w:val="21"/>
-                <w:szCs w:val="21"/>
+                <w:sz w:val="20"/>
+                <w:szCs w:val="20"/>
               </w:rPr>
               <w:t>2,5 mm²</w:t>
             </w:r>
@@ -5029,15 +5066,15 @@
             <w:pPr>
               <w:jc w:val="center"/>
               <w:rPr>
-                <w:sz w:val="21"/>
-                <w:szCs w:val="21"/>
+                <w:sz w:val="20"/>
+                <w:szCs w:val="20"/>
               </w:rPr>
             </w:pPr>
             <w:r>
               <w:rPr>
                 <w:rStyle w:val="Forte"/>
-                <w:sz w:val="21"/>
-                <w:szCs w:val="21"/>
+                <w:sz w:val="20"/>
+                <w:szCs w:val="20"/>
               </w:rPr>
               <w:t>Área de Serviço</w:t>
             </w:r>
@@ -5056,14 +5093,14 @@
             <w:pPr>
               <w:jc w:val="center"/>
               <w:rPr>
-                <w:sz w:val="21"/>
-                <w:szCs w:val="21"/>
+                <w:sz w:val="20"/>
+                <w:szCs w:val="20"/>
               </w:rPr>
             </w:pPr>
             <w:r>
               <w:rPr>
-                <w:sz w:val="21"/>
-                <w:szCs w:val="21"/>
+                <w:sz w:val="20"/>
+                <w:szCs w:val="20"/>
               </w:rPr>
               <w:t>Lava e Seca Samsung</w:t>
             </w:r>
@@ -5082,14 +5119,14 @@
             <w:pPr>
               <w:jc w:val="center"/>
               <w:rPr>
-                <w:sz w:val="21"/>
-                <w:szCs w:val="21"/>
+                <w:sz w:val="20"/>
+                <w:szCs w:val="20"/>
               </w:rPr>
             </w:pPr>
             <w:r>
               <w:rPr>
-                <w:sz w:val="21"/>
-                <w:szCs w:val="21"/>
+                <w:sz w:val="20"/>
+                <w:szCs w:val="20"/>
               </w:rPr>
               <w:t>20A</w:t>
             </w:r>
@@ -5108,14 +5145,14 @@
             <w:pPr>
               <w:jc w:val="center"/>
               <w:rPr>
-                <w:sz w:val="21"/>
-                <w:szCs w:val="21"/>
+                <w:sz w:val="20"/>
+                <w:szCs w:val="20"/>
               </w:rPr>
             </w:pPr>
             <w:r>
               <w:rPr>
-                <w:sz w:val="21"/>
-                <w:szCs w:val="21"/>
+                <w:sz w:val="20"/>
+                <w:szCs w:val="20"/>
               </w:rPr>
               <w:t>2,5 mm²</w:t>
             </w:r>
@@ -5139,15 +5176,15 @@
             <w:pPr>
               <w:jc w:val="center"/>
               <w:rPr>
-                <w:sz w:val="21"/>
-                <w:szCs w:val="21"/>
+                <w:sz w:val="20"/>
+                <w:szCs w:val="20"/>
               </w:rPr>
             </w:pPr>
             <w:r>
               <w:rPr>
                 <w:rStyle w:val="Forte"/>
-                <w:sz w:val="21"/>
-                <w:szCs w:val="21"/>
+                <w:sz w:val="20"/>
+                <w:szCs w:val="20"/>
               </w:rPr>
               <w:t>Suíte / Escritório</w:t>
             </w:r>
@@ -5166,30 +5203,30 @@
             <w:pPr>
               <w:jc w:val="center"/>
               <w:rPr>
-                <w:sz w:val="21"/>
-                <w:szCs w:val="21"/>
+                <w:sz w:val="20"/>
+                <w:szCs w:val="20"/>
               </w:rPr>
             </w:pPr>
             <w:r>
               <w:rPr>
-                <w:sz w:val="21"/>
-                <w:szCs w:val="21"/>
+                <w:sz w:val="20"/>
+                <w:szCs w:val="20"/>
               </w:rPr>
               <w:t xml:space="preserve">Ar Cond. (12k e 9k </w:t>
             </w:r>
             <w:proofErr w:type="spellStart"/>
             <w:r>
               <w:rPr>
-                <w:sz w:val="21"/>
-                <w:szCs w:val="21"/>
+                <w:sz w:val="20"/>
+                <w:szCs w:val="20"/>
               </w:rPr>
               <w:t>BTUs</w:t>
             </w:r>
             <w:proofErr w:type="spellEnd"/>
             <w:r>
               <w:rPr>
-                <w:sz w:val="21"/>
-                <w:szCs w:val="21"/>
+                <w:sz w:val="20"/>
+                <w:szCs w:val="20"/>
               </w:rPr>
               <w:t>)</w:t>
             </w:r>
@@ -5208,14 +5245,14 @@
             <w:pPr>
               <w:jc w:val="center"/>
               <w:rPr>
-                <w:sz w:val="21"/>
-                <w:szCs w:val="21"/>
+                <w:sz w:val="20"/>
+                <w:szCs w:val="20"/>
               </w:rPr>
             </w:pPr>
             <w:r>
               <w:rPr>
-                <w:sz w:val="21"/>
-                <w:szCs w:val="21"/>
+                <w:sz w:val="20"/>
+                <w:szCs w:val="20"/>
               </w:rPr>
               <w:t>15A ou 20A</w:t>
             </w:r>
@@ -5234,14 +5271,14 @@
             <w:pPr>
               <w:jc w:val="center"/>
               <w:rPr>
-                <w:sz w:val="21"/>
-                <w:szCs w:val="21"/>
+                <w:sz w:val="20"/>
+                <w:szCs w:val="20"/>
               </w:rPr>
             </w:pPr>
             <w:r>
               <w:rPr>
-                <w:sz w:val="21"/>
-                <w:szCs w:val="21"/>
+                <w:sz w:val="20"/>
+                <w:szCs w:val="20"/>
               </w:rPr>
               <w:t>2,5 mm²</w:t>
             </w:r>
@@ -5265,15 +5302,15 @@
             <w:pPr>
               <w:jc w:val="center"/>
               <w:rPr>
-                <w:sz w:val="21"/>
-                <w:szCs w:val="21"/>
+                <w:sz w:val="20"/>
+                <w:szCs w:val="20"/>
               </w:rPr>
             </w:pPr>
             <w:r>
               <w:rPr>
                 <w:rStyle w:val="Forte"/>
-                <w:sz w:val="21"/>
-                <w:szCs w:val="21"/>
+                <w:sz w:val="20"/>
+                <w:szCs w:val="20"/>
               </w:rPr>
               <w:t>Geral Tomadas</w:t>
             </w:r>
@@ -5292,14 +5329,14 @@
             <w:pPr>
               <w:jc w:val="center"/>
               <w:rPr>
-                <w:sz w:val="21"/>
-                <w:szCs w:val="21"/>
+                <w:sz w:val="20"/>
+                <w:szCs w:val="20"/>
               </w:rPr>
             </w:pPr>
             <w:r>
               <w:rPr>
-                <w:sz w:val="21"/>
-                <w:szCs w:val="21"/>
+                <w:sz w:val="20"/>
+                <w:szCs w:val="20"/>
               </w:rPr>
               <w:t>Quartos / Salas</w:t>
             </w:r>
@@ -5318,14 +5355,14 @@
             <w:pPr>
               <w:jc w:val="center"/>
               <w:rPr>
-                <w:sz w:val="21"/>
-                <w:szCs w:val="21"/>
+                <w:sz w:val="20"/>
+                <w:szCs w:val="20"/>
               </w:rPr>
             </w:pPr>
             <w:r>
               <w:rPr>
-                <w:sz w:val="21"/>
-                <w:szCs w:val="21"/>
+                <w:sz w:val="20"/>
+                <w:szCs w:val="20"/>
               </w:rPr>
               <w:t>20A</w:t>
             </w:r>
@@ -5344,14 +5381,14 @@
             <w:pPr>
               <w:jc w:val="center"/>
               <w:rPr>
-                <w:sz w:val="21"/>
-                <w:szCs w:val="21"/>
+                <w:sz w:val="20"/>
+                <w:szCs w:val="20"/>
               </w:rPr>
             </w:pPr>
             <w:r>
               <w:rPr>
-                <w:sz w:val="21"/>
-                <w:szCs w:val="21"/>
+                <w:sz w:val="20"/>
+                <w:szCs w:val="20"/>
               </w:rPr>
               <w:t>2,5 mm²</w:t>
             </w:r>
@@ -5365,9 +5402,6 @@
         <w:tc>
           <w:tcPr>
             <w:tcW w:w="0" w:type="auto"/>
-            <w:tcBorders>
-              <w:bottom w:val="nil"/>
-            </w:tcBorders>
             <w:vAlign w:val="center"/>
             <w:hideMark/>
           </w:tcPr>
@@ -5375,15 +5409,15 @@
             <w:pPr>
               <w:jc w:val="center"/>
               <w:rPr>
-                <w:sz w:val="21"/>
-                <w:szCs w:val="21"/>
+                <w:sz w:val="20"/>
+                <w:szCs w:val="20"/>
               </w:rPr>
             </w:pPr>
             <w:r>
               <w:rPr>
                 <w:rStyle w:val="Forte"/>
-                <w:sz w:val="21"/>
-                <w:szCs w:val="21"/>
+                <w:sz w:val="20"/>
+                <w:szCs w:val="20"/>
               </w:rPr>
               <w:t>Iluminação</w:t>
             </w:r>
@@ -5392,9 +5426,6 @@
         <w:tc>
           <w:tcPr>
             <w:tcW w:w="0" w:type="auto"/>
-            <w:tcBorders>
-              <w:bottom w:val="nil"/>
-            </w:tcBorders>
             <w:vAlign w:val="center"/>
             <w:hideMark/>
           </w:tcPr>
@@ -5402,14 +5433,14 @@
             <w:pPr>
               <w:jc w:val="center"/>
               <w:rPr>
-                <w:sz w:val="21"/>
-                <w:szCs w:val="21"/>
+                <w:sz w:val="20"/>
+                <w:szCs w:val="20"/>
               </w:rPr>
             </w:pPr>
             <w:r>
               <w:rPr>
-                <w:sz w:val="21"/>
-                <w:szCs w:val="21"/>
+                <w:sz w:val="20"/>
+                <w:szCs w:val="20"/>
               </w:rPr>
               <w:t>Todos os ambientes</w:t>
             </w:r>
@@ -5418,9 +5449,6 @@
         <w:tc>
           <w:tcPr>
             <w:tcW w:w="0" w:type="auto"/>
-            <w:tcBorders>
-              <w:bottom w:val="nil"/>
-            </w:tcBorders>
             <w:vAlign w:val="center"/>
             <w:hideMark/>
           </w:tcPr>
@@ -5428,14 +5456,14 @@
             <w:pPr>
               <w:jc w:val="center"/>
               <w:rPr>
-                <w:sz w:val="21"/>
-                <w:szCs w:val="21"/>
+                <w:sz w:val="20"/>
+                <w:szCs w:val="20"/>
               </w:rPr>
             </w:pPr>
             <w:r>
               <w:rPr>
-                <w:sz w:val="21"/>
-                <w:szCs w:val="21"/>
+                <w:sz w:val="20"/>
+                <w:szCs w:val="20"/>
               </w:rPr>
               <w:t>10A</w:t>
             </w:r>
@@ -5444,9 +5472,6 @@
         <w:tc>
           <w:tcPr>
             <w:tcW w:w="0" w:type="auto"/>
-            <w:tcBorders>
-              <w:bottom w:val="nil"/>
-            </w:tcBorders>
             <w:vAlign w:val="center"/>
             <w:hideMark/>
           </w:tcPr>
@@ -5454,14 +5479,14 @@
             <w:pPr>
               <w:jc w:val="center"/>
               <w:rPr>
-                <w:sz w:val="21"/>
-                <w:szCs w:val="21"/>
+                <w:sz w:val="20"/>
+                <w:szCs w:val="20"/>
               </w:rPr>
             </w:pPr>
             <w:r>
               <w:rPr>
-                <w:sz w:val="21"/>
-                <w:szCs w:val="21"/>
+                <w:sz w:val="20"/>
+                <w:szCs w:val="20"/>
               </w:rPr>
               <w:t>1,5 mm²</w:t>
             </w:r>
@@ -5473,11 +5498,10 @@
       <w:pPr>
         <w:jc w:val="both"/>
         <w:rPr>
-          <w:rFonts w:ascii="Segoe UI Symbol" w:hAnsi="Segoe UI Symbol" w:cs="Segoe UI Symbol"/>
           <w:b/>
           <w:bCs/>
-          <w:sz w:val="30"/>
-          <w:szCs w:val="30"/>
+          <w:sz w:val="20"/>
+          <w:szCs w:val="20"/>
         </w:rPr>
       </w:pPr>
     </w:p>
@@ -5746,11 +5770,7 @@
     </w:p>
     <w:p>
       <w:pPr>
-        <w:jc w:val="both"/>
-      </w:pPr>
-    </w:p>
-    <w:p>
-      <w:pPr>
+        <w:spacing w:before="240"/>
         <w:jc w:val="both"/>
         <w:rPr>
           <w:b/>
@@ -5772,7 +5792,12 @@
         <w:jc w:val="both"/>
       </w:pPr>
       <w:r>
-        <w:t xml:space="preserve">Fizemos um exemplo de dimensionamento fora dos cálculos do </w:t>
+        <w:t>Fizemos um exemplo de dimensionamento fora dos cálculos d</w:t>
+      </w:r>
+      <w:bookmarkStart w:id="0" w:name="_GoBack"/>
+      <w:bookmarkEnd w:id="0"/>
+      <w:r>
+        <w:t xml:space="preserve">o </w:t>
       </w:r>
       <w:proofErr w:type="spellStart"/>
       <w:r>
@@ -5806,16 +5831,7 @@
           <w:i/>
           <w:iCs/>
         </w:rPr>
-        <w:t xml:space="preserve">"Pelas regras da CPFL, com essa potência prevista, somos obrigados a pedir um padrão trifásico para </w:t>
-      </w:r>
-      <w:r>
-        <w:rPr>
-          <w:b/>
-          <w:i/>
-          <w:iCs/>
-        </w:rPr>
-        <w:lastRenderedPageBreak/>
-        <w:t>aprovar o projeto"</w:t>
+        <w:t>"Pelas regras da CPFL, com essa potência prevista, somos obrigados a pedir um padrão trifásico para aprovar o projeto"</w:t>
       </w:r>
       <w:r>
         <w:t>. Ambos estão certos em seus contextos, mas para um projeto real a ser aprovado, a lógica do aplicativo é a mandatória.</w:t>

</xml_diff>